<commit_message>
Add polished fillable commercial sales PDFs
</commit_message>
<xml_diff>
--- a/Docs/Commercial Sales Templates/Commercial Machine Sale Agreement.docx
+++ b/Docs/Commercial Sales Templates/Commercial Machine Sale Agreement.docx
@@ -147,7 +147,7 @@
         <w:rPr>
           <w:i w:val="0"/>
         </w:rPr>
-        <w:t>This Commercial Machine Sale Agreement (the “Agreement”) is entered into as of the Effective Date in the Order Form by TGPACI LLC, doing business as Bloomjoy Sweets (“Bloomjoy”), and the buyer identified in the Order Form (“Buyer”). The Order Form, these Standard Terms, and all attached exhibits are one agreement. If they conflict, the Order Form controls for that transaction, followed by the exhibits and then the Standard Terms.</w:t>
+        <w:t>This Commercial Machine Sale Agreement (the “Agreement”) is entered into as of the Effective Date in the Order Form by TGPACI LLC dba Bloomjoy Sweets (“Bloomjoy”), and the buyer identified in the Order Form (“Buyer”). The Order Form, these Standard Terms, and all attached exhibits are one agreement. If they conflict, the Order Form controls for that transaction, followed by the exhibits and then the Standard Terms.</w:t>
       </w:r>
     </w:p>
     <w:p>
@@ -160,7 +160,7 @@
           <w:i w:val="0"/>
           <w:color w:val="F672A2"/>
         </w:rPr>
-        <w:t>Complete every bracketed field before signature. Delete any option that does not apply.</w:t>
+        <w:t>Complete every applicable unfilled field before signature. Delete any option that does not apply.</w:t>
       </w:r>
     </w:p>
     <w:p>
@@ -481,7 +481,7 @@
                 <w:color w:val="202020"/>
                 <w:sz w:val="18"/>
               </w:rPr>
-              <w:t>[Insert street address, city, state, ZIP]</w:t>
+              <w:t>266 Thompson Ave, Mountain View, CA 94043</w:t>
             </w:r>
           </w:p>
         </w:tc>
@@ -557,7 +557,7 @@
                 <w:color w:val="202020"/>
                 <w:sz w:val="18"/>
               </w:rPr>
-              <w:t>[Insert legal notice email]</w:t>
+              <w:t>legal@bloomjoysweets.com</w:t>
             </w:r>
           </w:p>
         </w:tc>
@@ -2431,7 +2431,7 @@
                 <w:color w:val="202020"/>
                 <w:sz w:val="18"/>
               </w:rPr>
-              <w:t>50% of Total Purchase Price: $[ ]</w:t>
+              <w:t>50%: $[Amount]</w:t>
             </w:r>
           </w:p>
         </w:tc>
@@ -2541,7 +2541,7 @@
                 <w:color w:val="202020"/>
                 <w:sz w:val="18"/>
               </w:rPr>
-              <w:t>Remaining 50%, plus approved adjustments: $[ ]</w:t>
+              <w:t>50% plus approved adjustments: $[Amount]</w:t>
             </w:r>
           </w:p>
         </w:tc>

</xml_diff>

<commit_message>
Polish branded commercial agreement templates and fillable PDFs
</commit_message>
<xml_diff>
--- a/Docs/Commercial Sales Templates/Commercial Machine Sale Agreement.docx
+++ b/Docs/Commercial Sales Templates/Commercial Machine Sale Agreement.docx
@@ -111,28 +111,29 @@
     </w:p>
     <w:p>
       <w:pPr>
+        <w:pStyle w:val="Title"/>
         <w:keepNext/>
-        <w:spacing w:after="60"/>
-        <w:jc w:val="center"/>
+        <w:spacing w:after="140"/>
+        <w:jc w:val="left"/>
       </w:pPr>
       <w:r>
         <w:rPr>
           <w:rFonts w:ascii="Arial" w:hAnsi="Arial"/>
           <w:b/>
           <w:color w:val="202020"/>
-          <w:sz w:val="34"/>
+          <w:sz w:val="44"/>
         </w:rPr>
-        <w:t>COMMERCIAL MACHINE SALE AGREEMENT</w:t>
+        <w:t>Commercial Machine Sale Agreement</w:t>
       </w:r>
     </w:p>
     <w:p>
       <w:pPr>
-        <w:spacing w:after="180"/>
-        <w:jc w:val="center"/>
+        <w:spacing w:after="280"/>
+        <w:jc w:val="left"/>
       </w:pPr>
       <w:r>
         <w:rPr>
-          <w:i/>
+          <w:i w:val="0"/>
           <w:color w:val="666666"/>
           <w:sz w:val="19"/>
         </w:rPr>
@@ -179,8 +180,8 @@
         <w:tblLook w:firstColumn="1" w:firstRow="1" w:lastColumn="0" w:lastRow="0" w:noHBand="0" w:noVBand="1" w:val="04A0"/>
       </w:tblPr>
       <w:tblGrid>
-        <w:gridCol w:w="5083"/>
-        <w:gridCol w:w="5083"/>
+        <w:gridCol w:w="2880"/>
+        <w:gridCol w:w="6912"/>
       </w:tblGrid>
       <w:tr>
         <w:trPr>
@@ -200,10 +201,10 @@
               <w:insideV w:val="single" w:sz="6" w:space="0" w:color="E4E4E4"/>
             </w:tcBorders>
             <w:tcMar>
-              <w:top w:w="45" w:type="dxa"/>
-              <w:start w:w="95" w:type="dxa"/>
-              <w:bottom w:w="45" w:type="dxa"/>
-              <w:end w:w="95" w:type="dxa"/>
+              <w:top w:w="85" w:type="dxa"/>
+              <w:start w:w="120" w:type="dxa"/>
+              <w:bottom w:w="85" w:type="dxa"/>
+              <w:end w:w="120" w:type="dxa"/>
             </w:tcMar>
           </w:tcPr>
           <w:p>
@@ -235,10 +236,10 @@
               <w:insideV w:val="single" w:sz="6" w:space="0" w:color="E4E4E4"/>
             </w:tcBorders>
             <w:tcMar>
-              <w:top w:w="45" w:type="dxa"/>
-              <w:start w:w="95" w:type="dxa"/>
-              <w:bottom w:w="45" w:type="dxa"/>
-              <w:end w:w="95" w:type="dxa"/>
+              <w:top w:w="85" w:type="dxa"/>
+              <w:start w:w="120" w:type="dxa"/>
+              <w:bottom w:w="85" w:type="dxa"/>
+              <w:end w:w="120" w:type="dxa"/>
             </w:tcMar>
           </w:tcPr>
           <w:p>
@@ -276,10 +277,10 @@
               <w:insideV w:val="single" w:sz="6" w:space="0" w:color="E4E4E4"/>
             </w:tcBorders>
             <w:tcMar>
-              <w:top w:w="45" w:type="dxa"/>
-              <w:start w:w="95" w:type="dxa"/>
-              <w:bottom w:w="45" w:type="dxa"/>
-              <w:end w:w="95" w:type="dxa"/>
+              <w:top w:w="85" w:type="dxa"/>
+              <w:start w:w="120" w:type="dxa"/>
+              <w:bottom w:w="85" w:type="dxa"/>
+              <w:end w:w="120" w:type="dxa"/>
             </w:tcMar>
           </w:tcPr>
           <w:p>
@@ -311,10 +312,10 @@
               <w:insideV w:val="single" w:sz="6" w:space="0" w:color="E4E4E4"/>
             </w:tcBorders>
             <w:tcMar>
-              <w:top w:w="45" w:type="dxa"/>
-              <w:start w:w="95" w:type="dxa"/>
-              <w:bottom w:w="45" w:type="dxa"/>
-              <w:end w:w="95" w:type="dxa"/>
+              <w:top w:w="85" w:type="dxa"/>
+              <w:start w:w="120" w:type="dxa"/>
+              <w:bottom w:w="85" w:type="dxa"/>
+              <w:end w:w="120" w:type="dxa"/>
             </w:tcMar>
           </w:tcPr>
           <w:p>
@@ -352,10 +353,10 @@
               <w:insideV w:val="single" w:sz="6" w:space="0" w:color="E4E4E4"/>
             </w:tcBorders>
             <w:tcMar>
-              <w:top w:w="45" w:type="dxa"/>
-              <w:start w:w="95" w:type="dxa"/>
-              <w:bottom w:w="45" w:type="dxa"/>
-              <w:end w:w="95" w:type="dxa"/>
+              <w:top w:w="85" w:type="dxa"/>
+              <w:start w:w="120" w:type="dxa"/>
+              <w:bottom w:w="85" w:type="dxa"/>
+              <w:end w:w="120" w:type="dxa"/>
             </w:tcMar>
           </w:tcPr>
           <w:p>
@@ -387,10 +388,10 @@
               <w:insideV w:val="single" w:sz="6" w:space="0" w:color="E4E4E4"/>
             </w:tcBorders>
             <w:tcMar>
-              <w:top w:w="45" w:type="dxa"/>
-              <w:start w:w="95" w:type="dxa"/>
-              <w:bottom w:w="45" w:type="dxa"/>
-              <w:end w:w="95" w:type="dxa"/>
+              <w:top w:w="85" w:type="dxa"/>
+              <w:start w:w="120" w:type="dxa"/>
+              <w:bottom w:w="85" w:type="dxa"/>
+              <w:end w:w="120" w:type="dxa"/>
             </w:tcMar>
           </w:tcPr>
           <w:p>
@@ -428,10 +429,10 @@
               <w:insideV w:val="single" w:sz="6" w:space="0" w:color="E4E4E4"/>
             </w:tcBorders>
             <w:tcMar>
-              <w:top w:w="45" w:type="dxa"/>
-              <w:start w:w="95" w:type="dxa"/>
-              <w:bottom w:w="45" w:type="dxa"/>
-              <w:end w:w="95" w:type="dxa"/>
+              <w:top w:w="85" w:type="dxa"/>
+              <w:start w:w="120" w:type="dxa"/>
+              <w:bottom w:w="85" w:type="dxa"/>
+              <w:end w:w="120" w:type="dxa"/>
             </w:tcMar>
           </w:tcPr>
           <w:p>
@@ -463,10 +464,10 @@
               <w:insideV w:val="single" w:sz="6" w:space="0" w:color="E4E4E4"/>
             </w:tcBorders>
             <w:tcMar>
-              <w:top w:w="45" w:type="dxa"/>
-              <w:start w:w="95" w:type="dxa"/>
-              <w:bottom w:w="45" w:type="dxa"/>
-              <w:end w:w="95" w:type="dxa"/>
+              <w:top w:w="85" w:type="dxa"/>
+              <w:start w:w="120" w:type="dxa"/>
+              <w:bottom w:w="85" w:type="dxa"/>
+              <w:end w:w="120" w:type="dxa"/>
             </w:tcMar>
           </w:tcPr>
           <w:p>
@@ -504,10 +505,10 @@
               <w:insideV w:val="single" w:sz="6" w:space="0" w:color="E4E4E4"/>
             </w:tcBorders>
             <w:tcMar>
-              <w:top w:w="45" w:type="dxa"/>
-              <w:start w:w="95" w:type="dxa"/>
-              <w:bottom w:w="45" w:type="dxa"/>
-              <w:end w:w="95" w:type="dxa"/>
+              <w:top w:w="85" w:type="dxa"/>
+              <w:start w:w="120" w:type="dxa"/>
+              <w:bottom w:w="85" w:type="dxa"/>
+              <w:end w:w="120" w:type="dxa"/>
             </w:tcMar>
           </w:tcPr>
           <w:p>
@@ -539,10 +540,10 @@
               <w:insideV w:val="single" w:sz="6" w:space="0" w:color="E4E4E4"/>
             </w:tcBorders>
             <w:tcMar>
-              <w:top w:w="45" w:type="dxa"/>
-              <w:start w:w="95" w:type="dxa"/>
-              <w:bottom w:w="45" w:type="dxa"/>
-              <w:end w:w="95" w:type="dxa"/>
+              <w:top w:w="85" w:type="dxa"/>
+              <w:start w:w="120" w:type="dxa"/>
+              <w:bottom w:w="85" w:type="dxa"/>
+              <w:end w:w="120" w:type="dxa"/>
             </w:tcMar>
           </w:tcPr>
           <w:p>
@@ -580,10 +581,10 @@
               <w:insideV w:val="single" w:sz="6" w:space="0" w:color="E4E4E4"/>
             </w:tcBorders>
             <w:tcMar>
-              <w:top w:w="45" w:type="dxa"/>
-              <w:start w:w="95" w:type="dxa"/>
-              <w:bottom w:w="45" w:type="dxa"/>
-              <w:end w:w="95" w:type="dxa"/>
+              <w:top w:w="85" w:type="dxa"/>
+              <w:start w:w="120" w:type="dxa"/>
+              <w:bottom w:w="85" w:type="dxa"/>
+              <w:end w:w="120" w:type="dxa"/>
             </w:tcMar>
           </w:tcPr>
           <w:p>
@@ -615,10 +616,10 @@
               <w:insideV w:val="single" w:sz="6" w:space="0" w:color="E4E4E4"/>
             </w:tcBorders>
             <w:tcMar>
-              <w:top w:w="45" w:type="dxa"/>
-              <w:start w:w="95" w:type="dxa"/>
-              <w:bottom w:w="45" w:type="dxa"/>
-              <w:end w:w="95" w:type="dxa"/>
+              <w:top w:w="85" w:type="dxa"/>
+              <w:start w:w="120" w:type="dxa"/>
+              <w:bottom w:w="85" w:type="dxa"/>
+              <w:end w:w="120" w:type="dxa"/>
             </w:tcMar>
           </w:tcPr>
           <w:p>
@@ -656,10 +657,10 @@
               <w:insideV w:val="single" w:sz="6" w:space="0" w:color="E4E4E4"/>
             </w:tcBorders>
             <w:tcMar>
-              <w:top w:w="45" w:type="dxa"/>
-              <w:start w:w="95" w:type="dxa"/>
-              <w:bottom w:w="45" w:type="dxa"/>
-              <w:end w:w="95" w:type="dxa"/>
+              <w:top w:w="85" w:type="dxa"/>
+              <w:start w:w="120" w:type="dxa"/>
+              <w:bottom w:w="85" w:type="dxa"/>
+              <w:end w:w="120" w:type="dxa"/>
             </w:tcMar>
           </w:tcPr>
           <w:p>
@@ -691,10 +692,10 @@
               <w:insideV w:val="single" w:sz="6" w:space="0" w:color="E4E4E4"/>
             </w:tcBorders>
             <w:tcMar>
-              <w:top w:w="45" w:type="dxa"/>
-              <w:start w:w="95" w:type="dxa"/>
-              <w:bottom w:w="45" w:type="dxa"/>
-              <w:end w:w="95" w:type="dxa"/>
+              <w:top w:w="85" w:type="dxa"/>
+              <w:start w:w="120" w:type="dxa"/>
+              <w:bottom w:w="85" w:type="dxa"/>
+              <w:end w:w="120" w:type="dxa"/>
             </w:tcMar>
           </w:tcPr>
           <w:p>
@@ -732,10 +733,10 @@
               <w:insideV w:val="single" w:sz="6" w:space="0" w:color="E4E4E4"/>
             </w:tcBorders>
             <w:tcMar>
-              <w:top w:w="45" w:type="dxa"/>
-              <w:start w:w="95" w:type="dxa"/>
-              <w:bottom w:w="45" w:type="dxa"/>
-              <w:end w:w="95" w:type="dxa"/>
+              <w:top w:w="85" w:type="dxa"/>
+              <w:start w:w="120" w:type="dxa"/>
+              <w:bottom w:w="85" w:type="dxa"/>
+              <w:end w:w="120" w:type="dxa"/>
             </w:tcMar>
           </w:tcPr>
           <w:p>
@@ -767,10 +768,10 @@
               <w:insideV w:val="single" w:sz="6" w:space="0" w:color="E4E4E4"/>
             </w:tcBorders>
             <w:tcMar>
-              <w:top w:w="45" w:type="dxa"/>
-              <w:start w:w="95" w:type="dxa"/>
-              <w:bottom w:w="45" w:type="dxa"/>
-              <w:end w:w="95" w:type="dxa"/>
+              <w:top w:w="85" w:type="dxa"/>
+              <w:start w:w="120" w:type="dxa"/>
+              <w:bottom w:w="85" w:type="dxa"/>
+              <w:end w:w="120" w:type="dxa"/>
             </w:tcMar>
           </w:tcPr>
           <w:p>
@@ -808,10 +809,10 @@
               <w:insideV w:val="single" w:sz="6" w:space="0" w:color="E4E4E4"/>
             </w:tcBorders>
             <w:tcMar>
-              <w:top w:w="45" w:type="dxa"/>
-              <w:start w:w="95" w:type="dxa"/>
-              <w:bottom w:w="45" w:type="dxa"/>
-              <w:end w:w="95" w:type="dxa"/>
+              <w:top w:w="85" w:type="dxa"/>
+              <w:start w:w="120" w:type="dxa"/>
+              <w:bottom w:w="85" w:type="dxa"/>
+              <w:end w:w="120" w:type="dxa"/>
             </w:tcMar>
           </w:tcPr>
           <w:p>
@@ -843,10 +844,10 @@
               <w:insideV w:val="single" w:sz="6" w:space="0" w:color="E4E4E4"/>
             </w:tcBorders>
             <w:tcMar>
-              <w:top w:w="45" w:type="dxa"/>
-              <w:start w:w="95" w:type="dxa"/>
-              <w:bottom w:w="45" w:type="dxa"/>
-              <w:end w:w="95" w:type="dxa"/>
+              <w:top w:w="85" w:type="dxa"/>
+              <w:start w:w="120" w:type="dxa"/>
+              <w:bottom w:w="85" w:type="dxa"/>
+              <w:end w:w="120" w:type="dxa"/>
             </w:tcMar>
           </w:tcPr>
           <w:p>
@@ -884,10 +885,10 @@
               <w:insideV w:val="single" w:sz="6" w:space="0" w:color="E4E4E4"/>
             </w:tcBorders>
             <w:tcMar>
-              <w:top w:w="45" w:type="dxa"/>
-              <w:start w:w="95" w:type="dxa"/>
-              <w:bottom w:w="45" w:type="dxa"/>
-              <w:end w:w="95" w:type="dxa"/>
+              <w:top w:w="85" w:type="dxa"/>
+              <w:start w:w="120" w:type="dxa"/>
+              <w:bottom w:w="85" w:type="dxa"/>
+              <w:end w:w="120" w:type="dxa"/>
             </w:tcMar>
           </w:tcPr>
           <w:p>
@@ -919,10 +920,10 @@
               <w:insideV w:val="single" w:sz="6" w:space="0" w:color="E4E4E4"/>
             </w:tcBorders>
             <w:tcMar>
-              <w:top w:w="45" w:type="dxa"/>
-              <w:start w:w="95" w:type="dxa"/>
-              <w:bottom w:w="45" w:type="dxa"/>
-              <w:end w:w="95" w:type="dxa"/>
+              <w:top w:w="85" w:type="dxa"/>
+              <w:start w:w="120" w:type="dxa"/>
+              <w:bottom w:w="85" w:type="dxa"/>
+              <w:end w:w="120" w:type="dxa"/>
             </w:tcMar>
           </w:tcPr>
           <w:p>
@@ -959,11 +960,11 @@
         <w:tblLook w:firstColumn="1" w:firstRow="1" w:lastColumn="0" w:lastRow="0" w:noHBand="0" w:noVBand="1" w:val="04A0"/>
       </w:tblPr>
       <w:tblGrid>
-        <w:gridCol w:w="2033"/>
-        <w:gridCol w:w="2033"/>
-        <w:gridCol w:w="2033"/>
-        <w:gridCol w:w="2033"/>
-        <w:gridCol w:w="2033"/>
+        <w:gridCol w:w="1693"/>
+        <w:gridCol w:w="4491"/>
+        <w:gridCol w:w="736"/>
+        <w:gridCol w:w="1252"/>
+        <w:gridCol w:w="1620"/>
       </w:tblGrid>
       <w:tr>
         <w:trPr>
@@ -971,7 +972,7 @@
         </w:trPr>
         <w:tc>
           <w:tcPr>
-            <w:tcW w:type="dxa" w:w="1656"/>
+            <w:tcW w:type="dxa" w:w="1693"/>
             <w:shd w:fill="FDEAF1"/>
             <w:tcBorders>
               <w:top w:val="single" w:sz="6" w:space="0" w:color="E4E4E4"/>
@@ -982,10 +983,10 @@
               <w:insideV w:val="single" w:sz="6" w:space="0" w:color="E4E4E4"/>
             </w:tcBorders>
             <w:tcMar>
-              <w:top w:w="45" w:type="dxa"/>
-              <w:start w:w="95" w:type="dxa"/>
-              <w:bottom w:w="45" w:type="dxa"/>
-              <w:end w:w="95" w:type="dxa"/>
+              <w:top w:w="85" w:type="dxa"/>
+              <w:start w:w="120" w:type="dxa"/>
+              <w:bottom w:w="85" w:type="dxa"/>
+              <w:end w:w="120" w:type="dxa"/>
             </w:tcMar>
             <w:vAlign w:val="center"/>
           </w:tcPr>
@@ -1007,7 +1008,7 @@
         </w:tc>
         <w:tc>
           <w:tcPr>
-            <w:tcW w:type="dxa" w:w="4392"/>
+            <w:tcW w:type="dxa" w:w="4491"/>
             <w:shd w:fill="FDEAF1"/>
             <w:tcBorders>
               <w:top w:val="single" w:sz="6" w:space="0" w:color="E4E4E4"/>
@@ -1018,10 +1019,10 @@
               <w:insideV w:val="single" w:sz="6" w:space="0" w:color="E4E4E4"/>
             </w:tcBorders>
             <w:tcMar>
-              <w:top w:w="45" w:type="dxa"/>
-              <w:start w:w="95" w:type="dxa"/>
-              <w:bottom w:w="45" w:type="dxa"/>
-              <w:end w:w="95" w:type="dxa"/>
+              <w:top w:w="85" w:type="dxa"/>
+              <w:start w:w="120" w:type="dxa"/>
+              <w:bottom w:w="85" w:type="dxa"/>
+              <w:end w:w="120" w:type="dxa"/>
             </w:tcMar>
             <w:vAlign w:val="center"/>
           </w:tcPr>
@@ -1043,7 +1044,7 @@
         </w:tc>
         <w:tc>
           <w:tcPr>
-            <w:tcW w:type="dxa" w:w="720"/>
+            <w:tcW w:type="dxa" w:w="736"/>
             <w:shd w:fill="FDEAF1"/>
             <w:tcBorders>
               <w:top w:val="single" w:sz="6" w:space="0" w:color="E4E4E4"/>
@@ -1054,10 +1055,10 @@
               <w:insideV w:val="single" w:sz="6" w:space="0" w:color="E4E4E4"/>
             </w:tcBorders>
             <w:tcMar>
-              <w:top w:w="45" w:type="dxa"/>
-              <w:start w:w="95" w:type="dxa"/>
-              <w:bottom w:w="45" w:type="dxa"/>
-              <w:end w:w="95" w:type="dxa"/>
+              <w:top w:w="85" w:type="dxa"/>
+              <w:start w:w="120" w:type="dxa"/>
+              <w:bottom w:w="85" w:type="dxa"/>
+              <w:end w:w="120" w:type="dxa"/>
             </w:tcMar>
             <w:vAlign w:val="center"/>
           </w:tcPr>
@@ -1079,7 +1080,7 @@
         </w:tc>
         <w:tc>
           <w:tcPr>
-            <w:tcW w:type="dxa" w:w="1224"/>
+            <w:tcW w:type="dxa" w:w="1252"/>
             <w:shd w:fill="FDEAF1"/>
             <w:tcBorders>
               <w:top w:val="single" w:sz="6" w:space="0" w:color="E4E4E4"/>
@@ -1090,10 +1091,10 @@
               <w:insideV w:val="single" w:sz="6" w:space="0" w:color="E4E4E4"/>
             </w:tcBorders>
             <w:tcMar>
-              <w:top w:w="45" w:type="dxa"/>
-              <w:start w:w="95" w:type="dxa"/>
-              <w:bottom w:w="45" w:type="dxa"/>
-              <w:end w:w="95" w:type="dxa"/>
+              <w:top w:w="85" w:type="dxa"/>
+              <w:start w:w="120" w:type="dxa"/>
+              <w:bottom w:w="85" w:type="dxa"/>
+              <w:end w:w="120" w:type="dxa"/>
             </w:tcMar>
             <w:vAlign w:val="center"/>
           </w:tcPr>
@@ -1115,7 +1116,7 @@
         </w:tc>
         <w:tc>
           <w:tcPr>
-            <w:tcW w:type="dxa" w:w="1584"/>
+            <w:tcW w:type="dxa" w:w="1620"/>
             <w:shd w:fill="FDEAF1"/>
             <w:tcBorders>
               <w:top w:val="single" w:sz="6" w:space="0" w:color="E4E4E4"/>
@@ -1126,10 +1127,10 @@
               <w:insideV w:val="single" w:sz="6" w:space="0" w:color="E4E4E4"/>
             </w:tcBorders>
             <w:tcMar>
-              <w:top w:w="45" w:type="dxa"/>
-              <w:start w:w="95" w:type="dxa"/>
-              <w:bottom w:w="45" w:type="dxa"/>
-              <w:end w:w="95" w:type="dxa"/>
+              <w:top w:w="85" w:type="dxa"/>
+              <w:start w:w="120" w:type="dxa"/>
+              <w:bottom w:w="85" w:type="dxa"/>
+              <w:end w:w="120" w:type="dxa"/>
             </w:tcMar>
             <w:vAlign w:val="center"/>
           </w:tcPr>
@@ -1156,7 +1157,7 @@
         </w:trPr>
         <w:tc>
           <w:tcPr>
-            <w:tcW w:type="dxa" w:w="1656"/>
+            <w:tcW w:type="dxa" w:w="1693"/>
             <w:tcBorders>
               <w:top w:val="single" w:sz="6" w:space="0" w:color="E4E4E4"/>
               <w:left w:val="single" w:sz="6" w:space="0" w:color="E4E4E4"/>
@@ -1166,10 +1167,10 @@
               <w:insideV w:val="single" w:sz="6" w:space="0" w:color="E4E4E4"/>
             </w:tcBorders>
             <w:tcMar>
-              <w:top w:w="45" w:type="dxa"/>
-              <w:start w:w="95" w:type="dxa"/>
-              <w:bottom w:w="45" w:type="dxa"/>
-              <w:end w:w="95" w:type="dxa"/>
+              <w:top w:w="85" w:type="dxa"/>
+              <w:start w:w="120" w:type="dxa"/>
+              <w:bottom w:w="85" w:type="dxa"/>
+              <w:end w:w="120" w:type="dxa"/>
             </w:tcMar>
             <w:vAlign w:val="center"/>
           </w:tcPr>
@@ -1191,7 +1192,7 @@
         </w:tc>
         <w:tc>
           <w:tcPr>
-            <w:tcW w:type="dxa" w:w="4392"/>
+            <w:tcW w:type="dxa" w:w="4491"/>
             <w:tcBorders>
               <w:top w:val="single" w:sz="6" w:space="0" w:color="E4E4E4"/>
               <w:left w:val="single" w:sz="6" w:space="0" w:color="E4E4E4"/>
@@ -1201,10 +1202,10 @@
               <w:insideV w:val="single" w:sz="6" w:space="0" w:color="E4E4E4"/>
             </w:tcBorders>
             <w:tcMar>
-              <w:top w:w="45" w:type="dxa"/>
-              <w:start w:w="95" w:type="dxa"/>
-              <w:bottom w:w="45" w:type="dxa"/>
-              <w:end w:w="95" w:type="dxa"/>
+              <w:top w:w="85" w:type="dxa"/>
+              <w:start w:w="120" w:type="dxa"/>
+              <w:bottom w:w="85" w:type="dxa"/>
+              <w:end w:w="120" w:type="dxa"/>
             </w:tcMar>
             <w:vAlign w:val="center"/>
           </w:tcPr>
@@ -1226,7 +1227,7 @@
         </w:tc>
         <w:tc>
           <w:tcPr>
-            <w:tcW w:type="dxa" w:w="720"/>
+            <w:tcW w:type="dxa" w:w="736"/>
             <w:tcBorders>
               <w:top w:val="single" w:sz="6" w:space="0" w:color="E4E4E4"/>
               <w:left w:val="single" w:sz="6" w:space="0" w:color="E4E4E4"/>
@@ -1236,10 +1237,10 @@
               <w:insideV w:val="single" w:sz="6" w:space="0" w:color="E4E4E4"/>
             </w:tcBorders>
             <w:tcMar>
-              <w:top w:w="45" w:type="dxa"/>
-              <w:start w:w="95" w:type="dxa"/>
-              <w:bottom w:w="45" w:type="dxa"/>
-              <w:end w:w="95" w:type="dxa"/>
+              <w:top w:w="85" w:type="dxa"/>
+              <w:start w:w="120" w:type="dxa"/>
+              <w:bottom w:w="85" w:type="dxa"/>
+              <w:end w:w="120" w:type="dxa"/>
             </w:tcMar>
             <w:vAlign w:val="center"/>
           </w:tcPr>
@@ -1261,7 +1262,7 @@
         </w:tc>
         <w:tc>
           <w:tcPr>
-            <w:tcW w:type="dxa" w:w="1224"/>
+            <w:tcW w:type="dxa" w:w="1252"/>
             <w:tcBorders>
               <w:top w:val="single" w:sz="6" w:space="0" w:color="E4E4E4"/>
               <w:left w:val="single" w:sz="6" w:space="0" w:color="E4E4E4"/>
@@ -1271,10 +1272,10 @@
               <w:insideV w:val="single" w:sz="6" w:space="0" w:color="E4E4E4"/>
             </w:tcBorders>
             <w:tcMar>
-              <w:top w:w="45" w:type="dxa"/>
-              <w:start w:w="95" w:type="dxa"/>
-              <w:bottom w:w="45" w:type="dxa"/>
-              <w:end w:w="95" w:type="dxa"/>
+              <w:top w:w="85" w:type="dxa"/>
+              <w:start w:w="120" w:type="dxa"/>
+              <w:bottom w:w="85" w:type="dxa"/>
+              <w:end w:w="120" w:type="dxa"/>
             </w:tcMar>
             <w:vAlign w:val="center"/>
           </w:tcPr>
@@ -1296,7 +1297,7 @@
         </w:tc>
         <w:tc>
           <w:tcPr>
-            <w:tcW w:type="dxa" w:w="1584"/>
+            <w:tcW w:type="dxa" w:w="1620"/>
             <w:tcBorders>
               <w:top w:val="single" w:sz="6" w:space="0" w:color="E4E4E4"/>
               <w:left w:val="single" w:sz="6" w:space="0" w:color="E4E4E4"/>
@@ -1306,10 +1307,10 @@
               <w:insideV w:val="single" w:sz="6" w:space="0" w:color="E4E4E4"/>
             </w:tcBorders>
             <w:tcMar>
-              <w:top w:w="45" w:type="dxa"/>
-              <w:start w:w="95" w:type="dxa"/>
-              <w:bottom w:w="45" w:type="dxa"/>
-              <w:end w:w="95" w:type="dxa"/>
+              <w:top w:w="85" w:type="dxa"/>
+              <w:start w:w="120" w:type="dxa"/>
+              <w:bottom w:w="85" w:type="dxa"/>
+              <w:end w:w="120" w:type="dxa"/>
             </w:tcMar>
             <w:vAlign w:val="center"/>
           </w:tcPr>
@@ -1336,7 +1337,7 @@
         </w:trPr>
         <w:tc>
           <w:tcPr>
-            <w:tcW w:type="dxa" w:w="1656"/>
+            <w:tcW w:type="dxa" w:w="1693"/>
             <w:tcBorders>
               <w:top w:val="single" w:sz="6" w:space="0" w:color="E4E4E4"/>
               <w:left w:val="single" w:sz="6" w:space="0" w:color="E4E4E4"/>
@@ -1346,10 +1347,10 @@
               <w:insideV w:val="single" w:sz="6" w:space="0" w:color="E4E4E4"/>
             </w:tcBorders>
             <w:tcMar>
-              <w:top w:w="45" w:type="dxa"/>
-              <w:start w:w="95" w:type="dxa"/>
-              <w:bottom w:w="45" w:type="dxa"/>
-              <w:end w:w="95" w:type="dxa"/>
+              <w:top w:w="85" w:type="dxa"/>
+              <w:start w:w="120" w:type="dxa"/>
+              <w:bottom w:w="85" w:type="dxa"/>
+              <w:end w:w="120" w:type="dxa"/>
             </w:tcMar>
             <w:vAlign w:val="center"/>
           </w:tcPr>
@@ -1371,7 +1372,7 @@
         </w:tc>
         <w:tc>
           <w:tcPr>
-            <w:tcW w:type="dxa" w:w="4392"/>
+            <w:tcW w:type="dxa" w:w="4491"/>
             <w:tcBorders>
               <w:top w:val="single" w:sz="6" w:space="0" w:color="E4E4E4"/>
               <w:left w:val="single" w:sz="6" w:space="0" w:color="E4E4E4"/>
@@ -1381,10 +1382,10 @@
               <w:insideV w:val="single" w:sz="6" w:space="0" w:color="E4E4E4"/>
             </w:tcBorders>
             <w:tcMar>
-              <w:top w:w="45" w:type="dxa"/>
-              <w:start w:w="95" w:type="dxa"/>
-              <w:bottom w:w="45" w:type="dxa"/>
-              <w:end w:w="95" w:type="dxa"/>
+              <w:top w:w="85" w:type="dxa"/>
+              <w:start w:w="120" w:type="dxa"/>
+              <w:bottom w:w="85" w:type="dxa"/>
+              <w:end w:w="120" w:type="dxa"/>
             </w:tcMar>
             <w:vAlign w:val="center"/>
           </w:tcPr>
@@ -1406,7 +1407,7 @@
         </w:tc>
         <w:tc>
           <w:tcPr>
-            <w:tcW w:type="dxa" w:w="720"/>
+            <w:tcW w:type="dxa" w:w="736"/>
             <w:tcBorders>
               <w:top w:val="single" w:sz="6" w:space="0" w:color="E4E4E4"/>
               <w:left w:val="single" w:sz="6" w:space="0" w:color="E4E4E4"/>
@@ -1416,10 +1417,10 @@
               <w:insideV w:val="single" w:sz="6" w:space="0" w:color="E4E4E4"/>
             </w:tcBorders>
             <w:tcMar>
-              <w:top w:w="45" w:type="dxa"/>
-              <w:start w:w="95" w:type="dxa"/>
-              <w:bottom w:w="45" w:type="dxa"/>
-              <w:end w:w="95" w:type="dxa"/>
+              <w:top w:w="85" w:type="dxa"/>
+              <w:start w:w="120" w:type="dxa"/>
+              <w:bottom w:w="85" w:type="dxa"/>
+              <w:end w:w="120" w:type="dxa"/>
             </w:tcMar>
             <w:vAlign w:val="center"/>
           </w:tcPr>
@@ -1441,7 +1442,7 @@
         </w:tc>
         <w:tc>
           <w:tcPr>
-            <w:tcW w:type="dxa" w:w="1224"/>
+            <w:tcW w:type="dxa" w:w="1252"/>
             <w:tcBorders>
               <w:top w:val="single" w:sz="6" w:space="0" w:color="E4E4E4"/>
               <w:left w:val="single" w:sz="6" w:space="0" w:color="E4E4E4"/>
@@ -1451,10 +1452,10 @@
               <w:insideV w:val="single" w:sz="6" w:space="0" w:color="E4E4E4"/>
             </w:tcBorders>
             <w:tcMar>
-              <w:top w:w="45" w:type="dxa"/>
-              <w:start w:w="95" w:type="dxa"/>
-              <w:bottom w:w="45" w:type="dxa"/>
-              <w:end w:w="95" w:type="dxa"/>
+              <w:top w:w="85" w:type="dxa"/>
+              <w:start w:w="120" w:type="dxa"/>
+              <w:bottom w:w="85" w:type="dxa"/>
+              <w:end w:w="120" w:type="dxa"/>
             </w:tcMar>
             <w:vAlign w:val="center"/>
           </w:tcPr>
@@ -1476,7 +1477,7 @@
         </w:tc>
         <w:tc>
           <w:tcPr>
-            <w:tcW w:type="dxa" w:w="1584"/>
+            <w:tcW w:type="dxa" w:w="1620"/>
             <w:tcBorders>
               <w:top w:val="single" w:sz="6" w:space="0" w:color="E4E4E4"/>
               <w:left w:val="single" w:sz="6" w:space="0" w:color="E4E4E4"/>
@@ -1486,10 +1487,10 @@
               <w:insideV w:val="single" w:sz="6" w:space="0" w:color="E4E4E4"/>
             </w:tcBorders>
             <w:tcMar>
-              <w:top w:w="45" w:type="dxa"/>
-              <w:start w:w="95" w:type="dxa"/>
-              <w:bottom w:w="45" w:type="dxa"/>
-              <w:end w:w="95" w:type="dxa"/>
+              <w:top w:w="85" w:type="dxa"/>
+              <w:start w:w="120" w:type="dxa"/>
+              <w:bottom w:w="85" w:type="dxa"/>
+              <w:end w:w="120" w:type="dxa"/>
             </w:tcMar>
             <w:vAlign w:val="center"/>
           </w:tcPr>
@@ -1516,7 +1517,7 @@
         </w:trPr>
         <w:tc>
           <w:tcPr>
-            <w:tcW w:type="dxa" w:w="1656"/>
+            <w:tcW w:type="dxa" w:w="1693"/>
             <w:tcBorders>
               <w:top w:val="single" w:sz="6" w:space="0" w:color="E4E4E4"/>
               <w:left w:val="single" w:sz="6" w:space="0" w:color="E4E4E4"/>
@@ -1526,10 +1527,10 @@
               <w:insideV w:val="single" w:sz="6" w:space="0" w:color="E4E4E4"/>
             </w:tcBorders>
             <w:tcMar>
-              <w:top w:w="45" w:type="dxa"/>
-              <w:start w:w="95" w:type="dxa"/>
-              <w:bottom w:w="45" w:type="dxa"/>
-              <w:end w:w="95" w:type="dxa"/>
+              <w:top w:w="85" w:type="dxa"/>
+              <w:start w:w="120" w:type="dxa"/>
+              <w:bottom w:w="85" w:type="dxa"/>
+              <w:end w:w="120" w:type="dxa"/>
             </w:tcMar>
             <w:vAlign w:val="center"/>
           </w:tcPr>
@@ -1551,7 +1552,7 @@
         </w:tc>
         <w:tc>
           <w:tcPr>
-            <w:tcW w:type="dxa" w:w="4392"/>
+            <w:tcW w:type="dxa" w:w="4491"/>
             <w:tcBorders>
               <w:top w:val="single" w:sz="6" w:space="0" w:color="E4E4E4"/>
               <w:left w:val="single" w:sz="6" w:space="0" w:color="E4E4E4"/>
@@ -1561,10 +1562,10 @@
               <w:insideV w:val="single" w:sz="6" w:space="0" w:color="E4E4E4"/>
             </w:tcBorders>
             <w:tcMar>
-              <w:top w:w="45" w:type="dxa"/>
-              <w:start w:w="95" w:type="dxa"/>
-              <w:bottom w:w="45" w:type="dxa"/>
-              <w:end w:w="95" w:type="dxa"/>
+              <w:top w:w="85" w:type="dxa"/>
+              <w:start w:w="120" w:type="dxa"/>
+              <w:bottom w:w="85" w:type="dxa"/>
+              <w:end w:w="120" w:type="dxa"/>
             </w:tcMar>
             <w:vAlign w:val="center"/>
           </w:tcPr>
@@ -1586,7 +1587,7 @@
         </w:tc>
         <w:tc>
           <w:tcPr>
-            <w:tcW w:type="dxa" w:w="720"/>
+            <w:tcW w:type="dxa" w:w="736"/>
             <w:tcBorders>
               <w:top w:val="single" w:sz="6" w:space="0" w:color="E4E4E4"/>
               <w:left w:val="single" w:sz="6" w:space="0" w:color="E4E4E4"/>
@@ -1596,10 +1597,10 @@
               <w:insideV w:val="single" w:sz="6" w:space="0" w:color="E4E4E4"/>
             </w:tcBorders>
             <w:tcMar>
-              <w:top w:w="45" w:type="dxa"/>
-              <w:start w:w="95" w:type="dxa"/>
-              <w:bottom w:w="45" w:type="dxa"/>
-              <w:end w:w="95" w:type="dxa"/>
+              <w:top w:w="85" w:type="dxa"/>
+              <w:start w:w="120" w:type="dxa"/>
+              <w:bottom w:w="85" w:type="dxa"/>
+              <w:end w:w="120" w:type="dxa"/>
             </w:tcMar>
             <w:vAlign w:val="center"/>
           </w:tcPr>
@@ -1621,7 +1622,7 @@
         </w:tc>
         <w:tc>
           <w:tcPr>
-            <w:tcW w:type="dxa" w:w="1224"/>
+            <w:tcW w:type="dxa" w:w="1252"/>
             <w:tcBorders>
               <w:top w:val="single" w:sz="6" w:space="0" w:color="E4E4E4"/>
               <w:left w:val="single" w:sz="6" w:space="0" w:color="E4E4E4"/>
@@ -1631,10 +1632,10 @@
               <w:insideV w:val="single" w:sz="6" w:space="0" w:color="E4E4E4"/>
             </w:tcBorders>
             <w:tcMar>
-              <w:top w:w="45" w:type="dxa"/>
-              <w:start w:w="95" w:type="dxa"/>
-              <w:bottom w:w="45" w:type="dxa"/>
-              <w:end w:w="95" w:type="dxa"/>
+              <w:top w:w="85" w:type="dxa"/>
+              <w:start w:w="120" w:type="dxa"/>
+              <w:bottom w:w="85" w:type="dxa"/>
+              <w:end w:w="120" w:type="dxa"/>
             </w:tcMar>
             <w:vAlign w:val="center"/>
           </w:tcPr>
@@ -1656,7 +1657,7 @@
         </w:tc>
         <w:tc>
           <w:tcPr>
-            <w:tcW w:type="dxa" w:w="1584"/>
+            <w:tcW w:type="dxa" w:w="1620"/>
             <w:tcBorders>
               <w:top w:val="single" w:sz="6" w:space="0" w:color="E4E4E4"/>
               <w:left w:val="single" w:sz="6" w:space="0" w:color="E4E4E4"/>
@@ -1666,10 +1667,10 @@
               <w:insideV w:val="single" w:sz="6" w:space="0" w:color="E4E4E4"/>
             </w:tcBorders>
             <w:tcMar>
-              <w:top w:w="45" w:type="dxa"/>
-              <w:start w:w="95" w:type="dxa"/>
-              <w:bottom w:w="45" w:type="dxa"/>
-              <w:end w:w="95" w:type="dxa"/>
+              <w:top w:w="85" w:type="dxa"/>
+              <w:start w:w="120" w:type="dxa"/>
+              <w:bottom w:w="85" w:type="dxa"/>
+              <w:end w:w="120" w:type="dxa"/>
             </w:tcMar>
             <w:vAlign w:val="center"/>
           </w:tcPr>
@@ -1696,7 +1697,7 @@
         </w:trPr>
         <w:tc>
           <w:tcPr>
-            <w:tcW w:type="dxa" w:w="1656"/>
+            <w:tcW w:type="dxa" w:w="1693"/>
             <w:tcBorders>
               <w:top w:val="single" w:sz="6" w:space="0" w:color="E4E4E4"/>
               <w:left w:val="single" w:sz="6" w:space="0" w:color="E4E4E4"/>
@@ -1706,10 +1707,10 @@
               <w:insideV w:val="single" w:sz="6" w:space="0" w:color="E4E4E4"/>
             </w:tcBorders>
             <w:tcMar>
-              <w:top w:w="45" w:type="dxa"/>
-              <w:start w:w="95" w:type="dxa"/>
-              <w:bottom w:w="45" w:type="dxa"/>
-              <w:end w:w="95" w:type="dxa"/>
+              <w:top w:w="85" w:type="dxa"/>
+              <w:start w:w="120" w:type="dxa"/>
+              <w:bottom w:w="85" w:type="dxa"/>
+              <w:end w:w="120" w:type="dxa"/>
             </w:tcMar>
             <w:vAlign w:val="center"/>
           </w:tcPr>
@@ -1731,7 +1732,7 @@
         </w:tc>
         <w:tc>
           <w:tcPr>
-            <w:tcW w:type="dxa" w:w="4392"/>
+            <w:tcW w:type="dxa" w:w="4491"/>
             <w:tcBorders>
               <w:top w:val="single" w:sz="6" w:space="0" w:color="E4E4E4"/>
               <w:left w:val="single" w:sz="6" w:space="0" w:color="E4E4E4"/>
@@ -1741,10 +1742,10 @@
               <w:insideV w:val="single" w:sz="6" w:space="0" w:color="E4E4E4"/>
             </w:tcBorders>
             <w:tcMar>
-              <w:top w:w="45" w:type="dxa"/>
-              <w:start w:w="95" w:type="dxa"/>
-              <w:bottom w:w="45" w:type="dxa"/>
-              <w:end w:w="95" w:type="dxa"/>
+              <w:top w:w="85" w:type="dxa"/>
+              <w:start w:w="120" w:type="dxa"/>
+              <w:bottom w:w="85" w:type="dxa"/>
+              <w:end w:w="120" w:type="dxa"/>
             </w:tcMar>
             <w:vAlign w:val="center"/>
           </w:tcPr>
@@ -1766,7 +1767,7 @@
         </w:tc>
         <w:tc>
           <w:tcPr>
-            <w:tcW w:type="dxa" w:w="720"/>
+            <w:tcW w:type="dxa" w:w="736"/>
             <w:tcBorders>
               <w:top w:val="single" w:sz="6" w:space="0" w:color="E4E4E4"/>
               <w:left w:val="single" w:sz="6" w:space="0" w:color="E4E4E4"/>
@@ -1776,10 +1777,10 @@
               <w:insideV w:val="single" w:sz="6" w:space="0" w:color="E4E4E4"/>
             </w:tcBorders>
             <w:tcMar>
-              <w:top w:w="45" w:type="dxa"/>
-              <w:start w:w="95" w:type="dxa"/>
-              <w:bottom w:w="45" w:type="dxa"/>
-              <w:end w:w="95" w:type="dxa"/>
+              <w:top w:w="85" w:type="dxa"/>
+              <w:start w:w="120" w:type="dxa"/>
+              <w:bottom w:w="85" w:type="dxa"/>
+              <w:end w:w="120" w:type="dxa"/>
             </w:tcMar>
             <w:vAlign w:val="center"/>
           </w:tcPr>
@@ -1801,7 +1802,7 @@
         </w:tc>
         <w:tc>
           <w:tcPr>
-            <w:tcW w:type="dxa" w:w="1224"/>
+            <w:tcW w:type="dxa" w:w="1252"/>
             <w:tcBorders>
               <w:top w:val="single" w:sz="6" w:space="0" w:color="E4E4E4"/>
               <w:left w:val="single" w:sz="6" w:space="0" w:color="E4E4E4"/>
@@ -1811,10 +1812,10 @@
               <w:insideV w:val="single" w:sz="6" w:space="0" w:color="E4E4E4"/>
             </w:tcBorders>
             <w:tcMar>
-              <w:top w:w="45" w:type="dxa"/>
-              <w:start w:w="95" w:type="dxa"/>
-              <w:bottom w:w="45" w:type="dxa"/>
-              <w:end w:w="95" w:type="dxa"/>
+              <w:top w:w="85" w:type="dxa"/>
+              <w:start w:w="120" w:type="dxa"/>
+              <w:bottom w:w="85" w:type="dxa"/>
+              <w:end w:w="120" w:type="dxa"/>
             </w:tcMar>
             <w:vAlign w:val="center"/>
           </w:tcPr>
@@ -1836,7 +1837,7 @@
         </w:tc>
         <w:tc>
           <w:tcPr>
-            <w:tcW w:type="dxa" w:w="1584"/>
+            <w:tcW w:type="dxa" w:w="1620"/>
             <w:tcBorders>
               <w:top w:val="single" w:sz="6" w:space="0" w:color="E4E4E4"/>
               <w:left w:val="single" w:sz="6" w:space="0" w:color="E4E4E4"/>
@@ -1846,10 +1847,10 @@
               <w:insideV w:val="single" w:sz="6" w:space="0" w:color="E4E4E4"/>
             </w:tcBorders>
             <w:tcMar>
-              <w:top w:w="45" w:type="dxa"/>
-              <w:start w:w="95" w:type="dxa"/>
-              <w:bottom w:w="45" w:type="dxa"/>
-              <w:end w:w="95" w:type="dxa"/>
+              <w:top w:w="85" w:type="dxa"/>
+              <w:start w:w="120" w:type="dxa"/>
+              <w:bottom w:w="85" w:type="dxa"/>
+              <w:end w:w="120" w:type="dxa"/>
             </w:tcMar>
             <w:vAlign w:val="center"/>
           </w:tcPr>
@@ -1876,7 +1877,7 @@
         </w:trPr>
         <w:tc>
           <w:tcPr>
-            <w:tcW w:type="dxa" w:w="1656"/>
+            <w:tcW w:type="dxa" w:w="1693"/>
             <w:tcBorders>
               <w:top w:val="single" w:sz="6" w:space="0" w:color="E4E4E4"/>
               <w:left w:val="single" w:sz="6" w:space="0" w:color="E4E4E4"/>
@@ -1886,10 +1887,10 @@
               <w:insideV w:val="single" w:sz="6" w:space="0" w:color="E4E4E4"/>
             </w:tcBorders>
             <w:tcMar>
-              <w:top w:w="45" w:type="dxa"/>
-              <w:start w:w="95" w:type="dxa"/>
-              <w:bottom w:w="45" w:type="dxa"/>
-              <w:end w:w="95" w:type="dxa"/>
+              <w:top w:w="85" w:type="dxa"/>
+              <w:start w:w="120" w:type="dxa"/>
+              <w:bottom w:w="85" w:type="dxa"/>
+              <w:end w:w="120" w:type="dxa"/>
             </w:tcMar>
             <w:vAlign w:val="center"/>
           </w:tcPr>
@@ -1911,7 +1912,7 @@
         </w:tc>
         <w:tc>
           <w:tcPr>
-            <w:tcW w:type="dxa" w:w="4392"/>
+            <w:tcW w:type="dxa" w:w="4491"/>
             <w:tcBorders>
               <w:top w:val="single" w:sz="6" w:space="0" w:color="E4E4E4"/>
               <w:left w:val="single" w:sz="6" w:space="0" w:color="E4E4E4"/>
@@ -1921,10 +1922,10 @@
               <w:insideV w:val="single" w:sz="6" w:space="0" w:color="E4E4E4"/>
             </w:tcBorders>
             <w:tcMar>
-              <w:top w:w="45" w:type="dxa"/>
-              <w:start w:w="95" w:type="dxa"/>
-              <w:bottom w:w="45" w:type="dxa"/>
-              <w:end w:w="95" w:type="dxa"/>
+              <w:top w:w="85" w:type="dxa"/>
+              <w:start w:w="120" w:type="dxa"/>
+              <w:bottom w:w="85" w:type="dxa"/>
+              <w:end w:w="120" w:type="dxa"/>
             </w:tcMar>
             <w:vAlign w:val="center"/>
           </w:tcPr>
@@ -1946,7 +1947,7 @@
         </w:tc>
         <w:tc>
           <w:tcPr>
-            <w:tcW w:type="dxa" w:w="720"/>
+            <w:tcW w:type="dxa" w:w="736"/>
             <w:tcBorders>
               <w:top w:val="single" w:sz="6" w:space="0" w:color="E4E4E4"/>
               <w:left w:val="single" w:sz="6" w:space="0" w:color="E4E4E4"/>
@@ -1956,10 +1957,10 @@
               <w:insideV w:val="single" w:sz="6" w:space="0" w:color="E4E4E4"/>
             </w:tcBorders>
             <w:tcMar>
-              <w:top w:w="45" w:type="dxa"/>
-              <w:start w:w="95" w:type="dxa"/>
-              <w:bottom w:w="45" w:type="dxa"/>
-              <w:end w:w="95" w:type="dxa"/>
+              <w:top w:w="85" w:type="dxa"/>
+              <w:start w:w="120" w:type="dxa"/>
+              <w:bottom w:w="85" w:type="dxa"/>
+              <w:end w:w="120" w:type="dxa"/>
             </w:tcMar>
             <w:vAlign w:val="center"/>
           </w:tcPr>
@@ -1981,7 +1982,7 @@
         </w:tc>
         <w:tc>
           <w:tcPr>
-            <w:tcW w:type="dxa" w:w="1224"/>
+            <w:tcW w:type="dxa" w:w="1252"/>
             <w:tcBorders>
               <w:top w:val="single" w:sz="6" w:space="0" w:color="E4E4E4"/>
               <w:left w:val="single" w:sz="6" w:space="0" w:color="E4E4E4"/>
@@ -1991,10 +1992,10 @@
               <w:insideV w:val="single" w:sz="6" w:space="0" w:color="E4E4E4"/>
             </w:tcBorders>
             <w:tcMar>
-              <w:top w:w="45" w:type="dxa"/>
-              <w:start w:w="95" w:type="dxa"/>
-              <w:bottom w:w="45" w:type="dxa"/>
-              <w:end w:w="95" w:type="dxa"/>
+              <w:top w:w="85" w:type="dxa"/>
+              <w:start w:w="120" w:type="dxa"/>
+              <w:bottom w:w="85" w:type="dxa"/>
+              <w:end w:w="120" w:type="dxa"/>
             </w:tcMar>
             <w:vAlign w:val="center"/>
           </w:tcPr>
@@ -2016,7 +2017,7 @@
         </w:tc>
         <w:tc>
           <w:tcPr>
-            <w:tcW w:type="dxa" w:w="1584"/>
+            <w:tcW w:type="dxa" w:w="1620"/>
             <w:tcBorders>
               <w:top w:val="single" w:sz="6" w:space="0" w:color="E4E4E4"/>
               <w:left w:val="single" w:sz="6" w:space="0" w:color="E4E4E4"/>
@@ -2026,10 +2027,10 @@
               <w:insideV w:val="single" w:sz="6" w:space="0" w:color="E4E4E4"/>
             </w:tcBorders>
             <w:tcMar>
-              <w:top w:w="45" w:type="dxa"/>
-              <w:start w:w="95" w:type="dxa"/>
-              <w:bottom w:w="45" w:type="dxa"/>
-              <w:end w:w="95" w:type="dxa"/>
+              <w:top w:w="85" w:type="dxa"/>
+              <w:start w:w="120" w:type="dxa"/>
+              <w:bottom w:w="85" w:type="dxa"/>
+              <w:end w:w="120" w:type="dxa"/>
             </w:tcMar>
             <w:vAlign w:val="center"/>
           </w:tcPr>
@@ -2056,7 +2057,7 @@
         </w:trPr>
         <w:tc>
           <w:tcPr>
-            <w:tcW w:type="dxa" w:w="1656"/>
+            <w:tcW w:type="dxa" w:w="1693"/>
             <w:tcBorders>
               <w:top w:val="single" w:sz="6" w:space="0" w:color="E4E4E4"/>
               <w:left w:val="single" w:sz="6" w:space="0" w:color="E4E4E4"/>
@@ -2066,10 +2067,10 @@
               <w:insideV w:val="single" w:sz="6" w:space="0" w:color="E4E4E4"/>
             </w:tcBorders>
             <w:tcMar>
-              <w:top w:w="45" w:type="dxa"/>
-              <w:start w:w="95" w:type="dxa"/>
-              <w:bottom w:w="45" w:type="dxa"/>
-              <w:end w:w="95" w:type="dxa"/>
+              <w:top w:w="85" w:type="dxa"/>
+              <w:start w:w="120" w:type="dxa"/>
+              <w:bottom w:w="85" w:type="dxa"/>
+              <w:end w:w="120" w:type="dxa"/>
             </w:tcMar>
             <w:vAlign w:val="center"/>
           </w:tcPr>
@@ -2091,7 +2092,7 @@
         </w:tc>
         <w:tc>
           <w:tcPr>
-            <w:tcW w:type="dxa" w:w="4392"/>
+            <w:tcW w:type="dxa" w:w="4491"/>
             <w:tcBorders>
               <w:top w:val="single" w:sz="6" w:space="0" w:color="E4E4E4"/>
               <w:left w:val="single" w:sz="6" w:space="0" w:color="E4E4E4"/>
@@ -2101,10 +2102,10 @@
               <w:insideV w:val="single" w:sz="6" w:space="0" w:color="E4E4E4"/>
             </w:tcBorders>
             <w:tcMar>
-              <w:top w:w="45" w:type="dxa"/>
-              <w:start w:w="95" w:type="dxa"/>
-              <w:bottom w:w="45" w:type="dxa"/>
-              <w:end w:w="95" w:type="dxa"/>
+              <w:top w:w="85" w:type="dxa"/>
+              <w:start w:w="120" w:type="dxa"/>
+              <w:bottom w:w="85" w:type="dxa"/>
+              <w:end w:w="120" w:type="dxa"/>
             </w:tcMar>
             <w:vAlign w:val="center"/>
           </w:tcPr>
@@ -2125,7 +2126,7 @@
         </w:tc>
         <w:tc>
           <w:tcPr>
-            <w:tcW w:type="dxa" w:w="720"/>
+            <w:tcW w:type="dxa" w:w="736"/>
             <w:tcBorders>
               <w:top w:val="single" w:sz="6" w:space="0" w:color="E4E4E4"/>
               <w:left w:val="single" w:sz="6" w:space="0" w:color="E4E4E4"/>
@@ -2135,10 +2136,10 @@
               <w:insideV w:val="single" w:sz="6" w:space="0" w:color="E4E4E4"/>
             </w:tcBorders>
             <w:tcMar>
-              <w:top w:w="45" w:type="dxa"/>
-              <w:start w:w="95" w:type="dxa"/>
-              <w:bottom w:w="45" w:type="dxa"/>
-              <w:end w:w="95" w:type="dxa"/>
+              <w:top w:w="85" w:type="dxa"/>
+              <w:start w:w="120" w:type="dxa"/>
+              <w:bottom w:w="85" w:type="dxa"/>
+              <w:end w:w="120" w:type="dxa"/>
             </w:tcMar>
             <w:vAlign w:val="center"/>
           </w:tcPr>
@@ -2159,7 +2160,7 @@
         </w:tc>
         <w:tc>
           <w:tcPr>
-            <w:tcW w:type="dxa" w:w="1224"/>
+            <w:tcW w:type="dxa" w:w="1252"/>
             <w:tcBorders>
               <w:top w:val="single" w:sz="6" w:space="0" w:color="E4E4E4"/>
               <w:left w:val="single" w:sz="6" w:space="0" w:color="E4E4E4"/>
@@ -2169,10 +2170,10 @@
               <w:insideV w:val="single" w:sz="6" w:space="0" w:color="E4E4E4"/>
             </w:tcBorders>
             <w:tcMar>
-              <w:top w:w="45" w:type="dxa"/>
-              <w:start w:w="95" w:type="dxa"/>
-              <w:bottom w:w="45" w:type="dxa"/>
-              <w:end w:w="95" w:type="dxa"/>
+              <w:top w:w="85" w:type="dxa"/>
+              <w:start w:w="120" w:type="dxa"/>
+              <w:bottom w:w="85" w:type="dxa"/>
+              <w:end w:w="120" w:type="dxa"/>
             </w:tcMar>
             <w:vAlign w:val="center"/>
           </w:tcPr>
@@ -2193,7 +2194,7 @@
         </w:tc>
         <w:tc>
           <w:tcPr>
-            <w:tcW w:type="dxa" w:w="1584"/>
+            <w:tcW w:type="dxa" w:w="1620"/>
             <w:tcBorders>
               <w:top w:val="single" w:sz="6" w:space="0" w:color="E4E4E4"/>
               <w:left w:val="single" w:sz="6" w:space="0" w:color="E4E4E4"/>
@@ -2203,10 +2204,10 @@
               <w:insideV w:val="single" w:sz="6" w:space="0" w:color="E4E4E4"/>
             </w:tcBorders>
             <w:tcMar>
-              <w:top w:w="45" w:type="dxa"/>
-              <w:start w:w="95" w:type="dxa"/>
-              <w:bottom w:w="45" w:type="dxa"/>
-              <w:end w:w="95" w:type="dxa"/>
+              <w:top w:w="85" w:type="dxa"/>
+              <w:start w:w="120" w:type="dxa"/>
+              <w:bottom w:w="85" w:type="dxa"/>
+              <w:end w:w="120" w:type="dxa"/>
             </w:tcMar>
             <w:vAlign w:val="center"/>
           </w:tcPr>
@@ -2231,6 +2232,7 @@
     <w:p>
       <w:pPr>
         <w:pStyle w:val="Heading2"/>
+        <w:pageBreakBefore/>
       </w:pPr>
       <w:r>
         <w:t>2. Payment Schedule</w:t>
@@ -2244,9 +2246,9 @@
         <w:tblLook w:firstColumn="1" w:firstRow="1" w:lastColumn="0" w:lastRow="0" w:noHBand="0" w:noVBand="1" w:val="04A0"/>
       </w:tblPr>
       <w:tblGrid>
-        <w:gridCol w:w="3389"/>
-        <w:gridCol w:w="3389"/>
-        <w:gridCol w:w="3389"/>
+        <w:gridCol w:w="1973"/>
+        <w:gridCol w:w="3435"/>
+        <w:gridCol w:w="4384"/>
       </w:tblGrid>
       <w:tr>
         <w:trPr>
@@ -2254,7 +2256,7 @@
         </w:trPr>
         <w:tc>
           <w:tcPr>
-            <w:tcW w:type="dxa" w:w="1944"/>
+            <w:tcW w:type="dxa" w:w="1973"/>
             <w:shd w:fill="FDEAF1"/>
             <w:tcBorders>
               <w:top w:val="single" w:sz="6" w:space="0" w:color="E4E4E4"/>
@@ -2265,10 +2267,10 @@
               <w:insideV w:val="single" w:sz="6" w:space="0" w:color="E4E4E4"/>
             </w:tcBorders>
             <w:tcMar>
-              <w:top w:w="45" w:type="dxa"/>
-              <w:start w:w="95" w:type="dxa"/>
-              <w:bottom w:w="45" w:type="dxa"/>
-              <w:end w:w="95" w:type="dxa"/>
+              <w:top w:w="85" w:type="dxa"/>
+              <w:start w:w="120" w:type="dxa"/>
+              <w:bottom w:w="85" w:type="dxa"/>
+              <w:end w:w="120" w:type="dxa"/>
             </w:tcMar>
             <w:vAlign w:val="center"/>
           </w:tcPr>
@@ -2290,7 +2292,7 @@
         </w:tc>
         <w:tc>
           <w:tcPr>
-            <w:tcW w:type="dxa" w:w="3384"/>
+            <w:tcW w:type="dxa" w:w="3435"/>
             <w:shd w:fill="FDEAF1"/>
             <w:tcBorders>
               <w:top w:val="single" w:sz="6" w:space="0" w:color="E4E4E4"/>
@@ -2301,10 +2303,10 @@
               <w:insideV w:val="single" w:sz="6" w:space="0" w:color="E4E4E4"/>
             </w:tcBorders>
             <w:tcMar>
-              <w:top w:w="45" w:type="dxa"/>
-              <w:start w:w="95" w:type="dxa"/>
-              <w:bottom w:w="45" w:type="dxa"/>
-              <w:end w:w="95" w:type="dxa"/>
+              <w:top w:w="85" w:type="dxa"/>
+              <w:start w:w="120" w:type="dxa"/>
+              <w:bottom w:w="85" w:type="dxa"/>
+              <w:end w:w="120" w:type="dxa"/>
             </w:tcMar>
             <w:vAlign w:val="center"/>
           </w:tcPr>
@@ -2326,7 +2328,7 @@
         </w:tc>
         <w:tc>
           <w:tcPr>
-            <w:tcW w:type="dxa" w:w="4320"/>
+            <w:tcW w:type="dxa" w:w="4384"/>
             <w:shd w:fill="FDEAF1"/>
             <w:tcBorders>
               <w:top w:val="single" w:sz="6" w:space="0" w:color="E4E4E4"/>
@@ -2337,10 +2339,10 @@
               <w:insideV w:val="single" w:sz="6" w:space="0" w:color="E4E4E4"/>
             </w:tcBorders>
             <w:tcMar>
-              <w:top w:w="45" w:type="dxa"/>
-              <w:start w:w="95" w:type="dxa"/>
-              <w:bottom w:w="45" w:type="dxa"/>
-              <w:end w:w="95" w:type="dxa"/>
+              <w:top w:w="85" w:type="dxa"/>
+              <w:start w:w="120" w:type="dxa"/>
+              <w:bottom w:w="85" w:type="dxa"/>
+              <w:end w:w="120" w:type="dxa"/>
             </w:tcMar>
             <w:vAlign w:val="center"/>
           </w:tcPr>
@@ -2367,7 +2369,7 @@
         </w:trPr>
         <w:tc>
           <w:tcPr>
-            <w:tcW w:type="dxa" w:w="1944"/>
+            <w:tcW w:type="dxa" w:w="1973"/>
             <w:tcBorders>
               <w:top w:val="single" w:sz="6" w:space="0" w:color="E4E4E4"/>
               <w:left w:val="single" w:sz="6" w:space="0" w:color="E4E4E4"/>
@@ -2377,10 +2379,10 @@
               <w:insideV w:val="single" w:sz="6" w:space="0" w:color="E4E4E4"/>
             </w:tcBorders>
             <w:tcMar>
-              <w:top w:w="45" w:type="dxa"/>
-              <w:start w:w="95" w:type="dxa"/>
-              <w:bottom w:w="45" w:type="dxa"/>
-              <w:end w:w="95" w:type="dxa"/>
+              <w:top w:w="85" w:type="dxa"/>
+              <w:start w:w="120" w:type="dxa"/>
+              <w:bottom w:w="85" w:type="dxa"/>
+              <w:end w:w="120" w:type="dxa"/>
             </w:tcMar>
             <w:vAlign w:val="center"/>
           </w:tcPr>
@@ -2402,7 +2404,7 @@
         </w:tc>
         <w:tc>
           <w:tcPr>
-            <w:tcW w:type="dxa" w:w="3384"/>
+            <w:tcW w:type="dxa" w:w="3435"/>
             <w:tcBorders>
               <w:top w:val="single" w:sz="6" w:space="0" w:color="E4E4E4"/>
               <w:left w:val="single" w:sz="6" w:space="0" w:color="E4E4E4"/>
@@ -2412,10 +2414,10 @@
               <w:insideV w:val="single" w:sz="6" w:space="0" w:color="E4E4E4"/>
             </w:tcBorders>
             <w:tcMar>
-              <w:top w:w="45" w:type="dxa"/>
-              <w:start w:w="95" w:type="dxa"/>
-              <w:bottom w:w="45" w:type="dxa"/>
-              <w:end w:w="95" w:type="dxa"/>
+              <w:top w:w="85" w:type="dxa"/>
+              <w:start w:w="120" w:type="dxa"/>
+              <w:bottom w:w="85" w:type="dxa"/>
+              <w:end w:w="120" w:type="dxa"/>
             </w:tcMar>
             <w:vAlign w:val="center"/>
           </w:tcPr>
@@ -2437,7 +2439,7 @@
         </w:tc>
         <w:tc>
           <w:tcPr>
-            <w:tcW w:type="dxa" w:w="4320"/>
+            <w:tcW w:type="dxa" w:w="4384"/>
             <w:tcBorders>
               <w:top w:val="single" w:sz="6" w:space="0" w:color="E4E4E4"/>
               <w:left w:val="single" w:sz="6" w:space="0" w:color="E4E4E4"/>
@@ -2447,10 +2449,10 @@
               <w:insideV w:val="single" w:sz="6" w:space="0" w:color="E4E4E4"/>
             </w:tcBorders>
             <w:tcMar>
-              <w:top w:w="45" w:type="dxa"/>
-              <w:start w:w="95" w:type="dxa"/>
-              <w:bottom w:w="45" w:type="dxa"/>
-              <w:end w:w="95" w:type="dxa"/>
+              <w:top w:w="85" w:type="dxa"/>
+              <w:start w:w="120" w:type="dxa"/>
+              <w:bottom w:w="85" w:type="dxa"/>
+              <w:end w:w="120" w:type="dxa"/>
             </w:tcMar>
             <w:vAlign w:val="center"/>
           </w:tcPr>
@@ -2477,7 +2479,7 @@
         </w:trPr>
         <w:tc>
           <w:tcPr>
-            <w:tcW w:type="dxa" w:w="1944"/>
+            <w:tcW w:type="dxa" w:w="1973"/>
             <w:tcBorders>
               <w:top w:val="single" w:sz="6" w:space="0" w:color="E4E4E4"/>
               <w:left w:val="single" w:sz="6" w:space="0" w:color="E4E4E4"/>
@@ -2487,10 +2489,10 @@
               <w:insideV w:val="single" w:sz="6" w:space="0" w:color="E4E4E4"/>
             </w:tcBorders>
             <w:tcMar>
-              <w:top w:w="45" w:type="dxa"/>
-              <w:start w:w="95" w:type="dxa"/>
-              <w:bottom w:w="45" w:type="dxa"/>
-              <w:end w:w="95" w:type="dxa"/>
+              <w:top w:w="85" w:type="dxa"/>
+              <w:start w:w="120" w:type="dxa"/>
+              <w:bottom w:w="85" w:type="dxa"/>
+              <w:end w:w="120" w:type="dxa"/>
             </w:tcMar>
             <w:vAlign w:val="center"/>
           </w:tcPr>
@@ -2512,7 +2514,7 @@
         </w:tc>
         <w:tc>
           <w:tcPr>
-            <w:tcW w:type="dxa" w:w="3384"/>
+            <w:tcW w:type="dxa" w:w="3435"/>
             <w:tcBorders>
               <w:top w:val="single" w:sz="6" w:space="0" w:color="E4E4E4"/>
               <w:left w:val="single" w:sz="6" w:space="0" w:color="E4E4E4"/>
@@ -2522,10 +2524,10 @@
               <w:insideV w:val="single" w:sz="6" w:space="0" w:color="E4E4E4"/>
             </w:tcBorders>
             <w:tcMar>
-              <w:top w:w="45" w:type="dxa"/>
-              <w:start w:w="95" w:type="dxa"/>
-              <w:bottom w:w="45" w:type="dxa"/>
-              <w:end w:w="95" w:type="dxa"/>
+              <w:top w:w="85" w:type="dxa"/>
+              <w:start w:w="120" w:type="dxa"/>
+              <w:bottom w:w="85" w:type="dxa"/>
+              <w:end w:w="120" w:type="dxa"/>
             </w:tcMar>
             <w:vAlign w:val="center"/>
           </w:tcPr>
@@ -2547,7 +2549,7 @@
         </w:tc>
         <w:tc>
           <w:tcPr>
-            <w:tcW w:type="dxa" w:w="4320"/>
+            <w:tcW w:type="dxa" w:w="4384"/>
             <w:tcBorders>
               <w:top w:val="single" w:sz="6" w:space="0" w:color="E4E4E4"/>
               <w:left w:val="single" w:sz="6" w:space="0" w:color="E4E4E4"/>
@@ -2557,10 +2559,10 @@
               <w:insideV w:val="single" w:sz="6" w:space="0" w:color="E4E4E4"/>
             </w:tcBorders>
             <w:tcMar>
-              <w:top w:w="45" w:type="dxa"/>
-              <w:start w:w="95" w:type="dxa"/>
-              <w:bottom w:w="45" w:type="dxa"/>
-              <w:end w:w="95" w:type="dxa"/>
+              <w:top w:w="85" w:type="dxa"/>
+              <w:start w:w="120" w:type="dxa"/>
+              <w:bottom w:w="85" w:type="dxa"/>
+              <w:end w:w="120" w:type="dxa"/>
             </w:tcMar>
             <w:vAlign w:val="center"/>
           </w:tcPr>
@@ -2582,36 +2584,6 @@
         </w:tc>
       </w:tr>
     </w:tbl>
-    <w:p>
-      <w:pPr>
-        <w:widowControl/>
-      </w:pPr>
-      <w:r>
-        <w:rPr>
-          <w:i w:val="0"/>
-        </w:rPr>
-        <w:t>Payment method / invoice instructions: [Insert].</w:t>
-      </w:r>
-    </w:p>
-    <w:p>
-      <w:pPr>
-        <w:widowControl/>
-      </w:pPr>
-      <w:r>
-        <w:rPr>
-          <w:i w:val="0"/>
-        </w:rPr>
-        <w:t>Deposit treatment: [Select one] ☐ Refundable until Bloomjoy commits the order to production, less documented nonrecoverable costs. ☐ Nonrefundable upon receipt. ☐ Other: [Insert].</w:t>
-      </w:r>
-    </w:p>
-    <w:p>
-      <w:pPr>
-        <w:pStyle w:val="Heading2"/>
-      </w:pPr>
-      <w:r>
-        <w:t>3. Delivery and Commissioning</w:t>
-      </w:r>
-    </w:p>
     <w:tbl>
       <w:tblPr>
         <w:tblW w:type="auto" w:w="0"/>
@@ -2620,8 +2592,8 @@
         <w:tblLook w:firstColumn="1" w:firstRow="1" w:lastColumn="0" w:lastRow="0" w:noHBand="0" w:noVBand="1" w:val="04A0"/>
       </w:tblPr>
       <w:tblGrid>
-        <w:gridCol w:w="5083"/>
-        <w:gridCol w:w="5083"/>
+        <w:gridCol w:w="2880"/>
+        <w:gridCol w:w="6912"/>
       </w:tblGrid>
       <w:tr>
         <w:trPr>
@@ -2641,10 +2613,117 @@
               <w:insideV w:val="single" w:sz="6" w:space="0" w:color="E4E4E4"/>
             </w:tcBorders>
             <w:tcMar>
-              <w:top w:w="45" w:type="dxa"/>
-              <w:start w:w="95" w:type="dxa"/>
-              <w:bottom w:w="45" w:type="dxa"/>
-              <w:end w:w="95" w:type="dxa"/>
+              <w:top w:w="85" w:type="dxa"/>
+              <w:start w:w="120" w:type="dxa"/>
+              <w:bottom w:w="85" w:type="dxa"/>
+              <w:end w:w="120" w:type="dxa"/>
+            </w:tcMar>
+          </w:tcPr>
+          <w:p>
+            <w:pPr>
+              <w:spacing w:after="0" w:line="240" w:lineRule="auto"/>
+            </w:pPr>
+            <w:r/>
+            <w:r>
+              <w:rPr>
+                <w:rFonts w:ascii="Arial" w:hAnsi="Arial"/>
+                <w:b/>
+                <w:color w:val="202020"/>
+                <w:sz w:val="18"/>
+              </w:rPr>
+              <w:t>Payment / invoice instructions</w:t>
+            </w:r>
+          </w:p>
+        </w:tc>
+        <w:tc>
+          <w:tcPr>
+            <w:tcW w:type="dxa" w:w="6912"/>
+            <w:vAlign w:val="center"/>
+            <w:tcBorders>
+              <w:top w:val="single" w:sz="6" w:space="0" w:color="E4E4E4"/>
+              <w:left w:val="single" w:sz="6" w:space="0" w:color="E4E4E4"/>
+              <w:bottom w:val="single" w:sz="6" w:space="0" w:color="E4E4E4"/>
+              <w:right w:val="single" w:sz="6" w:space="0" w:color="E4E4E4"/>
+              <w:insideH w:val="single" w:sz="6" w:space="0" w:color="E4E4E4"/>
+              <w:insideV w:val="single" w:sz="6" w:space="0" w:color="E4E4E4"/>
+            </w:tcBorders>
+            <w:tcMar>
+              <w:top w:w="85" w:type="dxa"/>
+              <w:start w:w="120" w:type="dxa"/>
+              <w:bottom w:w="85" w:type="dxa"/>
+              <w:end w:w="120" w:type="dxa"/>
+            </w:tcMar>
+          </w:tcPr>
+          <w:p>
+            <w:pPr>
+              <w:spacing w:after="0" w:line="240" w:lineRule="auto"/>
+            </w:pPr>
+            <w:r/>
+            <w:r>
+              <w:rPr>
+                <w:rFonts w:ascii="Arial" w:hAnsi="Arial"/>
+                <w:b w:val="0"/>
+                <w:color w:val="202020"/>
+                <w:sz w:val="18"/>
+              </w:rPr>
+              <w:t>[Insert payment method and invoice instructions]</w:t>
+            </w:r>
+          </w:p>
+        </w:tc>
+      </w:tr>
+    </w:tbl>
+    <w:p>
+      <w:pPr>
+        <w:widowControl/>
+      </w:pPr>
+      <w:r>
+        <w:rPr>
+          <w:i w:val="0"/>
+        </w:rPr>
+        <w:t>Deposit treatment — select one: ☐ Refundable until Bloomjoy commits the order to production, less documented nonrecoverable costs. ☐ Nonrefundable upon receipt. ☐ Other: [Describe other treatment].</w:t>
+      </w:r>
+    </w:p>
+    <w:p>
+      <w:pPr>
+        <w:pStyle w:val="Heading2"/>
+      </w:pPr>
+      <w:r>
+        <w:t>3. Delivery and Commissioning</w:t>
+      </w:r>
+    </w:p>
+    <w:tbl>
+      <w:tblPr>
+        <w:tblW w:type="auto" w:w="0"/>
+        <w:jc w:val="center"/>
+        <w:tblLayout w:type="fixed"/>
+        <w:tblLook w:firstColumn="1" w:firstRow="1" w:lastColumn="0" w:lastRow="0" w:noHBand="0" w:noVBand="1" w:val="04A0"/>
+      </w:tblPr>
+      <w:tblGrid>
+        <w:gridCol w:w="2880"/>
+        <w:gridCol w:w="6912"/>
+      </w:tblGrid>
+      <w:tr>
+        <w:trPr>
+          <w:cantSplit/>
+        </w:trPr>
+        <w:tc>
+          <w:tcPr>
+            <w:tcW w:type="dxa" w:w="2880"/>
+            <w:shd w:fill="F6F6F6"/>
+            <w:vAlign w:val="center"/>
+            <w:tcBorders>
+              <w:top w:val="single" w:sz="6" w:space="0" w:color="E4E4E4"/>
+              <w:left w:val="single" w:sz="6" w:space="0" w:color="E4E4E4"/>
+              <w:bottom w:val="single" w:sz="6" w:space="0" w:color="E4E4E4"/>
+              <w:right w:val="single" w:sz="6" w:space="0" w:color="E4E4E4"/>
+              <w:insideH w:val="single" w:sz="6" w:space="0" w:color="E4E4E4"/>
+              <w:insideV w:val="single" w:sz="6" w:space="0" w:color="E4E4E4"/>
+            </w:tcBorders>
+            <w:tcMar>
+              <w:top w:w="85" w:type="dxa"/>
+              <w:start w:w="120" w:type="dxa"/>
+              <w:bottom w:w="85" w:type="dxa"/>
+              <w:end w:w="120" w:type="dxa"/>
             </w:tcMar>
           </w:tcPr>
           <w:p>
@@ -2676,10 +2755,10 @@
               <w:insideV w:val="single" w:sz="6" w:space="0" w:color="E4E4E4"/>
             </w:tcBorders>
             <w:tcMar>
-              <w:top w:w="45" w:type="dxa"/>
-              <w:start w:w="95" w:type="dxa"/>
-              <w:bottom w:w="45" w:type="dxa"/>
-              <w:end w:w="95" w:type="dxa"/>
+              <w:top w:w="85" w:type="dxa"/>
+              <w:start w:w="120" w:type="dxa"/>
+              <w:bottom w:w="85" w:type="dxa"/>
+              <w:end w:w="120" w:type="dxa"/>
             </w:tcMar>
           </w:tcPr>
           <w:p>
@@ -2717,10 +2796,10 @@
               <w:insideV w:val="single" w:sz="6" w:space="0" w:color="E4E4E4"/>
             </w:tcBorders>
             <w:tcMar>
-              <w:top w:w="45" w:type="dxa"/>
-              <w:start w:w="95" w:type="dxa"/>
-              <w:bottom w:w="45" w:type="dxa"/>
-              <w:end w:w="95" w:type="dxa"/>
+              <w:top w:w="85" w:type="dxa"/>
+              <w:start w:w="120" w:type="dxa"/>
+              <w:bottom w:w="85" w:type="dxa"/>
+              <w:end w:w="120" w:type="dxa"/>
             </w:tcMar>
           </w:tcPr>
           <w:p>
@@ -2752,10 +2831,10 @@
               <w:insideV w:val="single" w:sz="6" w:space="0" w:color="E4E4E4"/>
             </w:tcBorders>
             <w:tcMar>
-              <w:top w:w="45" w:type="dxa"/>
-              <w:start w:w="95" w:type="dxa"/>
-              <w:bottom w:w="45" w:type="dxa"/>
-              <w:end w:w="95" w:type="dxa"/>
+              <w:top w:w="85" w:type="dxa"/>
+              <w:start w:w="120" w:type="dxa"/>
+              <w:bottom w:w="85" w:type="dxa"/>
+              <w:end w:w="120" w:type="dxa"/>
             </w:tcMar>
           </w:tcPr>
           <w:p>
@@ -2793,10 +2872,10 @@
               <w:insideV w:val="single" w:sz="6" w:space="0" w:color="E4E4E4"/>
             </w:tcBorders>
             <w:tcMar>
-              <w:top w:w="45" w:type="dxa"/>
-              <w:start w:w="95" w:type="dxa"/>
-              <w:bottom w:w="45" w:type="dxa"/>
-              <w:end w:w="95" w:type="dxa"/>
+              <w:top w:w="85" w:type="dxa"/>
+              <w:start w:w="120" w:type="dxa"/>
+              <w:bottom w:w="85" w:type="dxa"/>
+              <w:end w:w="120" w:type="dxa"/>
             </w:tcMar>
           </w:tcPr>
           <w:p>
@@ -2828,10 +2907,10 @@
               <w:insideV w:val="single" w:sz="6" w:space="0" w:color="E4E4E4"/>
             </w:tcBorders>
             <w:tcMar>
-              <w:top w:w="45" w:type="dxa"/>
-              <w:start w:w="95" w:type="dxa"/>
-              <w:bottom w:w="45" w:type="dxa"/>
-              <w:end w:w="95" w:type="dxa"/>
+              <w:top w:w="85" w:type="dxa"/>
+              <w:start w:w="120" w:type="dxa"/>
+              <w:bottom w:w="85" w:type="dxa"/>
+              <w:end w:w="120" w:type="dxa"/>
             </w:tcMar>
           </w:tcPr>
           <w:p>
@@ -2869,10 +2948,10 @@
               <w:insideV w:val="single" w:sz="6" w:space="0" w:color="E4E4E4"/>
             </w:tcBorders>
             <w:tcMar>
-              <w:top w:w="45" w:type="dxa"/>
-              <w:start w:w="95" w:type="dxa"/>
-              <w:bottom w:w="45" w:type="dxa"/>
-              <w:end w:w="95" w:type="dxa"/>
+              <w:top w:w="85" w:type="dxa"/>
+              <w:start w:w="120" w:type="dxa"/>
+              <w:bottom w:w="85" w:type="dxa"/>
+              <w:end w:w="120" w:type="dxa"/>
             </w:tcMar>
           </w:tcPr>
           <w:p>
@@ -2904,10 +2983,10 @@
               <w:insideV w:val="single" w:sz="6" w:space="0" w:color="E4E4E4"/>
             </w:tcBorders>
             <w:tcMar>
-              <w:top w:w="45" w:type="dxa"/>
-              <w:start w:w="95" w:type="dxa"/>
-              <w:bottom w:w="45" w:type="dxa"/>
-              <w:end w:w="95" w:type="dxa"/>
+              <w:top w:w="85" w:type="dxa"/>
+              <w:start w:w="120" w:type="dxa"/>
+              <w:bottom w:w="85" w:type="dxa"/>
+              <w:end w:w="120" w:type="dxa"/>
             </w:tcMar>
           </w:tcPr>
           <w:p>
@@ -2945,10 +3024,10 @@
               <w:insideV w:val="single" w:sz="6" w:space="0" w:color="E4E4E4"/>
             </w:tcBorders>
             <w:tcMar>
-              <w:top w:w="45" w:type="dxa"/>
-              <w:start w:w="95" w:type="dxa"/>
-              <w:bottom w:w="45" w:type="dxa"/>
-              <w:end w:w="95" w:type="dxa"/>
+              <w:top w:w="85" w:type="dxa"/>
+              <w:start w:w="120" w:type="dxa"/>
+              <w:bottom w:w="85" w:type="dxa"/>
+              <w:end w:w="120" w:type="dxa"/>
             </w:tcMar>
           </w:tcPr>
           <w:p>
@@ -2980,10 +3059,10 @@
               <w:insideV w:val="single" w:sz="6" w:space="0" w:color="E4E4E4"/>
             </w:tcBorders>
             <w:tcMar>
-              <w:top w:w="45" w:type="dxa"/>
-              <w:start w:w="95" w:type="dxa"/>
-              <w:bottom w:w="45" w:type="dxa"/>
-              <w:end w:w="95" w:type="dxa"/>
+              <w:top w:w="85" w:type="dxa"/>
+              <w:start w:w="120" w:type="dxa"/>
+              <w:bottom w:w="85" w:type="dxa"/>
+              <w:end w:w="120" w:type="dxa"/>
             </w:tcMar>
           </w:tcPr>
           <w:p>
@@ -3021,10 +3100,10 @@
               <w:insideV w:val="single" w:sz="6" w:space="0" w:color="E4E4E4"/>
             </w:tcBorders>
             <w:tcMar>
-              <w:top w:w="45" w:type="dxa"/>
-              <w:start w:w="95" w:type="dxa"/>
-              <w:bottom w:w="45" w:type="dxa"/>
-              <w:end w:w="95" w:type="dxa"/>
+              <w:top w:w="85" w:type="dxa"/>
+              <w:start w:w="120" w:type="dxa"/>
+              <w:bottom w:w="85" w:type="dxa"/>
+              <w:end w:w="120" w:type="dxa"/>
             </w:tcMar>
           </w:tcPr>
           <w:p>
@@ -3056,10 +3135,10 @@
               <w:insideV w:val="single" w:sz="6" w:space="0" w:color="E4E4E4"/>
             </w:tcBorders>
             <w:tcMar>
-              <w:top w:w="45" w:type="dxa"/>
-              <w:start w:w="95" w:type="dxa"/>
-              <w:bottom w:w="45" w:type="dxa"/>
-              <w:end w:w="95" w:type="dxa"/>
+              <w:top w:w="85" w:type="dxa"/>
+              <w:start w:w="120" w:type="dxa"/>
+              <w:bottom w:w="85" w:type="dxa"/>
+              <w:end w:w="120" w:type="dxa"/>
             </w:tcMar>
           </w:tcPr>
           <w:p>
@@ -3097,10 +3176,10 @@
               <w:insideV w:val="single" w:sz="6" w:space="0" w:color="E4E4E4"/>
             </w:tcBorders>
             <w:tcMar>
-              <w:top w:w="45" w:type="dxa"/>
-              <w:start w:w="95" w:type="dxa"/>
-              <w:bottom w:w="45" w:type="dxa"/>
-              <w:end w:w="95" w:type="dxa"/>
+              <w:top w:w="85" w:type="dxa"/>
+              <w:start w:w="120" w:type="dxa"/>
+              <w:bottom w:w="85" w:type="dxa"/>
+              <w:end w:w="120" w:type="dxa"/>
             </w:tcMar>
           </w:tcPr>
           <w:p>
@@ -3132,10 +3211,10 @@
               <w:insideV w:val="single" w:sz="6" w:space="0" w:color="E4E4E4"/>
             </w:tcBorders>
             <w:tcMar>
-              <w:top w:w="45" w:type="dxa"/>
-              <w:start w:w="95" w:type="dxa"/>
-              <w:bottom w:w="45" w:type="dxa"/>
-              <w:end w:w="95" w:type="dxa"/>
+              <w:top w:w="85" w:type="dxa"/>
+              <w:start w:w="120" w:type="dxa"/>
+              <w:bottom w:w="85" w:type="dxa"/>
+              <w:end w:w="120" w:type="dxa"/>
             </w:tcMar>
           </w:tcPr>
           <w:p>
@@ -3172,8 +3251,8 @@
         <w:tblLook w:firstColumn="1" w:firstRow="1" w:lastColumn="0" w:lastRow="0" w:noHBand="0" w:noVBand="1" w:val="04A0"/>
       </w:tblPr>
       <w:tblGrid>
-        <w:gridCol w:w="5083"/>
-        <w:gridCol w:w="5083"/>
+        <w:gridCol w:w="2880"/>
+        <w:gridCol w:w="6912"/>
       </w:tblGrid>
       <w:tr>
         <w:trPr>
@@ -3193,10 +3272,10 @@
               <w:insideV w:val="single" w:sz="6" w:space="0" w:color="E4E4E4"/>
             </w:tcBorders>
             <w:tcMar>
-              <w:top w:w="45" w:type="dxa"/>
-              <w:start w:w="95" w:type="dxa"/>
-              <w:bottom w:w="45" w:type="dxa"/>
-              <w:end w:w="95" w:type="dxa"/>
+              <w:top w:w="85" w:type="dxa"/>
+              <w:start w:w="120" w:type="dxa"/>
+              <w:bottom w:w="85" w:type="dxa"/>
+              <w:end w:w="120" w:type="dxa"/>
             </w:tcMar>
           </w:tcPr>
           <w:p>
@@ -3228,10 +3307,10 @@
               <w:insideV w:val="single" w:sz="6" w:space="0" w:color="E4E4E4"/>
             </w:tcBorders>
             <w:tcMar>
-              <w:top w:w="45" w:type="dxa"/>
-              <w:start w:w="95" w:type="dxa"/>
-              <w:bottom w:w="45" w:type="dxa"/>
-              <w:end w:w="95" w:type="dxa"/>
+              <w:top w:w="85" w:type="dxa"/>
+              <w:start w:w="120" w:type="dxa"/>
+              <w:bottom w:w="85" w:type="dxa"/>
+              <w:end w:w="120" w:type="dxa"/>
             </w:tcMar>
           </w:tcPr>
           <w:p>
@@ -3269,10 +3348,10 @@
               <w:insideV w:val="single" w:sz="6" w:space="0" w:color="E4E4E4"/>
             </w:tcBorders>
             <w:tcMar>
-              <w:top w:w="45" w:type="dxa"/>
-              <w:start w:w="95" w:type="dxa"/>
-              <w:bottom w:w="45" w:type="dxa"/>
-              <w:end w:w="95" w:type="dxa"/>
+              <w:top w:w="85" w:type="dxa"/>
+              <w:start w:w="120" w:type="dxa"/>
+              <w:bottom w:w="85" w:type="dxa"/>
+              <w:end w:w="120" w:type="dxa"/>
             </w:tcMar>
           </w:tcPr>
           <w:p>
@@ -3304,10 +3383,10 @@
               <w:insideV w:val="single" w:sz="6" w:space="0" w:color="E4E4E4"/>
             </w:tcBorders>
             <w:tcMar>
-              <w:top w:w="45" w:type="dxa"/>
-              <w:start w:w="95" w:type="dxa"/>
-              <w:bottom w:w="45" w:type="dxa"/>
-              <w:end w:w="95" w:type="dxa"/>
+              <w:top w:w="85" w:type="dxa"/>
+              <w:start w:w="120" w:type="dxa"/>
+              <w:bottom w:w="85" w:type="dxa"/>
+              <w:end w:w="120" w:type="dxa"/>
             </w:tcMar>
           </w:tcPr>
           <w:p>
@@ -3345,10 +3424,10 @@
               <w:insideV w:val="single" w:sz="6" w:space="0" w:color="E4E4E4"/>
             </w:tcBorders>
             <w:tcMar>
-              <w:top w:w="45" w:type="dxa"/>
-              <w:start w:w="95" w:type="dxa"/>
-              <w:bottom w:w="45" w:type="dxa"/>
-              <w:end w:w="95" w:type="dxa"/>
+              <w:top w:w="85" w:type="dxa"/>
+              <w:start w:w="120" w:type="dxa"/>
+              <w:bottom w:w="85" w:type="dxa"/>
+              <w:end w:w="120" w:type="dxa"/>
             </w:tcMar>
           </w:tcPr>
           <w:p>
@@ -3380,10 +3459,10 @@
               <w:insideV w:val="single" w:sz="6" w:space="0" w:color="E4E4E4"/>
             </w:tcBorders>
             <w:tcMar>
-              <w:top w:w="45" w:type="dxa"/>
-              <w:start w:w="95" w:type="dxa"/>
-              <w:bottom w:w="45" w:type="dxa"/>
-              <w:end w:w="95" w:type="dxa"/>
+              <w:top w:w="85" w:type="dxa"/>
+              <w:start w:w="120" w:type="dxa"/>
+              <w:bottom w:w="85" w:type="dxa"/>
+              <w:end w:w="120" w:type="dxa"/>
             </w:tcMar>
           </w:tcPr>
           <w:p>
@@ -3421,10 +3500,10 @@
               <w:insideV w:val="single" w:sz="6" w:space="0" w:color="E4E4E4"/>
             </w:tcBorders>
             <w:tcMar>
-              <w:top w:w="45" w:type="dxa"/>
-              <w:start w:w="95" w:type="dxa"/>
-              <w:bottom w:w="45" w:type="dxa"/>
-              <w:end w:w="95" w:type="dxa"/>
+              <w:top w:w="85" w:type="dxa"/>
+              <w:start w:w="120" w:type="dxa"/>
+              <w:bottom w:w="85" w:type="dxa"/>
+              <w:end w:w="120" w:type="dxa"/>
             </w:tcMar>
           </w:tcPr>
           <w:p>
@@ -3456,10 +3535,10 @@
               <w:insideV w:val="single" w:sz="6" w:space="0" w:color="E4E4E4"/>
             </w:tcBorders>
             <w:tcMar>
-              <w:top w:w="45" w:type="dxa"/>
-              <w:start w:w="95" w:type="dxa"/>
-              <w:bottom w:w="45" w:type="dxa"/>
-              <w:end w:w="95" w:type="dxa"/>
+              <w:top w:w="85" w:type="dxa"/>
+              <w:start w:w="120" w:type="dxa"/>
+              <w:bottom w:w="85" w:type="dxa"/>
+              <w:end w:w="120" w:type="dxa"/>
             </w:tcMar>
           </w:tcPr>
           <w:p>
@@ -3497,10 +3576,10 @@
               <w:insideV w:val="single" w:sz="6" w:space="0" w:color="E4E4E4"/>
             </w:tcBorders>
             <w:tcMar>
-              <w:top w:w="45" w:type="dxa"/>
-              <w:start w:w="95" w:type="dxa"/>
-              <w:bottom w:w="45" w:type="dxa"/>
-              <w:end w:w="95" w:type="dxa"/>
+              <w:top w:w="85" w:type="dxa"/>
+              <w:start w:w="120" w:type="dxa"/>
+              <w:bottom w:w="85" w:type="dxa"/>
+              <w:end w:w="120" w:type="dxa"/>
             </w:tcMar>
           </w:tcPr>
           <w:p>
@@ -3532,10 +3611,10 @@
               <w:insideV w:val="single" w:sz="6" w:space="0" w:color="E4E4E4"/>
             </w:tcBorders>
             <w:tcMar>
-              <w:top w:w="45" w:type="dxa"/>
-              <w:start w:w="95" w:type="dxa"/>
-              <w:bottom w:w="45" w:type="dxa"/>
-              <w:end w:w="95" w:type="dxa"/>
+              <w:top w:w="85" w:type="dxa"/>
+              <w:start w:w="120" w:type="dxa"/>
+              <w:bottom w:w="85" w:type="dxa"/>
+              <w:end w:w="120" w:type="dxa"/>
             </w:tcMar>
           </w:tcPr>
           <w:p>
@@ -3572,8 +3651,8 @@
         <w:tblLook w:firstColumn="1" w:firstRow="1" w:lastColumn="0" w:lastRow="0" w:noHBand="0" w:noVBand="1" w:val="04A0"/>
       </w:tblPr>
       <w:tblGrid>
-        <w:gridCol w:w="5083"/>
-        <w:gridCol w:w="5083"/>
+        <w:gridCol w:w="2880"/>
+        <w:gridCol w:w="6912"/>
       </w:tblGrid>
       <w:tr>
         <w:trPr>
@@ -3593,10 +3672,10 @@
               <w:insideV w:val="single" w:sz="6" w:space="0" w:color="E4E4E4"/>
             </w:tcBorders>
             <w:tcMar>
-              <w:top w:w="45" w:type="dxa"/>
-              <w:start w:w="95" w:type="dxa"/>
-              <w:bottom w:w="45" w:type="dxa"/>
-              <w:end w:w="95" w:type="dxa"/>
+              <w:top w:w="85" w:type="dxa"/>
+              <w:start w:w="120" w:type="dxa"/>
+              <w:bottom w:w="85" w:type="dxa"/>
+              <w:end w:w="120" w:type="dxa"/>
             </w:tcMar>
           </w:tcPr>
           <w:p>
@@ -3628,10 +3707,10 @@
               <w:insideV w:val="single" w:sz="6" w:space="0" w:color="E4E4E4"/>
             </w:tcBorders>
             <w:tcMar>
-              <w:top w:w="45" w:type="dxa"/>
-              <w:start w:w="95" w:type="dxa"/>
-              <w:bottom w:w="45" w:type="dxa"/>
-              <w:end w:w="95" w:type="dxa"/>
+              <w:top w:w="85" w:type="dxa"/>
+              <w:start w:w="120" w:type="dxa"/>
+              <w:bottom w:w="85" w:type="dxa"/>
+              <w:end w:w="120" w:type="dxa"/>
             </w:tcMar>
           </w:tcPr>
           <w:p>
@@ -3669,10 +3748,10 @@
               <w:insideV w:val="single" w:sz="6" w:space="0" w:color="E4E4E4"/>
             </w:tcBorders>
             <w:tcMar>
-              <w:top w:w="45" w:type="dxa"/>
-              <w:start w:w="95" w:type="dxa"/>
-              <w:bottom w:w="45" w:type="dxa"/>
-              <w:end w:w="95" w:type="dxa"/>
+              <w:top w:w="85" w:type="dxa"/>
+              <w:start w:w="120" w:type="dxa"/>
+              <w:bottom w:w="85" w:type="dxa"/>
+              <w:end w:w="120" w:type="dxa"/>
             </w:tcMar>
           </w:tcPr>
           <w:p>
@@ -3704,10 +3783,10 @@
               <w:insideV w:val="single" w:sz="6" w:space="0" w:color="E4E4E4"/>
             </w:tcBorders>
             <w:tcMar>
-              <w:top w:w="45" w:type="dxa"/>
-              <w:start w:w="95" w:type="dxa"/>
-              <w:bottom w:w="45" w:type="dxa"/>
-              <w:end w:w="95" w:type="dxa"/>
+              <w:top w:w="85" w:type="dxa"/>
+              <w:start w:w="120" w:type="dxa"/>
+              <w:bottom w:w="85" w:type="dxa"/>
+              <w:end w:w="120" w:type="dxa"/>
             </w:tcMar>
           </w:tcPr>
           <w:p>
@@ -3745,10 +3824,10 @@
               <w:insideV w:val="single" w:sz="6" w:space="0" w:color="E4E4E4"/>
             </w:tcBorders>
             <w:tcMar>
-              <w:top w:w="45" w:type="dxa"/>
-              <w:start w:w="95" w:type="dxa"/>
-              <w:bottom w:w="45" w:type="dxa"/>
-              <w:end w:w="95" w:type="dxa"/>
+              <w:top w:w="85" w:type="dxa"/>
+              <w:start w:w="120" w:type="dxa"/>
+              <w:bottom w:w="85" w:type="dxa"/>
+              <w:end w:w="120" w:type="dxa"/>
             </w:tcMar>
           </w:tcPr>
           <w:p>
@@ -3780,10 +3859,10 @@
               <w:insideV w:val="single" w:sz="6" w:space="0" w:color="E4E4E4"/>
             </w:tcBorders>
             <w:tcMar>
-              <w:top w:w="45" w:type="dxa"/>
-              <w:start w:w="95" w:type="dxa"/>
-              <w:bottom w:w="45" w:type="dxa"/>
-              <w:end w:w="95" w:type="dxa"/>
+              <w:top w:w="85" w:type="dxa"/>
+              <w:start w:w="120" w:type="dxa"/>
+              <w:bottom w:w="85" w:type="dxa"/>
+              <w:end w:w="120" w:type="dxa"/>
             </w:tcMar>
           </w:tcPr>
           <w:p>
@@ -3821,10 +3900,10 @@
               <w:insideV w:val="single" w:sz="6" w:space="0" w:color="E4E4E4"/>
             </w:tcBorders>
             <w:tcMar>
-              <w:top w:w="45" w:type="dxa"/>
-              <w:start w:w="95" w:type="dxa"/>
-              <w:bottom w:w="45" w:type="dxa"/>
-              <w:end w:w="95" w:type="dxa"/>
+              <w:top w:w="85" w:type="dxa"/>
+              <w:start w:w="120" w:type="dxa"/>
+              <w:bottom w:w="85" w:type="dxa"/>
+              <w:end w:w="120" w:type="dxa"/>
             </w:tcMar>
           </w:tcPr>
           <w:p>
@@ -3856,10 +3935,10 @@
               <w:insideV w:val="single" w:sz="6" w:space="0" w:color="E4E4E4"/>
             </w:tcBorders>
             <w:tcMar>
-              <w:top w:w="45" w:type="dxa"/>
-              <w:start w:w="95" w:type="dxa"/>
-              <w:bottom w:w="45" w:type="dxa"/>
-              <w:end w:w="95" w:type="dxa"/>
+              <w:top w:w="85" w:type="dxa"/>
+              <w:start w:w="120" w:type="dxa"/>
+              <w:bottom w:w="85" w:type="dxa"/>
+              <w:end w:w="120" w:type="dxa"/>
             </w:tcMar>
           </w:tcPr>
           <w:p>
@@ -3907,8 +3986,8 @@
         <w:tblLook w:firstColumn="1" w:firstRow="1" w:lastColumn="0" w:lastRow="0" w:noHBand="0" w:noVBand="1" w:val="04A0"/>
       </w:tblPr>
       <w:tblGrid>
-        <w:gridCol w:w="5083"/>
-        <w:gridCol w:w="5083"/>
+        <w:gridCol w:w="4896"/>
+        <w:gridCol w:w="4896"/>
       </w:tblGrid>
       <w:tr>
         <w:trPr>
@@ -3916,7 +3995,7 @@
         </w:trPr>
         <w:tc>
           <w:tcPr>
-            <w:tcW w:type="dxa" w:w="4824"/>
+            <w:tcW w:type="dxa" w:w="4896"/>
             <w:tcMar>
               <w:top w:w="25" w:type="dxa"/>
               <w:start w:w="70" w:type="dxa"/>
@@ -3943,7 +4022,7 @@
         </w:tc>
         <w:tc>
           <w:tcPr>
-            <w:tcW w:type="dxa" w:w="4824"/>
+            <w:tcW w:type="dxa" w:w="4896"/>
             <w:tcMar>
               <w:top w:w="25" w:type="dxa"/>
               <w:start w:w="70" w:type="dxa"/>
@@ -3975,7 +4054,7 @@
         </w:trPr>
         <w:tc>
           <w:tcPr>
-            <w:tcW w:type="dxa" w:w="4824"/>
+            <w:tcW w:type="dxa" w:w="4896"/>
             <w:tcMar>
               <w:top w:w="25" w:type="dxa"/>
               <w:start w:w="70" w:type="dxa"/>
@@ -4002,7 +4081,7 @@
         </w:tc>
         <w:tc>
           <w:tcPr>
-            <w:tcW w:type="dxa" w:w="4824"/>
+            <w:tcW w:type="dxa" w:w="4896"/>
             <w:tcMar>
               <w:top w:w="25" w:type="dxa"/>
               <w:start w:w="70" w:type="dxa"/>
@@ -4034,7 +4113,7 @@
         </w:trPr>
         <w:tc>
           <w:tcPr>
-            <w:tcW w:type="dxa" w:w="4824"/>
+            <w:tcW w:type="dxa" w:w="4896"/>
             <w:tcMar>
               <w:top w:w="25" w:type="dxa"/>
               <w:start w:w="70" w:type="dxa"/>
@@ -4061,7 +4140,7 @@
         </w:tc>
         <w:tc>
           <w:tcPr>
-            <w:tcW w:type="dxa" w:w="4824"/>
+            <w:tcW w:type="dxa" w:w="4896"/>
             <w:tcMar>
               <w:top w:w="25" w:type="dxa"/>
               <w:start w:w="70" w:type="dxa"/>
@@ -4093,7 +4172,7 @@
         </w:trPr>
         <w:tc>
           <w:tcPr>
-            <w:tcW w:type="dxa" w:w="4824"/>
+            <w:tcW w:type="dxa" w:w="4896"/>
             <w:tcMar>
               <w:top w:w="25" w:type="dxa"/>
               <w:start w:w="70" w:type="dxa"/>
@@ -4120,7 +4199,7 @@
         </w:tc>
         <w:tc>
           <w:tcPr>
-            <w:tcW w:type="dxa" w:w="4824"/>
+            <w:tcW w:type="dxa" w:w="4896"/>
             <w:tcMar>
               <w:top w:w="25" w:type="dxa"/>
               <w:start w:w="70" w:type="dxa"/>
@@ -4152,7 +4231,7 @@
         </w:trPr>
         <w:tc>
           <w:tcPr>
-            <w:tcW w:type="dxa" w:w="4824"/>
+            <w:tcW w:type="dxa" w:w="4896"/>
             <w:tcMar>
               <w:top w:w="25" w:type="dxa"/>
               <w:start w:w="70" w:type="dxa"/>
@@ -4179,7 +4258,7 @@
         </w:tc>
         <w:tc>
           <w:tcPr>
-            <w:tcW w:type="dxa" w:w="4824"/>
+            <w:tcW w:type="dxa" w:w="4896"/>
             <w:tcMar>
               <w:top w:w="25" w:type="dxa"/>
               <w:start w:w="70" w:type="dxa"/>
@@ -4207,7 +4286,13 @@
       </w:tr>
     </w:tbl>
     <w:p>
+      <w:pPr>
+        <w:spacing w:before="0" w:after="0" w:lineRule="exact" w:line="20"/>
+      </w:pPr>
       <w:r>
+        <w:rPr>
+          <w:sz w:val="2"/>
+        </w:rPr>
         <w:br w:type="page"/>
       </w:r>
     </w:p>
@@ -4221,7 +4306,7 @@
     </w:p>
     <w:p>
       <w:pPr>
-        <w:keepLines w:val="0"/>
+        <w:keepLines/>
         <w:widowControl/>
       </w:pPr>
       <w:r>
@@ -4236,7 +4321,7 @@
     </w:p>
     <w:p>
       <w:pPr>
-        <w:keepLines w:val="0"/>
+        <w:keepLines/>
         <w:widowControl/>
       </w:pPr>
       <w:r>
@@ -4251,7 +4336,7 @@
     </w:p>
     <w:p>
       <w:pPr>
-        <w:keepLines w:val="0"/>
+        <w:keepLines/>
         <w:widowControl/>
       </w:pPr>
       <w:r>
@@ -4266,7 +4351,7 @@
     </w:p>
     <w:p>
       <w:pPr>
-        <w:keepLines w:val="0"/>
+        <w:keepLines/>
         <w:widowControl/>
       </w:pPr>
       <w:r>
@@ -4281,7 +4366,7 @@
     </w:p>
     <w:p>
       <w:pPr>
-        <w:keepLines w:val="0"/>
+        <w:keepLines/>
         <w:widowControl/>
       </w:pPr>
       <w:r>
@@ -4296,7 +4381,7 @@
     </w:p>
     <w:p>
       <w:pPr>
-        <w:keepLines w:val="0"/>
+        <w:keepLines/>
         <w:widowControl/>
       </w:pPr>
       <w:r>
@@ -4311,7 +4396,7 @@
     </w:p>
     <w:p>
       <w:pPr>
-        <w:keepLines w:val="0"/>
+        <w:keepLines/>
         <w:widowControl/>
       </w:pPr>
       <w:r>
@@ -4325,13 +4410,19 @@
       </w:r>
     </w:p>
     <w:p>
+      <w:pPr>
+        <w:spacing w:before="0" w:after="0" w:lineRule="exact" w:line="20"/>
+      </w:pPr>
       <w:r>
+        <w:rPr>
+          <w:sz w:val="2"/>
+        </w:rPr>
         <w:br w:type="page"/>
       </w:r>
     </w:p>
     <w:p>
       <w:pPr>
-        <w:keepLines w:val="0"/>
+        <w:keepLines/>
         <w:widowControl/>
       </w:pPr>
       <w:r>
@@ -4346,7 +4437,7 @@
     </w:p>
     <w:p>
       <w:pPr>
-        <w:keepLines w:val="0"/>
+        <w:keepLines/>
         <w:widowControl/>
       </w:pPr>
       <w:r>
@@ -4361,7 +4452,7 @@
     </w:p>
     <w:p>
       <w:pPr>
-        <w:keepLines w:val="0"/>
+        <w:keepLines/>
         <w:widowControl/>
       </w:pPr>
       <w:r>
@@ -4376,7 +4467,7 @@
     </w:p>
     <w:p>
       <w:pPr>
-        <w:keepLines w:val="0"/>
+        <w:keepLines/>
         <w:widowControl/>
       </w:pPr>
       <w:r>
@@ -4391,7 +4482,7 @@
     </w:p>
     <w:p>
       <w:pPr>
-        <w:keepLines w:val="0"/>
+        <w:keepLines/>
         <w:widowControl/>
       </w:pPr>
       <w:r>
@@ -4406,7 +4497,7 @@
     </w:p>
     <w:p>
       <w:pPr>
-        <w:keepLines w:val="0"/>
+        <w:keepLines/>
         <w:widowControl/>
       </w:pPr>
       <w:r>
@@ -4421,7 +4512,7 @@
     </w:p>
     <w:p>
       <w:pPr>
-        <w:keepLines w:val="0"/>
+        <w:keepLines/>
         <w:widowControl/>
       </w:pPr>
       <w:r>
@@ -4435,13 +4526,19 @@
       </w:r>
     </w:p>
     <w:p>
+      <w:pPr>
+        <w:spacing w:before="0" w:after="0" w:lineRule="exact" w:line="20"/>
+      </w:pPr>
       <w:r>
+        <w:rPr>
+          <w:sz w:val="2"/>
+        </w:rPr>
         <w:br w:type="page"/>
       </w:r>
     </w:p>
     <w:p>
       <w:pPr>
-        <w:keepLines w:val="0"/>
+        <w:keepLines/>
         <w:widowControl/>
       </w:pPr>
       <w:r>
@@ -4456,7 +4553,7 @@
     </w:p>
     <w:p>
       <w:pPr>
-        <w:keepLines w:val="0"/>
+        <w:keepLines/>
         <w:widowControl/>
       </w:pPr>
       <w:r>
@@ -4471,7 +4568,7 @@
     </w:p>
     <w:p>
       <w:pPr>
-        <w:keepLines w:val="0"/>
+        <w:keepLines/>
         <w:widowControl/>
       </w:pPr>
       <w:r>
@@ -4486,7 +4583,7 @@
     </w:p>
     <w:p>
       <w:pPr>
-        <w:keepLines w:val="0"/>
+        <w:keepLines/>
         <w:widowControl/>
       </w:pPr>
       <w:r>
@@ -4501,7 +4598,7 @@
     </w:p>
     <w:p>
       <w:pPr>
-        <w:keepLines w:val="0"/>
+        <w:keepLines/>
         <w:widowControl/>
       </w:pPr>
       <w:r>
@@ -4516,7 +4613,7 @@
     </w:p>
     <w:p>
       <w:pPr>
-        <w:keepLines w:val="0"/>
+        <w:keepLines/>
         <w:widowControl/>
       </w:pPr>
       <w:r>
@@ -4530,7 +4627,13 @@
       </w:r>
     </w:p>
     <w:p>
+      <w:pPr>
+        <w:spacing w:before="0" w:after="0" w:lineRule="exact" w:line="20"/>
+      </w:pPr>
       <w:r>
+        <w:rPr>
+          <w:sz w:val="2"/>
+        </w:rPr>
         <w:br w:type="page"/>
       </w:r>
     </w:p>
@@ -4550,8 +4653,8 @@
         <w:tblLook w:firstColumn="1" w:firstRow="1" w:lastColumn="0" w:lastRow="0" w:noHBand="0" w:noVBand="1" w:val="04A0"/>
       </w:tblPr>
       <w:tblGrid>
-        <w:gridCol w:w="5083"/>
-        <w:gridCol w:w="5083"/>
+        <w:gridCol w:w="2880"/>
+        <w:gridCol w:w="6912"/>
       </w:tblGrid>
       <w:tr>
         <w:trPr>
@@ -4571,10 +4674,10 @@
               <w:insideV w:val="single" w:sz="6" w:space="0" w:color="E4E4E4"/>
             </w:tcBorders>
             <w:tcMar>
-              <w:top w:w="45" w:type="dxa"/>
-              <w:start w:w="95" w:type="dxa"/>
-              <w:bottom w:w="45" w:type="dxa"/>
-              <w:end w:w="95" w:type="dxa"/>
+              <w:top w:w="85" w:type="dxa"/>
+              <w:start w:w="120" w:type="dxa"/>
+              <w:bottom w:w="85" w:type="dxa"/>
+              <w:end w:w="120" w:type="dxa"/>
             </w:tcMar>
           </w:tcPr>
           <w:p>
@@ -4606,10 +4709,10 @@
               <w:insideV w:val="single" w:sz="6" w:space="0" w:color="E4E4E4"/>
             </w:tcBorders>
             <w:tcMar>
-              <w:top w:w="45" w:type="dxa"/>
-              <w:start w:w="95" w:type="dxa"/>
-              <w:bottom w:w="45" w:type="dxa"/>
-              <w:end w:w="95" w:type="dxa"/>
+              <w:top w:w="85" w:type="dxa"/>
+              <w:start w:w="120" w:type="dxa"/>
+              <w:bottom w:w="85" w:type="dxa"/>
+              <w:end w:w="120" w:type="dxa"/>
             </w:tcMar>
           </w:tcPr>
           <w:p>
@@ -4647,10 +4750,10 @@
               <w:insideV w:val="single" w:sz="6" w:space="0" w:color="E4E4E4"/>
             </w:tcBorders>
             <w:tcMar>
-              <w:top w:w="45" w:type="dxa"/>
-              <w:start w:w="95" w:type="dxa"/>
-              <w:bottom w:w="45" w:type="dxa"/>
-              <w:end w:w="95" w:type="dxa"/>
+              <w:top w:w="85" w:type="dxa"/>
+              <w:start w:w="120" w:type="dxa"/>
+              <w:bottom w:w="85" w:type="dxa"/>
+              <w:end w:w="120" w:type="dxa"/>
             </w:tcMar>
           </w:tcPr>
           <w:p>
@@ -4682,10 +4785,10 @@
               <w:insideV w:val="single" w:sz="6" w:space="0" w:color="E4E4E4"/>
             </w:tcBorders>
             <w:tcMar>
-              <w:top w:w="45" w:type="dxa"/>
-              <w:start w:w="95" w:type="dxa"/>
-              <w:bottom w:w="45" w:type="dxa"/>
-              <w:end w:w="95" w:type="dxa"/>
+              <w:top w:w="85" w:type="dxa"/>
+              <w:start w:w="120" w:type="dxa"/>
+              <w:bottom w:w="85" w:type="dxa"/>
+              <w:end w:w="120" w:type="dxa"/>
             </w:tcMar>
           </w:tcPr>
           <w:p>
@@ -4723,10 +4826,10 @@
               <w:insideV w:val="single" w:sz="6" w:space="0" w:color="E4E4E4"/>
             </w:tcBorders>
             <w:tcMar>
-              <w:top w:w="45" w:type="dxa"/>
-              <w:start w:w="95" w:type="dxa"/>
-              <w:bottom w:w="45" w:type="dxa"/>
-              <w:end w:w="95" w:type="dxa"/>
+              <w:top w:w="85" w:type="dxa"/>
+              <w:start w:w="120" w:type="dxa"/>
+              <w:bottom w:w="85" w:type="dxa"/>
+              <w:end w:w="120" w:type="dxa"/>
             </w:tcMar>
           </w:tcPr>
           <w:p>
@@ -4758,10 +4861,10 @@
               <w:insideV w:val="single" w:sz="6" w:space="0" w:color="E4E4E4"/>
             </w:tcBorders>
             <w:tcMar>
-              <w:top w:w="45" w:type="dxa"/>
-              <w:start w:w="95" w:type="dxa"/>
-              <w:bottom w:w="45" w:type="dxa"/>
-              <w:end w:w="95" w:type="dxa"/>
+              <w:top w:w="85" w:type="dxa"/>
+              <w:start w:w="120" w:type="dxa"/>
+              <w:bottom w:w="85" w:type="dxa"/>
+              <w:end w:w="120" w:type="dxa"/>
             </w:tcMar>
           </w:tcPr>
           <w:p>
@@ -4799,10 +4902,10 @@
               <w:insideV w:val="single" w:sz="6" w:space="0" w:color="E4E4E4"/>
             </w:tcBorders>
             <w:tcMar>
-              <w:top w:w="45" w:type="dxa"/>
-              <w:start w:w="95" w:type="dxa"/>
-              <w:bottom w:w="45" w:type="dxa"/>
-              <w:end w:w="95" w:type="dxa"/>
+              <w:top w:w="85" w:type="dxa"/>
+              <w:start w:w="120" w:type="dxa"/>
+              <w:bottom w:w="85" w:type="dxa"/>
+              <w:end w:w="120" w:type="dxa"/>
             </w:tcMar>
           </w:tcPr>
           <w:p>
@@ -4834,10 +4937,10 @@
               <w:insideV w:val="single" w:sz="6" w:space="0" w:color="E4E4E4"/>
             </w:tcBorders>
             <w:tcMar>
-              <w:top w:w="45" w:type="dxa"/>
-              <w:start w:w="95" w:type="dxa"/>
-              <w:bottom w:w="45" w:type="dxa"/>
-              <w:end w:w="95" w:type="dxa"/>
+              <w:top w:w="85" w:type="dxa"/>
+              <w:start w:w="120" w:type="dxa"/>
+              <w:bottom w:w="85" w:type="dxa"/>
+              <w:end w:w="120" w:type="dxa"/>
             </w:tcMar>
           </w:tcPr>
           <w:p>
@@ -4875,10 +4978,10 @@
               <w:insideV w:val="single" w:sz="6" w:space="0" w:color="E4E4E4"/>
             </w:tcBorders>
             <w:tcMar>
-              <w:top w:w="45" w:type="dxa"/>
-              <w:start w:w="95" w:type="dxa"/>
-              <w:bottom w:w="45" w:type="dxa"/>
-              <w:end w:w="95" w:type="dxa"/>
+              <w:top w:w="85" w:type="dxa"/>
+              <w:start w:w="120" w:type="dxa"/>
+              <w:bottom w:w="85" w:type="dxa"/>
+              <w:end w:w="120" w:type="dxa"/>
             </w:tcMar>
           </w:tcPr>
           <w:p>
@@ -4910,10 +5013,10 @@
               <w:insideV w:val="single" w:sz="6" w:space="0" w:color="E4E4E4"/>
             </w:tcBorders>
             <w:tcMar>
-              <w:top w:w="45" w:type="dxa"/>
-              <w:start w:w="95" w:type="dxa"/>
-              <w:bottom w:w="45" w:type="dxa"/>
-              <w:end w:w="95" w:type="dxa"/>
+              <w:top w:w="85" w:type="dxa"/>
+              <w:start w:w="120" w:type="dxa"/>
+              <w:bottom w:w="85" w:type="dxa"/>
+              <w:end w:w="120" w:type="dxa"/>
             </w:tcMar>
           </w:tcPr>
           <w:p>
@@ -4951,10 +5054,10 @@
               <w:insideV w:val="single" w:sz="6" w:space="0" w:color="E4E4E4"/>
             </w:tcBorders>
             <w:tcMar>
-              <w:top w:w="45" w:type="dxa"/>
-              <w:start w:w="95" w:type="dxa"/>
-              <w:bottom w:w="45" w:type="dxa"/>
-              <w:end w:w="95" w:type="dxa"/>
+              <w:top w:w="85" w:type="dxa"/>
+              <w:start w:w="120" w:type="dxa"/>
+              <w:bottom w:w="85" w:type="dxa"/>
+              <w:end w:w="120" w:type="dxa"/>
             </w:tcMar>
           </w:tcPr>
           <w:p>
@@ -4986,10 +5089,10 @@
               <w:insideV w:val="single" w:sz="6" w:space="0" w:color="E4E4E4"/>
             </w:tcBorders>
             <w:tcMar>
-              <w:top w:w="45" w:type="dxa"/>
-              <w:start w:w="95" w:type="dxa"/>
-              <w:bottom w:w="45" w:type="dxa"/>
-              <w:end w:w="95" w:type="dxa"/>
+              <w:top w:w="85" w:type="dxa"/>
+              <w:start w:w="120" w:type="dxa"/>
+              <w:bottom w:w="85" w:type="dxa"/>
+              <w:end w:w="120" w:type="dxa"/>
             </w:tcMar>
           </w:tcPr>
           <w:p>
@@ -5027,10 +5130,10 @@
               <w:insideV w:val="single" w:sz="6" w:space="0" w:color="E4E4E4"/>
             </w:tcBorders>
             <w:tcMar>
-              <w:top w:w="45" w:type="dxa"/>
-              <w:start w:w="95" w:type="dxa"/>
-              <w:bottom w:w="45" w:type="dxa"/>
-              <w:end w:w="95" w:type="dxa"/>
+              <w:top w:w="85" w:type="dxa"/>
+              <w:start w:w="120" w:type="dxa"/>
+              <w:bottom w:w="85" w:type="dxa"/>
+              <w:end w:w="120" w:type="dxa"/>
             </w:tcMar>
           </w:tcPr>
           <w:p>
@@ -5062,10 +5165,10 @@
               <w:insideV w:val="single" w:sz="6" w:space="0" w:color="E4E4E4"/>
             </w:tcBorders>
             <w:tcMar>
-              <w:top w:w="45" w:type="dxa"/>
-              <w:start w:w="95" w:type="dxa"/>
-              <w:bottom w:w="45" w:type="dxa"/>
-              <w:end w:w="95" w:type="dxa"/>
+              <w:top w:w="85" w:type="dxa"/>
+              <w:start w:w="120" w:type="dxa"/>
+              <w:bottom w:w="85" w:type="dxa"/>
+              <w:end w:w="120" w:type="dxa"/>
             </w:tcMar>
           </w:tcPr>
           <w:p>
@@ -5103,10 +5206,10 @@
               <w:insideV w:val="single" w:sz="6" w:space="0" w:color="E4E4E4"/>
             </w:tcBorders>
             <w:tcMar>
-              <w:top w:w="45" w:type="dxa"/>
-              <w:start w:w="95" w:type="dxa"/>
-              <w:bottom w:w="45" w:type="dxa"/>
-              <w:end w:w="95" w:type="dxa"/>
+              <w:top w:w="85" w:type="dxa"/>
+              <w:start w:w="120" w:type="dxa"/>
+              <w:bottom w:w="85" w:type="dxa"/>
+              <w:end w:w="120" w:type="dxa"/>
             </w:tcMar>
           </w:tcPr>
           <w:p>
@@ -5138,10 +5241,10 @@
               <w:insideV w:val="single" w:sz="6" w:space="0" w:color="E4E4E4"/>
             </w:tcBorders>
             <w:tcMar>
-              <w:top w:w="45" w:type="dxa"/>
-              <w:start w:w="95" w:type="dxa"/>
-              <w:bottom w:w="45" w:type="dxa"/>
-              <w:end w:w="95" w:type="dxa"/>
+              <w:top w:w="85" w:type="dxa"/>
+              <w:start w:w="120" w:type="dxa"/>
+              <w:bottom w:w="85" w:type="dxa"/>
+              <w:end w:w="120" w:type="dxa"/>
             </w:tcMar>
           </w:tcPr>
           <w:p>
@@ -5179,10 +5282,10 @@
               <w:insideV w:val="single" w:sz="6" w:space="0" w:color="E4E4E4"/>
             </w:tcBorders>
             <w:tcMar>
-              <w:top w:w="45" w:type="dxa"/>
-              <w:start w:w="95" w:type="dxa"/>
-              <w:bottom w:w="45" w:type="dxa"/>
-              <w:end w:w="95" w:type="dxa"/>
+              <w:top w:w="85" w:type="dxa"/>
+              <w:start w:w="120" w:type="dxa"/>
+              <w:bottom w:w="85" w:type="dxa"/>
+              <w:end w:w="120" w:type="dxa"/>
             </w:tcMar>
           </w:tcPr>
           <w:p>
@@ -5214,10 +5317,10 @@
               <w:insideV w:val="single" w:sz="6" w:space="0" w:color="E4E4E4"/>
             </w:tcBorders>
             <w:tcMar>
-              <w:top w:w="45" w:type="dxa"/>
-              <w:start w:w="95" w:type="dxa"/>
-              <w:bottom w:w="45" w:type="dxa"/>
-              <w:end w:w="95" w:type="dxa"/>
+              <w:top w:w="85" w:type="dxa"/>
+              <w:start w:w="120" w:type="dxa"/>
+              <w:bottom w:w="85" w:type="dxa"/>
+              <w:end w:w="120" w:type="dxa"/>
             </w:tcMar>
           </w:tcPr>
           <w:p>
@@ -5255,10 +5358,10 @@
               <w:insideV w:val="single" w:sz="6" w:space="0" w:color="E4E4E4"/>
             </w:tcBorders>
             <w:tcMar>
-              <w:top w:w="45" w:type="dxa"/>
-              <w:start w:w="95" w:type="dxa"/>
-              <w:bottom w:w="45" w:type="dxa"/>
-              <w:end w:w="95" w:type="dxa"/>
+              <w:top w:w="85" w:type="dxa"/>
+              <w:start w:w="120" w:type="dxa"/>
+              <w:bottom w:w="85" w:type="dxa"/>
+              <w:end w:w="120" w:type="dxa"/>
             </w:tcMar>
           </w:tcPr>
           <w:p>
@@ -5290,10 +5393,10 @@
               <w:insideV w:val="single" w:sz="6" w:space="0" w:color="E4E4E4"/>
             </w:tcBorders>
             <w:tcMar>
-              <w:top w:w="45" w:type="dxa"/>
-              <w:start w:w="95" w:type="dxa"/>
-              <w:bottom w:w="45" w:type="dxa"/>
-              <w:end w:w="95" w:type="dxa"/>
+              <w:top w:w="85" w:type="dxa"/>
+              <w:start w:w="120" w:type="dxa"/>
+              <w:bottom w:w="85" w:type="dxa"/>
+              <w:end w:w="120" w:type="dxa"/>
             </w:tcMar>
           </w:tcPr>
           <w:p>
@@ -5331,10 +5434,10 @@
               <w:insideV w:val="single" w:sz="6" w:space="0" w:color="E4E4E4"/>
             </w:tcBorders>
             <w:tcMar>
-              <w:top w:w="45" w:type="dxa"/>
-              <w:start w:w="95" w:type="dxa"/>
-              <w:bottom w:w="45" w:type="dxa"/>
-              <w:end w:w="95" w:type="dxa"/>
+              <w:top w:w="85" w:type="dxa"/>
+              <w:start w:w="120" w:type="dxa"/>
+              <w:bottom w:w="85" w:type="dxa"/>
+              <w:end w:w="120" w:type="dxa"/>
             </w:tcMar>
           </w:tcPr>
           <w:p>
@@ -5366,10 +5469,10 @@
               <w:insideV w:val="single" w:sz="6" w:space="0" w:color="E4E4E4"/>
             </w:tcBorders>
             <w:tcMar>
-              <w:top w:w="45" w:type="dxa"/>
-              <w:start w:w="95" w:type="dxa"/>
-              <w:bottom w:w="45" w:type="dxa"/>
-              <w:end w:w="95" w:type="dxa"/>
+              <w:top w:w="85" w:type="dxa"/>
+              <w:start w:w="120" w:type="dxa"/>
+              <w:bottom w:w="85" w:type="dxa"/>
+              <w:end w:w="120" w:type="dxa"/>
             </w:tcMar>
           </w:tcPr>
           <w:p>
@@ -5407,10 +5510,10 @@
               <w:insideV w:val="single" w:sz="6" w:space="0" w:color="E4E4E4"/>
             </w:tcBorders>
             <w:tcMar>
-              <w:top w:w="45" w:type="dxa"/>
-              <w:start w:w="95" w:type="dxa"/>
-              <w:bottom w:w="45" w:type="dxa"/>
-              <w:end w:w="95" w:type="dxa"/>
+              <w:top w:w="85" w:type="dxa"/>
+              <w:start w:w="120" w:type="dxa"/>
+              <w:bottom w:w="85" w:type="dxa"/>
+              <w:end w:w="120" w:type="dxa"/>
             </w:tcMar>
           </w:tcPr>
           <w:p>
@@ -5442,10 +5545,10 @@
               <w:insideV w:val="single" w:sz="6" w:space="0" w:color="E4E4E4"/>
             </w:tcBorders>
             <w:tcMar>
-              <w:top w:w="45" w:type="dxa"/>
-              <w:start w:w="95" w:type="dxa"/>
-              <w:bottom w:w="45" w:type="dxa"/>
-              <w:end w:w="95" w:type="dxa"/>
+              <w:top w:w="85" w:type="dxa"/>
+              <w:start w:w="120" w:type="dxa"/>
+              <w:bottom w:w="85" w:type="dxa"/>
+              <w:end w:w="120" w:type="dxa"/>
             </w:tcMar>
           </w:tcPr>
           <w:p>
@@ -5483,10 +5586,10 @@
               <w:insideV w:val="single" w:sz="6" w:space="0" w:color="E4E4E4"/>
             </w:tcBorders>
             <w:tcMar>
-              <w:top w:w="45" w:type="dxa"/>
-              <w:start w:w="95" w:type="dxa"/>
-              <w:bottom w:w="45" w:type="dxa"/>
-              <w:end w:w="95" w:type="dxa"/>
+              <w:top w:w="85" w:type="dxa"/>
+              <w:start w:w="120" w:type="dxa"/>
+              <w:bottom w:w="85" w:type="dxa"/>
+              <w:end w:w="120" w:type="dxa"/>
             </w:tcMar>
           </w:tcPr>
           <w:p>
@@ -5518,10 +5621,10 @@
               <w:insideV w:val="single" w:sz="6" w:space="0" w:color="E4E4E4"/>
             </w:tcBorders>
             <w:tcMar>
-              <w:top w:w="45" w:type="dxa"/>
-              <w:start w:w="95" w:type="dxa"/>
-              <w:bottom w:w="45" w:type="dxa"/>
-              <w:end w:w="95" w:type="dxa"/>
+              <w:top w:w="85" w:type="dxa"/>
+              <w:start w:w="120" w:type="dxa"/>
+              <w:bottom w:w="85" w:type="dxa"/>
+              <w:end w:w="120" w:type="dxa"/>
             </w:tcMar>
           </w:tcPr>
           <w:p>
@@ -5559,10 +5662,10 @@
               <w:insideV w:val="single" w:sz="6" w:space="0" w:color="E4E4E4"/>
             </w:tcBorders>
             <w:tcMar>
-              <w:top w:w="45" w:type="dxa"/>
-              <w:start w:w="95" w:type="dxa"/>
-              <w:bottom w:w="45" w:type="dxa"/>
-              <w:end w:w="95" w:type="dxa"/>
+              <w:top w:w="85" w:type="dxa"/>
+              <w:start w:w="120" w:type="dxa"/>
+              <w:bottom w:w="85" w:type="dxa"/>
+              <w:end w:w="120" w:type="dxa"/>
             </w:tcMar>
           </w:tcPr>
           <w:p>
@@ -5594,10 +5697,10 @@
               <w:insideV w:val="single" w:sz="6" w:space="0" w:color="E4E4E4"/>
             </w:tcBorders>
             <w:tcMar>
-              <w:top w:w="45" w:type="dxa"/>
-              <w:start w:w="95" w:type="dxa"/>
-              <w:bottom w:w="45" w:type="dxa"/>
-              <w:end w:w="95" w:type="dxa"/>
+              <w:top w:w="85" w:type="dxa"/>
+              <w:start w:w="120" w:type="dxa"/>
+              <w:bottom w:w="85" w:type="dxa"/>
+              <w:end w:w="120" w:type="dxa"/>
             </w:tcMar>
           </w:tcPr>
           <w:p>
@@ -5635,10 +5738,10 @@
               <w:insideV w:val="single" w:sz="6" w:space="0" w:color="E4E4E4"/>
             </w:tcBorders>
             <w:tcMar>
-              <w:top w:w="45" w:type="dxa"/>
-              <w:start w:w="95" w:type="dxa"/>
-              <w:bottom w:w="45" w:type="dxa"/>
-              <w:end w:w="95" w:type="dxa"/>
+              <w:top w:w="85" w:type="dxa"/>
+              <w:start w:w="120" w:type="dxa"/>
+              <w:bottom w:w="85" w:type="dxa"/>
+              <w:end w:w="120" w:type="dxa"/>
             </w:tcMar>
           </w:tcPr>
           <w:p>
@@ -5670,10 +5773,10 @@
               <w:insideV w:val="single" w:sz="6" w:space="0" w:color="E4E4E4"/>
             </w:tcBorders>
             <w:tcMar>
-              <w:top w:w="45" w:type="dxa"/>
-              <w:start w:w="95" w:type="dxa"/>
-              <w:bottom w:w="45" w:type="dxa"/>
-              <w:end w:w="95" w:type="dxa"/>
+              <w:top w:w="85" w:type="dxa"/>
+              <w:start w:w="120" w:type="dxa"/>
+              <w:bottom w:w="85" w:type="dxa"/>
+              <w:end w:w="120" w:type="dxa"/>
             </w:tcMar>
           </w:tcPr>
           <w:p>
@@ -5711,10 +5814,10 @@
               <w:insideV w:val="single" w:sz="6" w:space="0" w:color="E4E4E4"/>
             </w:tcBorders>
             <w:tcMar>
-              <w:top w:w="45" w:type="dxa"/>
-              <w:start w:w="95" w:type="dxa"/>
-              <w:bottom w:w="45" w:type="dxa"/>
-              <w:end w:w="95" w:type="dxa"/>
+              <w:top w:w="85" w:type="dxa"/>
+              <w:start w:w="120" w:type="dxa"/>
+              <w:bottom w:w="85" w:type="dxa"/>
+              <w:end w:w="120" w:type="dxa"/>
             </w:tcMar>
           </w:tcPr>
           <w:p>
@@ -5746,10 +5849,10 @@
               <w:insideV w:val="single" w:sz="6" w:space="0" w:color="E4E4E4"/>
             </w:tcBorders>
             <w:tcMar>
-              <w:top w:w="45" w:type="dxa"/>
-              <w:start w:w="95" w:type="dxa"/>
-              <w:bottom w:w="45" w:type="dxa"/>
-              <w:end w:w="95" w:type="dxa"/>
+              <w:top w:w="85" w:type="dxa"/>
+              <w:start w:w="120" w:type="dxa"/>
+              <w:bottom w:w="85" w:type="dxa"/>
+              <w:end w:w="120" w:type="dxa"/>
             </w:tcMar>
           </w:tcPr>
           <w:p>
@@ -5780,7 +5883,6 @@
     </w:p>
     <w:p>
       <w:pPr>
-        <w:pStyle w:val="ListBullet"/>
         <w:spacing w:after="40"/>
         <w:ind w:left="360" w:hanging="216"/>
       </w:pPr>
@@ -5790,7 +5892,6 @@
     </w:p>
     <w:p>
       <w:pPr>
-        <w:pStyle w:val="ListBullet"/>
         <w:spacing w:after="40"/>
         <w:ind w:left="360" w:hanging="216"/>
       </w:pPr>
@@ -5800,7 +5901,6 @@
     </w:p>
     <w:p>
       <w:pPr>
-        <w:pStyle w:val="ListBullet"/>
         <w:spacing w:after="40"/>
         <w:ind w:left="360" w:hanging="216"/>
       </w:pPr>
@@ -5810,7 +5910,6 @@
     </w:p>
     <w:p>
       <w:pPr>
-        <w:pStyle w:val="ListBullet"/>
         <w:spacing w:after="40"/>
         <w:ind w:left="360" w:hanging="216"/>
       </w:pPr>
@@ -5820,7 +5919,6 @@
     </w:p>
     <w:p>
       <w:pPr>
-        <w:pStyle w:val="ListBullet"/>
         <w:spacing w:after="40"/>
         <w:ind w:left="360" w:hanging="216"/>
       </w:pPr>
@@ -5829,7 +5927,13 @@
       </w:r>
     </w:p>
     <w:p>
+      <w:pPr>
+        <w:spacing w:before="0" w:after="0" w:lineRule="exact" w:line="20"/>
+      </w:pPr>
       <w:r>
+        <w:rPr>
+          <w:sz w:val="2"/>
+        </w:rPr>
         <w:br w:type="page"/>
       </w:r>
     </w:p>
@@ -5843,7 +5947,7 @@
     </w:p>
     <w:p>
       <w:pPr>
-        <w:keepLines w:val="0"/>
+        <w:keepLines/>
         <w:widowControl/>
       </w:pPr>
       <w:r>
@@ -5858,7 +5962,7 @@
     </w:p>
     <w:p>
       <w:pPr>
-        <w:keepLines w:val="0"/>
+        <w:keepLines/>
         <w:widowControl/>
       </w:pPr>
       <w:r>
@@ -5873,7 +5977,7 @@
     </w:p>
     <w:p>
       <w:pPr>
-        <w:keepLines w:val="0"/>
+        <w:keepLines/>
         <w:widowControl/>
       </w:pPr>
       <w:r>
@@ -5888,7 +5992,7 @@
     </w:p>
     <w:p>
       <w:pPr>
-        <w:keepLines w:val="0"/>
+        <w:keepLines/>
         <w:widowControl/>
       </w:pPr>
       <w:r>
@@ -5898,12 +6002,12 @@
         <w:t xml:space="preserve">4. Claim Process.  </w:t>
       </w:r>
       <w:r>
-        <w:t>Buyer will stop use if continued operation may worsen damage or create a safety risk; contact the designated manufacturer support channel; provide the serial number, photographs or video, logs, and requested diagnostic information; and reasonably cooperate with remote troubleshooting. Buyer must notify Bloomjoy at [support email] if escalation or parts coordination is needed.</w:t>
+        <w:t>Buyer will stop use if continued operation may worsen damage or create a safety risk; contact the designated manufacturer support channel; provide the serial number, photographs or video, logs, and requested diagnostic information; and reasonably cooperate with remote troubleshooting. Buyer must notify Bloomjoy at [support email address] if escalation or parts coordination is needed.</w:t>
       </w:r>
     </w:p>
     <w:p>
       <w:pPr>
-        <w:keepLines w:val="0"/>
+        <w:keepLines/>
         <w:widowControl/>
       </w:pPr>
       <w:r>
@@ -5913,12 +6017,12 @@
         <w:t xml:space="preserve">5. Labor, Travel, and Shipping.  </w:t>
       </w:r>
       <w:r>
-        <w:t>Included labor, freight, duties, travel, and on-site services are limited to: [Insert]. Any amount not expressly included requires Buyer approval before charge, except reasonable emergency measures requested by Buyer.</w:t>
+        <w:t>Included labor, freight, duties, travel, and on-site services are limited to: [Describe included services or None]. Any amount not expressly included requires Buyer approval before charge, except reasonable emergency measures requested by Buyer.</w:t>
       </w:r>
     </w:p>
     <w:p>
       <w:pPr>
-        <w:keepLines w:val="0"/>
+        <w:keepLines/>
         <w:widowControl/>
       </w:pPr>
       <w:r>
@@ -5933,7 +6037,7 @@
     </w:p>
     <w:p>
       <w:pPr>
-        <w:keepLines w:val="0"/>
+        <w:keepLines/>
         <w:widowControl/>
       </w:pPr>
       <w:r>
@@ -5947,7 +6051,13 @@
       </w:r>
     </w:p>
     <w:p>
+      <w:pPr>
+        <w:spacing w:before="0" w:after="0" w:lineRule="exact" w:line="20"/>
+      </w:pPr>
       <w:r>
+        <w:rPr>
+          <w:sz w:val="2"/>
+        </w:rPr>
         <w:br w:type="page"/>
       </w:r>
     </w:p>
@@ -5978,9 +6088,9 @@
         <w:tblLook w:firstColumn="1" w:firstRow="1" w:lastColumn="0" w:lastRow="0" w:noHBand="0" w:noVBand="1" w:val="04A0"/>
       </w:tblPr>
       <w:tblGrid>
-        <w:gridCol w:w="3389"/>
-        <w:gridCol w:w="3389"/>
-        <w:gridCol w:w="3389"/>
+        <w:gridCol w:w="804"/>
+        <w:gridCol w:w="6431"/>
+        <w:gridCol w:w="2558"/>
       </w:tblGrid>
       <w:tr>
         <w:trPr>
@@ -5988,7 +6098,7 @@
         </w:trPr>
         <w:tc>
           <w:tcPr>
-            <w:tcW w:type="dxa" w:w="792"/>
+            <w:tcW w:type="dxa" w:w="804"/>
             <w:shd w:fill="FDEAF1"/>
             <w:tcBorders>
               <w:top w:val="single" w:sz="6" w:space="0" w:color="E4E4E4"/>
@@ -5999,10 +6109,10 @@
               <w:insideV w:val="single" w:sz="6" w:space="0" w:color="E4E4E4"/>
             </w:tcBorders>
             <w:tcMar>
-              <w:top w:w="45" w:type="dxa"/>
-              <w:start w:w="95" w:type="dxa"/>
-              <w:bottom w:w="45" w:type="dxa"/>
-              <w:end w:w="95" w:type="dxa"/>
+              <w:top w:w="85" w:type="dxa"/>
+              <w:start w:w="120" w:type="dxa"/>
+              <w:bottom w:w="85" w:type="dxa"/>
+              <w:end w:w="120" w:type="dxa"/>
             </w:tcMar>
             <w:vAlign w:val="center"/>
           </w:tcPr>
@@ -6024,7 +6134,7 @@
         </w:tc>
         <w:tc>
           <w:tcPr>
-            <w:tcW w:type="dxa" w:w="6336"/>
+            <w:tcW w:type="dxa" w:w="6431"/>
             <w:shd w:fill="FDEAF1"/>
             <w:tcBorders>
               <w:top w:val="single" w:sz="6" w:space="0" w:color="E4E4E4"/>
@@ -6035,10 +6145,10 @@
               <w:insideV w:val="single" w:sz="6" w:space="0" w:color="E4E4E4"/>
             </w:tcBorders>
             <w:tcMar>
-              <w:top w:w="45" w:type="dxa"/>
-              <w:start w:w="95" w:type="dxa"/>
-              <w:bottom w:w="45" w:type="dxa"/>
-              <w:end w:w="95" w:type="dxa"/>
+              <w:top w:w="85" w:type="dxa"/>
+              <w:start w:w="120" w:type="dxa"/>
+              <w:bottom w:w="85" w:type="dxa"/>
+              <w:end w:w="120" w:type="dxa"/>
             </w:tcMar>
             <w:vAlign w:val="center"/>
           </w:tcPr>
@@ -6060,7 +6170,7 @@
         </w:tc>
         <w:tc>
           <w:tcPr>
-            <w:tcW w:type="dxa" w:w="2520"/>
+            <w:tcW w:type="dxa" w:w="2558"/>
             <w:shd w:fill="FDEAF1"/>
             <w:tcBorders>
               <w:top w:val="single" w:sz="6" w:space="0" w:color="E4E4E4"/>
@@ -6071,10 +6181,10 @@
               <w:insideV w:val="single" w:sz="6" w:space="0" w:color="E4E4E4"/>
             </w:tcBorders>
             <w:tcMar>
-              <w:top w:w="45" w:type="dxa"/>
-              <w:start w:w="95" w:type="dxa"/>
-              <w:bottom w:w="45" w:type="dxa"/>
-              <w:end w:w="95" w:type="dxa"/>
+              <w:top w:w="85" w:type="dxa"/>
+              <w:start w:w="120" w:type="dxa"/>
+              <w:bottom w:w="85" w:type="dxa"/>
+              <w:end w:w="120" w:type="dxa"/>
             </w:tcMar>
             <w:vAlign w:val="center"/>
           </w:tcPr>
@@ -6101,7 +6211,7 @@
         </w:trPr>
         <w:tc>
           <w:tcPr>
-            <w:tcW w:type="dxa" w:w="792"/>
+            <w:tcW w:type="dxa" w:w="804"/>
             <w:tcBorders>
               <w:top w:val="single" w:sz="6" w:space="0" w:color="E4E4E4"/>
               <w:left w:val="single" w:sz="6" w:space="0" w:color="E4E4E4"/>
@@ -6111,10 +6221,10 @@
               <w:insideV w:val="single" w:sz="6" w:space="0" w:color="E4E4E4"/>
             </w:tcBorders>
             <w:tcMar>
-              <w:top w:w="45" w:type="dxa"/>
-              <w:start w:w="95" w:type="dxa"/>
-              <w:bottom w:w="45" w:type="dxa"/>
-              <w:end w:w="95" w:type="dxa"/>
+              <w:top w:w="85" w:type="dxa"/>
+              <w:start w:w="120" w:type="dxa"/>
+              <w:bottom w:w="85" w:type="dxa"/>
+              <w:end w:w="120" w:type="dxa"/>
             </w:tcMar>
             <w:vAlign w:val="center"/>
           </w:tcPr>
@@ -6136,7 +6246,7 @@
         </w:tc>
         <w:tc>
           <w:tcPr>
-            <w:tcW w:type="dxa" w:w="6336"/>
+            <w:tcW w:type="dxa" w:w="6431"/>
             <w:tcBorders>
               <w:top w:val="single" w:sz="6" w:space="0" w:color="E4E4E4"/>
               <w:left w:val="single" w:sz="6" w:space="0" w:color="E4E4E4"/>
@@ -6146,10 +6256,10 @@
               <w:insideV w:val="single" w:sz="6" w:space="0" w:color="E4E4E4"/>
             </w:tcBorders>
             <w:tcMar>
-              <w:top w:w="45" w:type="dxa"/>
-              <w:start w:w="95" w:type="dxa"/>
-              <w:bottom w:w="45" w:type="dxa"/>
-              <w:end w:w="95" w:type="dxa"/>
+              <w:top w:w="85" w:type="dxa"/>
+              <w:start w:w="120" w:type="dxa"/>
+              <w:bottom w:w="85" w:type="dxa"/>
+              <w:end w:w="120" w:type="dxa"/>
             </w:tcMar>
             <w:vAlign w:val="center"/>
           </w:tcPr>
@@ -6171,7 +6281,7 @@
         </w:tc>
         <w:tc>
           <w:tcPr>
-            <w:tcW w:type="dxa" w:w="2520"/>
+            <w:tcW w:type="dxa" w:w="2558"/>
             <w:tcBorders>
               <w:top w:val="single" w:sz="6" w:space="0" w:color="E4E4E4"/>
               <w:left w:val="single" w:sz="6" w:space="0" w:color="E4E4E4"/>
@@ -6181,10 +6291,10 @@
               <w:insideV w:val="single" w:sz="6" w:space="0" w:color="E4E4E4"/>
             </w:tcBorders>
             <w:tcMar>
-              <w:top w:w="45" w:type="dxa"/>
-              <w:start w:w="95" w:type="dxa"/>
-              <w:bottom w:w="45" w:type="dxa"/>
-              <w:end w:w="95" w:type="dxa"/>
+              <w:top w:w="85" w:type="dxa"/>
+              <w:start w:w="120" w:type="dxa"/>
+              <w:bottom w:w="85" w:type="dxa"/>
+              <w:end w:w="120" w:type="dxa"/>
             </w:tcMar>
             <w:vAlign w:val="center"/>
           </w:tcPr>
@@ -6211,7 +6321,7 @@
         </w:trPr>
         <w:tc>
           <w:tcPr>
-            <w:tcW w:type="dxa" w:w="792"/>
+            <w:tcW w:type="dxa" w:w="804"/>
             <w:tcBorders>
               <w:top w:val="single" w:sz="6" w:space="0" w:color="E4E4E4"/>
               <w:left w:val="single" w:sz="6" w:space="0" w:color="E4E4E4"/>
@@ -6221,10 +6331,10 @@
               <w:insideV w:val="single" w:sz="6" w:space="0" w:color="E4E4E4"/>
             </w:tcBorders>
             <w:tcMar>
-              <w:top w:w="45" w:type="dxa"/>
-              <w:start w:w="95" w:type="dxa"/>
-              <w:bottom w:w="45" w:type="dxa"/>
-              <w:end w:w="95" w:type="dxa"/>
+              <w:top w:w="85" w:type="dxa"/>
+              <w:start w:w="120" w:type="dxa"/>
+              <w:bottom w:w="85" w:type="dxa"/>
+              <w:end w:w="120" w:type="dxa"/>
             </w:tcMar>
             <w:vAlign w:val="center"/>
           </w:tcPr>
@@ -6246,7 +6356,7 @@
         </w:tc>
         <w:tc>
           <w:tcPr>
-            <w:tcW w:type="dxa" w:w="6336"/>
+            <w:tcW w:type="dxa" w:w="6431"/>
             <w:tcBorders>
               <w:top w:val="single" w:sz="6" w:space="0" w:color="E4E4E4"/>
               <w:left w:val="single" w:sz="6" w:space="0" w:color="E4E4E4"/>
@@ -6256,10 +6366,10 @@
               <w:insideV w:val="single" w:sz="6" w:space="0" w:color="E4E4E4"/>
             </w:tcBorders>
             <w:tcMar>
-              <w:top w:w="45" w:type="dxa"/>
-              <w:start w:w="95" w:type="dxa"/>
-              <w:bottom w:w="45" w:type="dxa"/>
-              <w:end w:w="95" w:type="dxa"/>
+              <w:top w:w="85" w:type="dxa"/>
+              <w:start w:w="120" w:type="dxa"/>
+              <w:bottom w:w="85" w:type="dxa"/>
+              <w:end w:w="120" w:type="dxa"/>
             </w:tcMar>
             <w:vAlign w:val="center"/>
           </w:tcPr>
@@ -6281,7 +6391,7 @@
         </w:tc>
         <w:tc>
           <w:tcPr>
-            <w:tcW w:type="dxa" w:w="2520"/>
+            <w:tcW w:type="dxa" w:w="2558"/>
             <w:tcBorders>
               <w:top w:val="single" w:sz="6" w:space="0" w:color="E4E4E4"/>
               <w:left w:val="single" w:sz="6" w:space="0" w:color="E4E4E4"/>
@@ -6291,10 +6401,10 @@
               <w:insideV w:val="single" w:sz="6" w:space="0" w:color="E4E4E4"/>
             </w:tcBorders>
             <w:tcMar>
-              <w:top w:w="45" w:type="dxa"/>
-              <w:start w:w="95" w:type="dxa"/>
-              <w:bottom w:w="45" w:type="dxa"/>
-              <w:end w:w="95" w:type="dxa"/>
+              <w:top w:w="85" w:type="dxa"/>
+              <w:start w:w="120" w:type="dxa"/>
+              <w:bottom w:w="85" w:type="dxa"/>
+              <w:end w:w="120" w:type="dxa"/>
             </w:tcMar>
             <w:vAlign w:val="center"/>
           </w:tcPr>
@@ -6321,7 +6431,7 @@
         </w:trPr>
         <w:tc>
           <w:tcPr>
-            <w:tcW w:type="dxa" w:w="792"/>
+            <w:tcW w:type="dxa" w:w="804"/>
             <w:tcBorders>
               <w:top w:val="single" w:sz="6" w:space="0" w:color="E4E4E4"/>
               <w:left w:val="single" w:sz="6" w:space="0" w:color="E4E4E4"/>
@@ -6331,10 +6441,10 @@
               <w:insideV w:val="single" w:sz="6" w:space="0" w:color="E4E4E4"/>
             </w:tcBorders>
             <w:tcMar>
-              <w:top w:w="45" w:type="dxa"/>
-              <w:start w:w="95" w:type="dxa"/>
-              <w:bottom w:w="45" w:type="dxa"/>
-              <w:end w:w="95" w:type="dxa"/>
+              <w:top w:w="85" w:type="dxa"/>
+              <w:start w:w="120" w:type="dxa"/>
+              <w:bottom w:w="85" w:type="dxa"/>
+              <w:end w:w="120" w:type="dxa"/>
             </w:tcMar>
             <w:vAlign w:val="center"/>
           </w:tcPr>
@@ -6356,7 +6466,7 @@
         </w:tc>
         <w:tc>
           <w:tcPr>
-            <w:tcW w:type="dxa" w:w="6336"/>
+            <w:tcW w:type="dxa" w:w="6431"/>
             <w:tcBorders>
               <w:top w:val="single" w:sz="6" w:space="0" w:color="E4E4E4"/>
               <w:left w:val="single" w:sz="6" w:space="0" w:color="E4E4E4"/>
@@ -6366,10 +6476,10 @@
               <w:insideV w:val="single" w:sz="6" w:space="0" w:color="E4E4E4"/>
             </w:tcBorders>
             <w:tcMar>
-              <w:top w:w="45" w:type="dxa"/>
-              <w:start w:w="95" w:type="dxa"/>
-              <w:bottom w:w="45" w:type="dxa"/>
-              <w:end w:w="95" w:type="dxa"/>
+              <w:top w:w="85" w:type="dxa"/>
+              <w:start w:w="120" w:type="dxa"/>
+              <w:bottom w:w="85" w:type="dxa"/>
+              <w:end w:w="120" w:type="dxa"/>
             </w:tcMar>
             <w:vAlign w:val="center"/>
           </w:tcPr>
@@ -6391,7 +6501,7 @@
         </w:tc>
         <w:tc>
           <w:tcPr>
-            <w:tcW w:type="dxa" w:w="2520"/>
+            <w:tcW w:type="dxa" w:w="2558"/>
             <w:tcBorders>
               <w:top w:val="single" w:sz="6" w:space="0" w:color="E4E4E4"/>
               <w:left w:val="single" w:sz="6" w:space="0" w:color="E4E4E4"/>
@@ -6401,10 +6511,10 @@
               <w:insideV w:val="single" w:sz="6" w:space="0" w:color="E4E4E4"/>
             </w:tcBorders>
             <w:tcMar>
-              <w:top w:w="45" w:type="dxa"/>
-              <w:start w:w="95" w:type="dxa"/>
-              <w:bottom w:w="45" w:type="dxa"/>
-              <w:end w:w="95" w:type="dxa"/>
+              <w:top w:w="85" w:type="dxa"/>
+              <w:start w:w="120" w:type="dxa"/>
+              <w:bottom w:w="85" w:type="dxa"/>
+              <w:end w:w="120" w:type="dxa"/>
             </w:tcMar>
             <w:vAlign w:val="center"/>
           </w:tcPr>
@@ -6431,7 +6541,7 @@
         </w:trPr>
         <w:tc>
           <w:tcPr>
-            <w:tcW w:type="dxa" w:w="792"/>
+            <w:tcW w:type="dxa" w:w="804"/>
             <w:tcBorders>
               <w:top w:val="single" w:sz="6" w:space="0" w:color="E4E4E4"/>
               <w:left w:val="single" w:sz="6" w:space="0" w:color="E4E4E4"/>
@@ -6441,10 +6551,10 @@
               <w:insideV w:val="single" w:sz="6" w:space="0" w:color="E4E4E4"/>
             </w:tcBorders>
             <w:tcMar>
-              <w:top w:w="45" w:type="dxa"/>
-              <w:start w:w="95" w:type="dxa"/>
-              <w:bottom w:w="45" w:type="dxa"/>
-              <w:end w:w="95" w:type="dxa"/>
+              <w:top w:w="85" w:type="dxa"/>
+              <w:start w:w="120" w:type="dxa"/>
+              <w:bottom w:w="85" w:type="dxa"/>
+              <w:end w:w="120" w:type="dxa"/>
             </w:tcMar>
             <w:vAlign w:val="center"/>
           </w:tcPr>
@@ -6466,7 +6576,7 @@
         </w:tc>
         <w:tc>
           <w:tcPr>
-            <w:tcW w:type="dxa" w:w="6336"/>
+            <w:tcW w:type="dxa" w:w="6431"/>
             <w:tcBorders>
               <w:top w:val="single" w:sz="6" w:space="0" w:color="E4E4E4"/>
               <w:left w:val="single" w:sz="6" w:space="0" w:color="E4E4E4"/>
@@ -6476,10 +6586,10 @@
               <w:insideV w:val="single" w:sz="6" w:space="0" w:color="E4E4E4"/>
             </w:tcBorders>
             <w:tcMar>
-              <w:top w:w="45" w:type="dxa"/>
-              <w:start w:w="95" w:type="dxa"/>
-              <w:bottom w:w="45" w:type="dxa"/>
-              <w:end w:w="95" w:type="dxa"/>
+              <w:top w:w="85" w:type="dxa"/>
+              <w:start w:w="120" w:type="dxa"/>
+              <w:bottom w:w="85" w:type="dxa"/>
+              <w:end w:w="120" w:type="dxa"/>
             </w:tcMar>
             <w:vAlign w:val="center"/>
           </w:tcPr>
@@ -6501,7 +6611,7 @@
         </w:tc>
         <w:tc>
           <w:tcPr>
-            <w:tcW w:type="dxa" w:w="2520"/>
+            <w:tcW w:type="dxa" w:w="2558"/>
             <w:tcBorders>
               <w:top w:val="single" w:sz="6" w:space="0" w:color="E4E4E4"/>
               <w:left w:val="single" w:sz="6" w:space="0" w:color="E4E4E4"/>
@@ -6511,10 +6621,10 @@
               <w:insideV w:val="single" w:sz="6" w:space="0" w:color="E4E4E4"/>
             </w:tcBorders>
             <w:tcMar>
-              <w:top w:w="45" w:type="dxa"/>
-              <w:start w:w="95" w:type="dxa"/>
-              <w:bottom w:w="45" w:type="dxa"/>
-              <w:end w:w="95" w:type="dxa"/>
+              <w:top w:w="85" w:type="dxa"/>
+              <w:start w:w="120" w:type="dxa"/>
+              <w:bottom w:w="85" w:type="dxa"/>
+              <w:end w:w="120" w:type="dxa"/>
             </w:tcMar>
             <w:vAlign w:val="center"/>
           </w:tcPr>
@@ -6541,7 +6651,7 @@
         </w:trPr>
         <w:tc>
           <w:tcPr>
-            <w:tcW w:type="dxa" w:w="792"/>
+            <w:tcW w:type="dxa" w:w="804"/>
             <w:tcBorders>
               <w:top w:val="single" w:sz="6" w:space="0" w:color="E4E4E4"/>
               <w:left w:val="single" w:sz="6" w:space="0" w:color="E4E4E4"/>
@@ -6551,10 +6661,10 @@
               <w:insideV w:val="single" w:sz="6" w:space="0" w:color="E4E4E4"/>
             </w:tcBorders>
             <w:tcMar>
-              <w:top w:w="45" w:type="dxa"/>
-              <w:start w:w="95" w:type="dxa"/>
-              <w:bottom w:w="45" w:type="dxa"/>
-              <w:end w:w="95" w:type="dxa"/>
+              <w:top w:w="85" w:type="dxa"/>
+              <w:start w:w="120" w:type="dxa"/>
+              <w:bottom w:w="85" w:type="dxa"/>
+              <w:end w:w="120" w:type="dxa"/>
             </w:tcMar>
             <w:vAlign w:val="center"/>
           </w:tcPr>
@@ -6576,7 +6686,7 @@
         </w:tc>
         <w:tc>
           <w:tcPr>
-            <w:tcW w:type="dxa" w:w="6336"/>
+            <w:tcW w:type="dxa" w:w="6431"/>
             <w:tcBorders>
               <w:top w:val="single" w:sz="6" w:space="0" w:color="E4E4E4"/>
               <w:left w:val="single" w:sz="6" w:space="0" w:color="E4E4E4"/>
@@ -6586,10 +6696,10 @@
               <w:insideV w:val="single" w:sz="6" w:space="0" w:color="E4E4E4"/>
             </w:tcBorders>
             <w:tcMar>
-              <w:top w:w="45" w:type="dxa"/>
-              <w:start w:w="95" w:type="dxa"/>
-              <w:bottom w:w="45" w:type="dxa"/>
-              <w:end w:w="95" w:type="dxa"/>
+              <w:top w:w="85" w:type="dxa"/>
+              <w:start w:w="120" w:type="dxa"/>
+              <w:bottom w:w="85" w:type="dxa"/>
+              <w:end w:w="120" w:type="dxa"/>
             </w:tcMar>
             <w:vAlign w:val="center"/>
           </w:tcPr>
@@ -6611,7 +6721,7 @@
         </w:tc>
         <w:tc>
           <w:tcPr>
-            <w:tcW w:type="dxa" w:w="2520"/>
+            <w:tcW w:type="dxa" w:w="2558"/>
             <w:tcBorders>
               <w:top w:val="single" w:sz="6" w:space="0" w:color="E4E4E4"/>
               <w:left w:val="single" w:sz="6" w:space="0" w:color="E4E4E4"/>
@@ -6621,10 +6731,10 @@
               <w:insideV w:val="single" w:sz="6" w:space="0" w:color="E4E4E4"/>
             </w:tcBorders>
             <w:tcMar>
-              <w:top w:w="45" w:type="dxa"/>
-              <w:start w:w="95" w:type="dxa"/>
-              <w:bottom w:w="45" w:type="dxa"/>
-              <w:end w:w="95" w:type="dxa"/>
+              <w:top w:w="85" w:type="dxa"/>
+              <w:start w:w="120" w:type="dxa"/>
+              <w:bottom w:w="85" w:type="dxa"/>
+              <w:end w:w="120" w:type="dxa"/>
             </w:tcMar>
             <w:vAlign w:val="center"/>
           </w:tcPr>
@@ -6651,7 +6761,7 @@
         </w:trPr>
         <w:tc>
           <w:tcPr>
-            <w:tcW w:type="dxa" w:w="792"/>
+            <w:tcW w:type="dxa" w:w="804"/>
             <w:tcBorders>
               <w:top w:val="single" w:sz="6" w:space="0" w:color="E4E4E4"/>
               <w:left w:val="single" w:sz="6" w:space="0" w:color="E4E4E4"/>
@@ -6661,10 +6771,10 @@
               <w:insideV w:val="single" w:sz="6" w:space="0" w:color="E4E4E4"/>
             </w:tcBorders>
             <w:tcMar>
-              <w:top w:w="45" w:type="dxa"/>
-              <w:start w:w="95" w:type="dxa"/>
-              <w:bottom w:w="45" w:type="dxa"/>
-              <w:end w:w="95" w:type="dxa"/>
+              <w:top w:w="85" w:type="dxa"/>
+              <w:start w:w="120" w:type="dxa"/>
+              <w:bottom w:w="85" w:type="dxa"/>
+              <w:end w:w="120" w:type="dxa"/>
             </w:tcMar>
             <w:vAlign w:val="center"/>
           </w:tcPr>
@@ -6686,7 +6796,7 @@
         </w:tc>
         <w:tc>
           <w:tcPr>
-            <w:tcW w:type="dxa" w:w="6336"/>
+            <w:tcW w:type="dxa" w:w="6431"/>
             <w:tcBorders>
               <w:top w:val="single" w:sz="6" w:space="0" w:color="E4E4E4"/>
               <w:left w:val="single" w:sz="6" w:space="0" w:color="E4E4E4"/>
@@ -6696,10 +6806,10 @@
               <w:insideV w:val="single" w:sz="6" w:space="0" w:color="E4E4E4"/>
             </w:tcBorders>
             <w:tcMar>
-              <w:top w:w="45" w:type="dxa"/>
-              <w:start w:w="95" w:type="dxa"/>
-              <w:bottom w:w="45" w:type="dxa"/>
-              <w:end w:w="95" w:type="dxa"/>
+              <w:top w:w="85" w:type="dxa"/>
+              <w:start w:w="120" w:type="dxa"/>
+              <w:bottom w:w="85" w:type="dxa"/>
+              <w:end w:w="120" w:type="dxa"/>
             </w:tcMar>
             <w:vAlign w:val="center"/>
           </w:tcPr>
@@ -6721,7 +6831,7 @@
         </w:tc>
         <w:tc>
           <w:tcPr>
-            <w:tcW w:type="dxa" w:w="2520"/>
+            <w:tcW w:type="dxa" w:w="2558"/>
             <w:tcBorders>
               <w:top w:val="single" w:sz="6" w:space="0" w:color="E4E4E4"/>
               <w:left w:val="single" w:sz="6" w:space="0" w:color="E4E4E4"/>
@@ -6731,10 +6841,10 @@
               <w:insideV w:val="single" w:sz="6" w:space="0" w:color="E4E4E4"/>
             </w:tcBorders>
             <w:tcMar>
-              <w:top w:w="45" w:type="dxa"/>
-              <w:start w:w="95" w:type="dxa"/>
-              <w:bottom w:w="45" w:type="dxa"/>
-              <w:end w:w="95" w:type="dxa"/>
+              <w:top w:w="85" w:type="dxa"/>
+              <w:start w:w="120" w:type="dxa"/>
+              <w:bottom w:w="85" w:type="dxa"/>
+              <w:end w:w="120" w:type="dxa"/>
             </w:tcMar>
             <w:vAlign w:val="center"/>
           </w:tcPr>
@@ -6761,7 +6871,7 @@
         </w:trPr>
         <w:tc>
           <w:tcPr>
-            <w:tcW w:type="dxa" w:w="792"/>
+            <w:tcW w:type="dxa" w:w="804"/>
             <w:tcBorders>
               <w:top w:val="single" w:sz="6" w:space="0" w:color="E4E4E4"/>
               <w:left w:val="single" w:sz="6" w:space="0" w:color="E4E4E4"/>
@@ -6771,10 +6881,10 @@
               <w:insideV w:val="single" w:sz="6" w:space="0" w:color="E4E4E4"/>
             </w:tcBorders>
             <w:tcMar>
-              <w:top w:w="45" w:type="dxa"/>
-              <w:start w:w="95" w:type="dxa"/>
-              <w:bottom w:w="45" w:type="dxa"/>
-              <w:end w:w="95" w:type="dxa"/>
+              <w:top w:w="85" w:type="dxa"/>
+              <w:start w:w="120" w:type="dxa"/>
+              <w:bottom w:w="85" w:type="dxa"/>
+              <w:end w:w="120" w:type="dxa"/>
             </w:tcMar>
             <w:vAlign w:val="center"/>
           </w:tcPr>
@@ -6796,7 +6906,7 @@
         </w:tc>
         <w:tc>
           <w:tcPr>
-            <w:tcW w:type="dxa" w:w="6336"/>
+            <w:tcW w:type="dxa" w:w="6431"/>
             <w:tcBorders>
               <w:top w:val="single" w:sz="6" w:space="0" w:color="E4E4E4"/>
               <w:left w:val="single" w:sz="6" w:space="0" w:color="E4E4E4"/>
@@ -6806,10 +6916,10 @@
               <w:insideV w:val="single" w:sz="6" w:space="0" w:color="E4E4E4"/>
             </w:tcBorders>
             <w:tcMar>
-              <w:top w:w="45" w:type="dxa"/>
-              <w:start w:w="95" w:type="dxa"/>
-              <w:bottom w:w="45" w:type="dxa"/>
-              <w:end w:w="95" w:type="dxa"/>
+              <w:top w:w="85" w:type="dxa"/>
+              <w:start w:w="120" w:type="dxa"/>
+              <w:bottom w:w="85" w:type="dxa"/>
+              <w:end w:w="120" w:type="dxa"/>
             </w:tcMar>
             <w:vAlign w:val="center"/>
           </w:tcPr>
@@ -6831,7 +6941,7 @@
         </w:tc>
         <w:tc>
           <w:tcPr>
-            <w:tcW w:type="dxa" w:w="2520"/>
+            <w:tcW w:type="dxa" w:w="2558"/>
             <w:tcBorders>
               <w:top w:val="single" w:sz="6" w:space="0" w:color="E4E4E4"/>
               <w:left w:val="single" w:sz="6" w:space="0" w:color="E4E4E4"/>
@@ -6841,10 +6951,10 @@
               <w:insideV w:val="single" w:sz="6" w:space="0" w:color="E4E4E4"/>
             </w:tcBorders>
             <w:tcMar>
-              <w:top w:w="45" w:type="dxa"/>
-              <w:start w:w="95" w:type="dxa"/>
-              <w:bottom w:w="45" w:type="dxa"/>
-              <w:end w:w="95" w:type="dxa"/>
+              <w:top w:w="85" w:type="dxa"/>
+              <w:start w:w="120" w:type="dxa"/>
+              <w:bottom w:w="85" w:type="dxa"/>
+              <w:end w:w="120" w:type="dxa"/>
             </w:tcMar>
             <w:vAlign w:val="center"/>
           </w:tcPr>
@@ -6871,7 +6981,7 @@
         </w:trPr>
         <w:tc>
           <w:tcPr>
-            <w:tcW w:type="dxa" w:w="792"/>
+            <w:tcW w:type="dxa" w:w="804"/>
             <w:tcBorders>
               <w:top w:val="single" w:sz="6" w:space="0" w:color="E4E4E4"/>
               <w:left w:val="single" w:sz="6" w:space="0" w:color="E4E4E4"/>
@@ -6881,10 +6991,10 @@
               <w:insideV w:val="single" w:sz="6" w:space="0" w:color="E4E4E4"/>
             </w:tcBorders>
             <w:tcMar>
-              <w:top w:w="45" w:type="dxa"/>
-              <w:start w:w="95" w:type="dxa"/>
-              <w:bottom w:w="45" w:type="dxa"/>
-              <w:end w:w="95" w:type="dxa"/>
+              <w:top w:w="85" w:type="dxa"/>
+              <w:start w:w="120" w:type="dxa"/>
+              <w:bottom w:w="85" w:type="dxa"/>
+              <w:end w:w="120" w:type="dxa"/>
             </w:tcMar>
             <w:vAlign w:val="center"/>
           </w:tcPr>
@@ -6906,7 +7016,7 @@
         </w:tc>
         <w:tc>
           <w:tcPr>
-            <w:tcW w:type="dxa" w:w="6336"/>
+            <w:tcW w:type="dxa" w:w="6431"/>
             <w:tcBorders>
               <w:top w:val="single" w:sz="6" w:space="0" w:color="E4E4E4"/>
               <w:left w:val="single" w:sz="6" w:space="0" w:color="E4E4E4"/>
@@ -6916,10 +7026,10 @@
               <w:insideV w:val="single" w:sz="6" w:space="0" w:color="E4E4E4"/>
             </w:tcBorders>
             <w:tcMar>
-              <w:top w:w="45" w:type="dxa"/>
-              <w:start w:w="95" w:type="dxa"/>
-              <w:bottom w:w="45" w:type="dxa"/>
-              <w:end w:w="95" w:type="dxa"/>
+              <w:top w:w="85" w:type="dxa"/>
+              <w:start w:w="120" w:type="dxa"/>
+              <w:bottom w:w="85" w:type="dxa"/>
+              <w:end w:w="120" w:type="dxa"/>
             </w:tcMar>
             <w:vAlign w:val="center"/>
           </w:tcPr>
@@ -6941,7 +7051,7 @@
         </w:tc>
         <w:tc>
           <w:tcPr>
-            <w:tcW w:type="dxa" w:w="2520"/>
+            <w:tcW w:type="dxa" w:w="2558"/>
             <w:tcBorders>
               <w:top w:val="single" w:sz="6" w:space="0" w:color="E4E4E4"/>
               <w:left w:val="single" w:sz="6" w:space="0" w:color="E4E4E4"/>
@@ -6951,10 +7061,10 @@
               <w:insideV w:val="single" w:sz="6" w:space="0" w:color="E4E4E4"/>
             </w:tcBorders>
             <w:tcMar>
-              <w:top w:w="45" w:type="dxa"/>
-              <w:start w:w="95" w:type="dxa"/>
-              <w:bottom w:w="45" w:type="dxa"/>
-              <w:end w:w="95" w:type="dxa"/>
+              <w:top w:w="85" w:type="dxa"/>
+              <w:start w:w="120" w:type="dxa"/>
+              <w:bottom w:w="85" w:type="dxa"/>
+              <w:end w:w="120" w:type="dxa"/>
             </w:tcMar>
             <w:vAlign w:val="center"/>
           </w:tcPr>
@@ -6981,7 +7091,7 @@
         </w:trPr>
         <w:tc>
           <w:tcPr>
-            <w:tcW w:type="dxa" w:w="792"/>
+            <w:tcW w:type="dxa" w:w="804"/>
             <w:tcBorders>
               <w:top w:val="single" w:sz="6" w:space="0" w:color="E4E4E4"/>
               <w:left w:val="single" w:sz="6" w:space="0" w:color="E4E4E4"/>
@@ -6991,10 +7101,10 @@
               <w:insideV w:val="single" w:sz="6" w:space="0" w:color="E4E4E4"/>
             </w:tcBorders>
             <w:tcMar>
-              <w:top w:w="45" w:type="dxa"/>
-              <w:start w:w="95" w:type="dxa"/>
-              <w:bottom w:w="45" w:type="dxa"/>
-              <w:end w:w="95" w:type="dxa"/>
+              <w:top w:w="85" w:type="dxa"/>
+              <w:start w:w="120" w:type="dxa"/>
+              <w:bottom w:w="85" w:type="dxa"/>
+              <w:end w:w="120" w:type="dxa"/>
             </w:tcMar>
             <w:vAlign w:val="center"/>
           </w:tcPr>
@@ -7016,7 +7126,7 @@
         </w:tc>
         <w:tc>
           <w:tcPr>
-            <w:tcW w:type="dxa" w:w="6336"/>
+            <w:tcW w:type="dxa" w:w="6431"/>
             <w:tcBorders>
               <w:top w:val="single" w:sz="6" w:space="0" w:color="E4E4E4"/>
               <w:left w:val="single" w:sz="6" w:space="0" w:color="E4E4E4"/>
@@ -7026,10 +7136,10 @@
               <w:insideV w:val="single" w:sz="6" w:space="0" w:color="E4E4E4"/>
             </w:tcBorders>
             <w:tcMar>
-              <w:top w:w="45" w:type="dxa"/>
-              <w:start w:w="95" w:type="dxa"/>
-              <w:bottom w:w="45" w:type="dxa"/>
-              <w:end w:w="95" w:type="dxa"/>
+              <w:top w:w="85" w:type="dxa"/>
+              <w:start w:w="120" w:type="dxa"/>
+              <w:bottom w:w="85" w:type="dxa"/>
+              <w:end w:w="120" w:type="dxa"/>
             </w:tcMar>
             <w:vAlign w:val="center"/>
           </w:tcPr>
@@ -7051,7 +7161,7 @@
         </w:tc>
         <w:tc>
           <w:tcPr>
-            <w:tcW w:type="dxa" w:w="2520"/>
+            <w:tcW w:type="dxa" w:w="2558"/>
             <w:tcBorders>
               <w:top w:val="single" w:sz="6" w:space="0" w:color="E4E4E4"/>
               <w:left w:val="single" w:sz="6" w:space="0" w:color="E4E4E4"/>
@@ -7061,10 +7171,10 @@
               <w:insideV w:val="single" w:sz="6" w:space="0" w:color="E4E4E4"/>
             </w:tcBorders>
             <w:tcMar>
-              <w:top w:w="45" w:type="dxa"/>
-              <w:start w:w="95" w:type="dxa"/>
-              <w:bottom w:w="45" w:type="dxa"/>
-              <w:end w:w="95" w:type="dxa"/>
+              <w:top w:w="85" w:type="dxa"/>
+              <w:start w:w="120" w:type="dxa"/>
+              <w:bottom w:w="85" w:type="dxa"/>
+              <w:end w:w="120" w:type="dxa"/>
             </w:tcMar>
             <w:vAlign w:val="center"/>
           </w:tcPr>
@@ -7091,7 +7201,7 @@
         </w:trPr>
         <w:tc>
           <w:tcPr>
-            <w:tcW w:type="dxa" w:w="792"/>
+            <w:tcW w:type="dxa" w:w="804"/>
             <w:tcBorders>
               <w:top w:val="single" w:sz="6" w:space="0" w:color="E4E4E4"/>
               <w:left w:val="single" w:sz="6" w:space="0" w:color="E4E4E4"/>
@@ -7101,10 +7211,10 @@
               <w:insideV w:val="single" w:sz="6" w:space="0" w:color="E4E4E4"/>
             </w:tcBorders>
             <w:tcMar>
-              <w:top w:w="45" w:type="dxa"/>
-              <w:start w:w="95" w:type="dxa"/>
-              <w:bottom w:w="45" w:type="dxa"/>
-              <w:end w:w="95" w:type="dxa"/>
+              <w:top w:w="85" w:type="dxa"/>
+              <w:start w:w="120" w:type="dxa"/>
+              <w:bottom w:w="85" w:type="dxa"/>
+              <w:end w:w="120" w:type="dxa"/>
             </w:tcMar>
             <w:vAlign w:val="center"/>
           </w:tcPr>
@@ -7126,7 +7236,7 @@
         </w:tc>
         <w:tc>
           <w:tcPr>
-            <w:tcW w:type="dxa" w:w="6336"/>
+            <w:tcW w:type="dxa" w:w="6431"/>
             <w:tcBorders>
               <w:top w:val="single" w:sz="6" w:space="0" w:color="E4E4E4"/>
               <w:left w:val="single" w:sz="6" w:space="0" w:color="E4E4E4"/>
@@ -7136,10 +7246,10 @@
               <w:insideV w:val="single" w:sz="6" w:space="0" w:color="E4E4E4"/>
             </w:tcBorders>
             <w:tcMar>
-              <w:top w:w="45" w:type="dxa"/>
-              <w:start w:w="95" w:type="dxa"/>
-              <w:bottom w:w="45" w:type="dxa"/>
-              <w:end w:w="95" w:type="dxa"/>
+              <w:top w:w="85" w:type="dxa"/>
+              <w:start w:w="120" w:type="dxa"/>
+              <w:bottom w:w="85" w:type="dxa"/>
+              <w:end w:w="120" w:type="dxa"/>
             </w:tcMar>
             <w:vAlign w:val="center"/>
           </w:tcPr>
@@ -7161,7 +7271,7 @@
         </w:tc>
         <w:tc>
           <w:tcPr>
-            <w:tcW w:type="dxa" w:w="2520"/>
+            <w:tcW w:type="dxa" w:w="2558"/>
             <w:tcBorders>
               <w:top w:val="single" w:sz="6" w:space="0" w:color="E4E4E4"/>
               <w:left w:val="single" w:sz="6" w:space="0" w:color="E4E4E4"/>
@@ -7171,10 +7281,10 @@
               <w:insideV w:val="single" w:sz="6" w:space="0" w:color="E4E4E4"/>
             </w:tcBorders>
             <w:tcMar>
-              <w:top w:w="45" w:type="dxa"/>
-              <w:start w:w="95" w:type="dxa"/>
-              <w:bottom w:w="45" w:type="dxa"/>
-              <w:end w:w="95" w:type="dxa"/>
+              <w:top w:w="85" w:type="dxa"/>
+              <w:start w:w="120" w:type="dxa"/>
+              <w:bottom w:w="85" w:type="dxa"/>
+              <w:end w:w="120" w:type="dxa"/>
             </w:tcMar>
             <w:vAlign w:val="center"/>
           </w:tcPr>
@@ -7201,7 +7311,7 @@
         </w:trPr>
         <w:tc>
           <w:tcPr>
-            <w:tcW w:type="dxa" w:w="792"/>
+            <w:tcW w:type="dxa" w:w="804"/>
             <w:tcBorders>
               <w:top w:val="single" w:sz="6" w:space="0" w:color="E4E4E4"/>
               <w:left w:val="single" w:sz="6" w:space="0" w:color="E4E4E4"/>
@@ -7211,10 +7321,10 @@
               <w:insideV w:val="single" w:sz="6" w:space="0" w:color="E4E4E4"/>
             </w:tcBorders>
             <w:tcMar>
-              <w:top w:w="45" w:type="dxa"/>
-              <w:start w:w="95" w:type="dxa"/>
-              <w:bottom w:w="45" w:type="dxa"/>
-              <w:end w:w="95" w:type="dxa"/>
+              <w:top w:w="85" w:type="dxa"/>
+              <w:start w:w="120" w:type="dxa"/>
+              <w:bottom w:w="85" w:type="dxa"/>
+              <w:end w:w="120" w:type="dxa"/>
             </w:tcMar>
             <w:vAlign w:val="center"/>
           </w:tcPr>
@@ -7236,7 +7346,7 @@
         </w:tc>
         <w:tc>
           <w:tcPr>
-            <w:tcW w:type="dxa" w:w="6336"/>
+            <w:tcW w:type="dxa" w:w="6431"/>
             <w:tcBorders>
               <w:top w:val="single" w:sz="6" w:space="0" w:color="E4E4E4"/>
               <w:left w:val="single" w:sz="6" w:space="0" w:color="E4E4E4"/>
@@ -7246,10 +7356,10 @@
               <w:insideV w:val="single" w:sz="6" w:space="0" w:color="E4E4E4"/>
             </w:tcBorders>
             <w:tcMar>
-              <w:top w:w="45" w:type="dxa"/>
-              <w:start w:w="95" w:type="dxa"/>
-              <w:bottom w:w="45" w:type="dxa"/>
-              <w:end w:w="95" w:type="dxa"/>
+              <w:top w:w="85" w:type="dxa"/>
+              <w:start w:w="120" w:type="dxa"/>
+              <w:bottom w:w="85" w:type="dxa"/>
+              <w:end w:w="120" w:type="dxa"/>
             </w:tcMar>
             <w:vAlign w:val="center"/>
           </w:tcPr>
@@ -7271,7 +7381,7 @@
         </w:tc>
         <w:tc>
           <w:tcPr>
-            <w:tcW w:type="dxa" w:w="2520"/>
+            <w:tcW w:type="dxa" w:w="2558"/>
             <w:tcBorders>
               <w:top w:val="single" w:sz="6" w:space="0" w:color="E4E4E4"/>
               <w:left w:val="single" w:sz="6" w:space="0" w:color="E4E4E4"/>
@@ -7281,10 +7391,10 @@
               <w:insideV w:val="single" w:sz="6" w:space="0" w:color="E4E4E4"/>
             </w:tcBorders>
             <w:tcMar>
-              <w:top w:w="45" w:type="dxa"/>
-              <w:start w:w="95" w:type="dxa"/>
-              <w:bottom w:w="45" w:type="dxa"/>
-              <w:end w:w="95" w:type="dxa"/>
+              <w:top w:w="85" w:type="dxa"/>
+              <w:start w:w="120" w:type="dxa"/>
+              <w:bottom w:w="85" w:type="dxa"/>
+              <w:end w:w="120" w:type="dxa"/>
             </w:tcMar>
             <w:vAlign w:val="center"/>
           </w:tcPr>
@@ -7311,7 +7421,7 @@
         </w:trPr>
         <w:tc>
           <w:tcPr>
-            <w:tcW w:type="dxa" w:w="792"/>
+            <w:tcW w:type="dxa" w:w="804"/>
             <w:tcBorders>
               <w:top w:val="single" w:sz="6" w:space="0" w:color="E4E4E4"/>
               <w:left w:val="single" w:sz="6" w:space="0" w:color="E4E4E4"/>
@@ -7321,10 +7431,10 @@
               <w:insideV w:val="single" w:sz="6" w:space="0" w:color="E4E4E4"/>
             </w:tcBorders>
             <w:tcMar>
-              <w:top w:w="45" w:type="dxa"/>
-              <w:start w:w="95" w:type="dxa"/>
-              <w:bottom w:w="45" w:type="dxa"/>
-              <w:end w:w="95" w:type="dxa"/>
+              <w:top w:w="85" w:type="dxa"/>
+              <w:start w:w="120" w:type="dxa"/>
+              <w:bottom w:w="85" w:type="dxa"/>
+              <w:end w:w="120" w:type="dxa"/>
             </w:tcMar>
             <w:vAlign w:val="center"/>
           </w:tcPr>
@@ -7346,7 +7456,7 @@
         </w:tc>
         <w:tc>
           <w:tcPr>
-            <w:tcW w:type="dxa" w:w="6336"/>
+            <w:tcW w:type="dxa" w:w="6431"/>
             <w:tcBorders>
               <w:top w:val="single" w:sz="6" w:space="0" w:color="E4E4E4"/>
               <w:left w:val="single" w:sz="6" w:space="0" w:color="E4E4E4"/>
@@ -7356,10 +7466,10 @@
               <w:insideV w:val="single" w:sz="6" w:space="0" w:color="E4E4E4"/>
             </w:tcBorders>
             <w:tcMar>
-              <w:top w:w="45" w:type="dxa"/>
-              <w:start w:w="95" w:type="dxa"/>
-              <w:bottom w:w="45" w:type="dxa"/>
-              <w:end w:w="95" w:type="dxa"/>
+              <w:top w:w="85" w:type="dxa"/>
+              <w:start w:w="120" w:type="dxa"/>
+              <w:bottom w:w="85" w:type="dxa"/>
+              <w:end w:w="120" w:type="dxa"/>
             </w:tcMar>
             <w:vAlign w:val="center"/>
           </w:tcPr>
@@ -7381,7 +7491,7 @@
         </w:tc>
         <w:tc>
           <w:tcPr>
-            <w:tcW w:type="dxa" w:w="2520"/>
+            <w:tcW w:type="dxa" w:w="2558"/>
             <w:tcBorders>
               <w:top w:val="single" w:sz="6" w:space="0" w:color="E4E4E4"/>
               <w:left w:val="single" w:sz="6" w:space="0" w:color="E4E4E4"/>
@@ -7391,10 +7501,10 @@
               <w:insideV w:val="single" w:sz="6" w:space="0" w:color="E4E4E4"/>
             </w:tcBorders>
             <w:tcMar>
-              <w:top w:w="45" w:type="dxa"/>
-              <w:start w:w="95" w:type="dxa"/>
-              <w:bottom w:w="45" w:type="dxa"/>
-              <w:end w:w="95" w:type="dxa"/>
+              <w:top w:w="85" w:type="dxa"/>
+              <w:start w:w="120" w:type="dxa"/>
+              <w:bottom w:w="85" w:type="dxa"/>
+              <w:end w:w="120" w:type="dxa"/>
             </w:tcMar>
             <w:vAlign w:val="center"/>
           </w:tcPr>
@@ -7424,8 +7534,8 @@
         <w:tblLook w:firstColumn="1" w:firstRow="1" w:lastColumn="0" w:lastRow="0" w:noHBand="0" w:noVBand="1" w:val="04A0"/>
       </w:tblPr>
       <w:tblGrid>
-        <w:gridCol w:w="5083"/>
-        <w:gridCol w:w="5083"/>
+        <w:gridCol w:w="2880"/>
+        <w:gridCol w:w="6912"/>
       </w:tblGrid>
       <w:tr>
         <w:trPr>
@@ -7445,10 +7555,10 @@
               <w:insideV w:val="single" w:sz="6" w:space="0" w:color="E4E4E4"/>
             </w:tcBorders>
             <w:tcMar>
-              <w:top w:w="45" w:type="dxa"/>
-              <w:start w:w="95" w:type="dxa"/>
-              <w:bottom w:w="45" w:type="dxa"/>
-              <w:end w:w="95" w:type="dxa"/>
+              <w:top w:w="85" w:type="dxa"/>
+              <w:start w:w="120" w:type="dxa"/>
+              <w:bottom w:w="85" w:type="dxa"/>
+              <w:end w:w="120" w:type="dxa"/>
             </w:tcMar>
           </w:tcPr>
           <w:p>
@@ -7480,10 +7590,10 @@
               <w:insideV w:val="single" w:sz="6" w:space="0" w:color="E4E4E4"/>
             </w:tcBorders>
             <w:tcMar>
-              <w:top w:w="45" w:type="dxa"/>
-              <w:start w:w="95" w:type="dxa"/>
-              <w:bottom w:w="45" w:type="dxa"/>
-              <w:end w:w="95" w:type="dxa"/>
+              <w:top w:w="85" w:type="dxa"/>
+              <w:start w:w="120" w:type="dxa"/>
+              <w:bottom w:w="85" w:type="dxa"/>
+              <w:end w:w="120" w:type="dxa"/>
             </w:tcMar>
           </w:tcPr>
           <w:p>
@@ -7521,10 +7631,10 @@
               <w:insideV w:val="single" w:sz="6" w:space="0" w:color="E4E4E4"/>
             </w:tcBorders>
             <w:tcMar>
-              <w:top w:w="45" w:type="dxa"/>
-              <w:start w:w="95" w:type="dxa"/>
-              <w:bottom w:w="45" w:type="dxa"/>
-              <w:end w:w="95" w:type="dxa"/>
+              <w:top w:w="85" w:type="dxa"/>
+              <w:start w:w="120" w:type="dxa"/>
+              <w:bottom w:w="85" w:type="dxa"/>
+              <w:end w:w="120" w:type="dxa"/>
             </w:tcMar>
           </w:tcPr>
           <w:p>
@@ -7556,10 +7666,10 @@
               <w:insideV w:val="single" w:sz="6" w:space="0" w:color="E4E4E4"/>
             </w:tcBorders>
             <w:tcMar>
-              <w:top w:w="45" w:type="dxa"/>
-              <w:start w:w="95" w:type="dxa"/>
-              <w:bottom w:w="45" w:type="dxa"/>
-              <w:end w:w="95" w:type="dxa"/>
+              <w:top w:w="85" w:type="dxa"/>
+              <w:start w:w="120" w:type="dxa"/>
+              <w:bottom w:w="85" w:type="dxa"/>
+              <w:end w:w="120" w:type="dxa"/>
             </w:tcMar>
           </w:tcPr>
           <w:p>
@@ -7597,10 +7707,10 @@
               <w:insideV w:val="single" w:sz="6" w:space="0" w:color="E4E4E4"/>
             </w:tcBorders>
             <w:tcMar>
-              <w:top w:w="45" w:type="dxa"/>
-              <w:start w:w="95" w:type="dxa"/>
-              <w:bottom w:w="45" w:type="dxa"/>
-              <w:end w:w="95" w:type="dxa"/>
+              <w:top w:w="85" w:type="dxa"/>
+              <w:start w:w="120" w:type="dxa"/>
+              <w:bottom w:w="85" w:type="dxa"/>
+              <w:end w:w="120" w:type="dxa"/>
             </w:tcMar>
           </w:tcPr>
           <w:p>
@@ -7632,10 +7742,10 @@
               <w:insideV w:val="single" w:sz="6" w:space="0" w:color="E4E4E4"/>
             </w:tcBorders>
             <w:tcMar>
-              <w:top w:w="45" w:type="dxa"/>
-              <w:start w:w="95" w:type="dxa"/>
-              <w:bottom w:w="45" w:type="dxa"/>
-              <w:end w:w="95" w:type="dxa"/>
+              <w:top w:w="85" w:type="dxa"/>
+              <w:start w:w="120" w:type="dxa"/>
+              <w:bottom w:w="85" w:type="dxa"/>
+              <w:end w:w="120" w:type="dxa"/>
             </w:tcMar>
           </w:tcPr>
           <w:p>
@@ -7673,10 +7783,10 @@
               <w:insideV w:val="single" w:sz="6" w:space="0" w:color="E4E4E4"/>
             </w:tcBorders>
             <w:tcMar>
-              <w:top w:w="45" w:type="dxa"/>
-              <w:start w:w="95" w:type="dxa"/>
-              <w:bottom w:w="45" w:type="dxa"/>
-              <w:end w:w="95" w:type="dxa"/>
+              <w:top w:w="85" w:type="dxa"/>
+              <w:start w:w="120" w:type="dxa"/>
+              <w:bottom w:w="85" w:type="dxa"/>
+              <w:end w:w="120" w:type="dxa"/>
             </w:tcMar>
           </w:tcPr>
           <w:p>
@@ -7708,10 +7818,10 @@
               <w:insideV w:val="single" w:sz="6" w:space="0" w:color="E4E4E4"/>
             </w:tcBorders>
             <w:tcMar>
-              <w:top w:w="45" w:type="dxa"/>
-              <w:start w:w="95" w:type="dxa"/>
-              <w:bottom w:w="45" w:type="dxa"/>
-              <w:end w:w="95" w:type="dxa"/>
+              <w:top w:w="85" w:type="dxa"/>
+              <w:start w:w="120" w:type="dxa"/>
+              <w:bottom w:w="85" w:type="dxa"/>
+              <w:end w:w="120" w:type="dxa"/>
             </w:tcMar>
           </w:tcPr>
           <w:p>
@@ -7749,10 +7859,10 @@
               <w:insideV w:val="single" w:sz="6" w:space="0" w:color="E4E4E4"/>
             </w:tcBorders>
             <w:tcMar>
-              <w:top w:w="45" w:type="dxa"/>
-              <w:start w:w="95" w:type="dxa"/>
-              <w:bottom w:w="45" w:type="dxa"/>
-              <w:end w:w="95" w:type="dxa"/>
+              <w:top w:w="85" w:type="dxa"/>
+              <w:start w:w="120" w:type="dxa"/>
+              <w:bottom w:w="85" w:type="dxa"/>
+              <w:end w:w="120" w:type="dxa"/>
             </w:tcMar>
           </w:tcPr>
           <w:p>
@@ -7784,10 +7894,10 @@
               <w:insideV w:val="single" w:sz="6" w:space="0" w:color="E4E4E4"/>
             </w:tcBorders>
             <w:tcMar>
-              <w:top w:w="45" w:type="dxa"/>
-              <w:start w:w="95" w:type="dxa"/>
-              <w:bottom w:w="45" w:type="dxa"/>
-              <w:end w:w="95" w:type="dxa"/>
+              <w:top w:w="85" w:type="dxa"/>
+              <w:start w:w="120" w:type="dxa"/>
+              <w:bottom w:w="85" w:type="dxa"/>
+              <w:end w:w="120" w:type="dxa"/>
             </w:tcMar>
           </w:tcPr>
           <w:p>
@@ -8221,12 +8331,12 @@
     <w:qFormat/>
     <w:rsid w:val="00FC693F"/>
     <w:pPr>
-      <w:spacing w:after="100" w:line="240" w:lineRule="auto"/>
+      <w:spacing w:after="140" w:line="240" w:lineRule="auto"/>
     </w:pPr>
     <w:rPr>
       <w:rFonts w:ascii="Arial" w:hAnsi="Arial"/>
       <w:color w:val="202020"/>
-      <w:sz w:val="20"/>
+      <w:sz w:val="22"/>
     </w:rPr>
   </w:style>
   <w:style w:type="paragraph" w:styleId="Header">
@@ -8572,9 +8682,6 @@
     <w:rsid w:val="00FC693F"/>
     <w:pPr>
       <w:keepNext/>
-      <w:pBdr>
-        <w:bottom w:val="single" w:sz="8" w:space="4" w:color="4F81BD" w:themeColor="accent1"/>
-      </w:pBdr>
       <w:spacing w:after="80" w:line="240" w:lineRule="auto" w:before="0"/>
       <w:contextualSpacing/>
     </w:pPr>

</xml_diff>

<commit_message>
Simplify commercial sale order form and retain optional exceptions
</commit_message>
<xml_diff>
--- a/Docs/Commercial Sales Templates/Commercial Machine Sale Agreement.docx
+++ b/Docs/Commercial Sales Templates/Commercial Machine Sale Agreement.docx
@@ -3635,14 +3635,6 @@
         </w:tc>
       </w:tr>
     </w:tbl>
-    <w:p>
-      <w:pPr>
-        <w:pStyle w:val="Heading2"/>
-      </w:pPr>
-      <w:r>
-        <w:t>5. Transaction-Specific Terms</w:t>
-      </w:r>
-    </w:p>
     <w:tbl>
       <w:tblPr>
         <w:tblW w:type="auto" w:w="0"/>
@@ -3690,7 +3682,7 @@
                 <w:color w:val="202020"/>
                 <w:sz w:val="18"/>
               </w:rPr>
-              <w:t>Governing law</w:t>
+              <w:t>Special terms / agreed exceptions</w:t>
             </w:r>
           </w:p>
         </w:tc>
@@ -3725,235 +3717,7 @@
                 <w:color w:val="202020"/>
                 <w:sz w:val="18"/>
               </w:rPr>
-              <w:t>[California, unless another state is inserted]</w:t>
-            </w:r>
-          </w:p>
-        </w:tc>
-      </w:tr>
-      <w:tr>
-        <w:trPr>
-          <w:cantSplit/>
-        </w:trPr>
-        <w:tc>
-          <w:tcPr>
-            <w:tcW w:type="dxa" w:w="2880"/>
-            <w:shd w:fill="F6F6F6"/>
-            <w:vAlign w:val="center"/>
-            <w:tcBorders>
-              <w:top w:val="single" w:sz="6" w:space="0" w:color="E4E4E4"/>
-              <w:left w:val="single" w:sz="6" w:space="0" w:color="E4E4E4"/>
-              <w:bottom w:val="single" w:sz="6" w:space="0" w:color="E4E4E4"/>
-              <w:right w:val="single" w:sz="6" w:space="0" w:color="E4E4E4"/>
-              <w:insideH w:val="single" w:sz="6" w:space="0" w:color="E4E4E4"/>
-              <w:insideV w:val="single" w:sz="6" w:space="0" w:color="E4E4E4"/>
-            </w:tcBorders>
-            <w:tcMar>
-              <w:top w:w="85" w:type="dxa"/>
-              <w:start w:w="120" w:type="dxa"/>
-              <w:bottom w:w="85" w:type="dxa"/>
-              <w:end w:w="120" w:type="dxa"/>
-            </w:tcMar>
-          </w:tcPr>
-          <w:p>
-            <w:pPr>
-              <w:spacing w:after="0" w:line="240" w:lineRule="auto"/>
-            </w:pPr>
-            <w:r/>
-            <w:r>
-              <w:rPr>
-                <w:rFonts w:ascii="Arial" w:hAnsi="Arial"/>
-                <w:b/>
-                <w:color w:val="202020"/>
-                <w:sz w:val="18"/>
-              </w:rPr>
-              <w:t>Exclusive venue</w:t>
-            </w:r>
-          </w:p>
-        </w:tc>
-        <w:tc>
-          <w:tcPr>
-            <w:tcW w:type="dxa" w:w="6912"/>
-            <w:vAlign w:val="center"/>
-            <w:tcBorders>
-              <w:top w:val="single" w:sz="6" w:space="0" w:color="E4E4E4"/>
-              <w:left w:val="single" w:sz="6" w:space="0" w:color="E4E4E4"/>
-              <w:bottom w:val="single" w:sz="6" w:space="0" w:color="E4E4E4"/>
-              <w:right w:val="single" w:sz="6" w:space="0" w:color="E4E4E4"/>
-              <w:insideH w:val="single" w:sz="6" w:space="0" w:color="E4E4E4"/>
-              <w:insideV w:val="single" w:sz="6" w:space="0" w:color="E4E4E4"/>
-            </w:tcBorders>
-            <w:tcMar>
-              <w:top w:w="85" w:type="dxa"/>
-              <w:start w:w="120" w:type="dxa"/>
-              <w:bottom w:w="85" w:type="dxa"/>
-              <w:end w:w="120" w:type="dxa"/>
-            </w:tcMar>
-          </w:tcPr>
-          <w:p>
-            <w:pPr>
-              <w:spacing w:after="0" w:line="240" w:lineRule="auto"/>
-            </w:pPr>
-            <w:r/>
-            <w:r>
-              <w:rPr>
-                <w:rFonts w:ascii="Arial" w:hAnsi="Arial"/>
-                <w:b w:val="0"/>
-                <w:color w:val="202020"/>
-                <w:sz w:val="18"/>
-              </w:rPr>
-              <w:t>[County and state; default is Santa Clara County, California]</w:t>
-            </w:r>
-          </w:p>
-        </w:tc>
-      </w:tr>
-      <w:tr>
-        <w:trPr>
-          <w:cantSplit/>
-        </w:trPr>
-        <w:tc>
-          <w:tcPr>
-            <w:tcW w:type="dxa" w:w="2880"/>
-            <w:shd w:fill="F6F6F6"/>
-            <w:vAlign w:val="center"/>
-            <w:tcBorders>
-              <w:top w:val="single" w:sz="6" w:space="0" w:color="E4E4E4"/>
-              <w:left w:val="single" w:sz="6" w:space="0" w:color="E4E4E4"/>
-              <w:bottom w:val="single" w:sz="6" w:space="0" w:color="E4E4E4"/>
-              <w:right w:val="single" w:sz="6" w:space="0" w:color="E4E4E4"/>
-              <w:insideH w:val="single" w:sz="6" w:space="0" w:color="E4E4E4"/>
-              <w:insideV w:val="single" w:sz="6" w:space="0" w:color="E4E4E4"/>
-            </w:tcBorders>
-            <w:tcMar>
-              <w:top w:w="85" w:type="dxa"/>
-              <w:start w:w="120" w:type="dxa"/>
-              <w:bottom w:w="85" w:type="dxa"/>
-              <w:end w:w="120" w:type="dxa"/>
-            </w:tcMar>
-          </w:tcPr>
-          <w:p>
-            <w:pPr>
-              <w:spacing w:after="0" w:line="240" w:lineRule="auto"/>
-            </w:pPr>
-            <w:r/>
-            <w:r>
-              <w:rPr>
-                <w:rFonts w:ascii="Arial" w:hAnsi="Arial"/>
-                <w:b/>
-                <w:color w:val="202020"/>
-                <w:sz w:val="18"/>
-              </w:rPr>
-              <w:t>Buyer insurance requirement</w:t>
-            </w:r>
-          </w:p>
-        </w:tc>
-        <w:tc>
-          <w:tcPr>
-            <w:tcW w:type="dxa" w:w="6912"/>
-            <w:vAlign w:val="center"/>
-            <w:tcBorders>
-              <w:top w:val="single" w:sz="6" w:space="0" w:color="E4E4E4"/>
-              <w:left w:val="single" w:sz="6" w:space="0" w:color="E4E4E4"/>
-              <w:bottom w:val="single" w:sz="6" w:space="0" w:color="E4E4E4"/>
-              <w:right w:val="single" w:sz="6" w:space="0" w:color="E4E4E4"/>
-              <w:insideH w:val="single" w:sz="6" w:space="0" w:color="E4E4E4"/>
-              <w:insideV w:val="single" w:sz="6" w:space="0" w:color="E4E4E4"/>
-            </w:tcBorders>
-            <w:tcMar>
-              <w:top w:w="85" w:type="dxa"/>
-              <w:start w:w="120" w:type="dxa"/>
-              <w:bottom w:w="85" w:type="dxa"/>
-              <w:end w:w="120" w:type="dxa"/>
-            </w:tcMar>
-          </w:tcPr>
-          <w:p>
-            <w:pPr>
-              <w:spacing w:after="0" w:line="240" w:lineRule="auto"/>
-            </w:pPr>
-            <w:r/>
-            <w:r>
-              <w:rPr>
-                <w:rFonts w:ascii="Arial" w:hAnsi="Arial"/>
-                <w:b w:val="0"/>
-                <w:color w:val="202020"/>
-                <w:sz w:val="18"/>
-              </w:rPr>
-              <w:t>[Insert limits, if any]</w:t>
-            </w:r>
-          </w:p>
-        </w:tc>
-      </w:tr>
-      <w:tr>
-        <w:trPr>
-          <w:cantSplit/>
-        </w:trPr>
-        <w:tc>
-          <w:tcPr>
-            <w:tcW w:type="dxa" w:w="2880"/>
-            <w:shd w:fill="F6F6F6"/>
-            <w:vAlign w:val="center"/>
-            <w:tcBorders>
-              <w:top w:val="single" w:sz="6" w:space="0" w:color="E4E4E4"/>
-              <w:left w:val="single" w:sz="6" w:space="0" w:color="E4E4E4"/>
-              <w:bottom w:val="single" w:sz="6" w:space="0" w:color="E4E4E4"/>
-              <w:right w:val="single" w:sz="6" w:space="0" w:color="E4E4E4"/>
-              <w:insideH w:val="single" w:sz="6" w:space="0" w:color="E4E4E4"/>
-              <w:insideV w:val="single" w:sz="6" w:space="0" w:color="E4E4E4"/>
-            </w:tcBorders>
-            <w:tcMar>
-              <w:top w:w="85" w:type="dxa"/>
-              <w:start w:w="120" w:type="dxa"/>
-              <w:bottom w:w="85" w:type="dxa"/>
-              <w:end w:w="120" w:type="dxa"/>
-            </w:tcMar>
-          </w:tcPr>
-          <w:p>
-            <w:pPr>
-              <w:spacing w:after="0" w:line="240" w:lineRule="auto"/>
-            </w:pPr>
-            <w:r/>
-            <w:r>
-              <w:rPr>
-                <w:rFonts w:ascii="Arial" w:hAnsi="Arial"/>
-                <w:b/>
-                <w:color w:val="202020"/>
-                <w:sz w:val="18"/>
-              </w:rPr>
-              <w:t>Special terms</w:t>
-            </w:r>
-          </w:p>
-        </w:tc>
-        <w:tc>
-          <w:tcPr>
-            <w:tcW w:type="dxa" w:w="6912"/>
-            <w:vAlign w:val="center"/>
-            <w:tcBorders>
-              <w:top w:val="single" w:sz="6" w:space="0" w:color="E4E4E4"/>
-              <w:left w:val="single" w:sz="6" w:space="0" w:color="E4E4E4"/>
-              <w:bottom w:val="single" w:sz="6" w:space="0" w:color="E4E4E4"/>
-              <w:right w:val="single" w:sz="6" w:space="0" w:color="E4E4E4"/>
-              <w:insideH w:val="single" w:sz="6" w:space="0" w:color="E4E4E4"/>
-              <w:insideV w:val="single" w:sz="6" w:space="0" w:color="E4E4E4"/>
-            </w:tcBorders>
-            <w:tcMar>
-              <w:top w:w="85" w:type="dxa"/>
-              <w:start w:w="120" w:type="dxa"/>
-              <w:bottom w:w="85" w:type="dxa"/>
-              <w:end w:w="120" w:type="dxa"/>
-            </w:tcMar>
-          </w:tcPr>
-          <w:p>
-            <w:pPr>
-              <w:spacing w:after="0" w:line="240" w:lineRule="auto"/>
-            </w:pPr>
-            <w:r/>
-            <w:r>
-              <w:rPr>
-                <w:rFonts w:ascii="Arial" w:hAnsi="Arial"/>
-                <w:b w:val="0"/>
-                <w:color w:val="202020"/>
-                <w:sz w:val="18"/>
-              </w:rPr>
-              <w:t>[Insert or attach; write “None” if none]</w:t>
+              <w:t>[None]</w:t>
             </w:r>
           </w:p>
         </w:tc>
@@ -3964,7 +3728,7 @@
         <w:pStyle w:val="Heading2"/>
       </w:pPr>
       <w:r>
-        <w:t>6. Signatures</w:t>
+        <w:t>5. Signatures</w:t>
       </w:r>
     </w:p>
     <w:p>
@@ -4608,7 +4372,7 @@
         <w:t xml:space="preserve">19. Governing Law and Forum.  </w:t>
       </w:r>
       <w:r>
-        <w:t>The law identified in the Order Form governs without regard to conflict-of-law rules. The parties consent to the exclusive state and federal courts in the venue identified in the Order Form. If either field is blank, California law and the courts located in Santa Clara County, California apply. Before filing a claim other than for emergency injunctive relief or collection of an undisputed amount, an executive from each party will attempt in good faith to resolve the dispute for at least 15 days after written notice.</w:t>
+        <w:t>California law governs without regard to conflict-of-law rules, and the parties consent to the exclusive state and federal courts located in Santa Clara County, California, unless the Special terms / agreed exceptions in the Order Form expressly state otherwise. Before filing a claim other than for emergency injunctive relief or collection of an undisputed amount, an executive from each party will attempt in good faith to resolve the dispute for at least 15 days after written notice.</w:t>
       </w:r>
     </w:p>
     <w:p>

</xml_diff>

<commit_message>
Remove sale site readiness exhibit and its completion requirement
</commit_message>
<xml_diff>
--- a/Docs/Commercial Sales Templates/Commercial Machine Sale Agreement.docx
+++ b/Docs/Commercial Sales Templates/Commercial Machine Sale Agreement.docx
@@ -4170,7 +4170,7 @@
         <w:t xml:space="preserve">7. Site Readiness and Installation.  </w:t>
       </w:r>
       <w:r>
-        <w:t>Buyer is responsible for the site and for completing Exhibit C before delivery, including approved electrical service, stable network connectivity, level floor space, ventilation and clearances, venue authorization, sanitation access, loading access, and all permits not expressly covered by a separate signed agreement. Bloomjoy is not responsible for delay, damage, or service failure caused by an unready site, unauthorized installation, incompatible service, or Buyer’s contractors. Services beyond those listed in the Order Form require a written change order.</w:t>
+        <w:t>Buyer is responsible for preparing the site before delivery, including approved electrical service, stable network connectivity, level floor space, ventilation and clearances, venue authorization, sanitation access, loading access, and all permits not expressly covered by a separate signed agreement. Bloomjoy is not responsible for delay, damage, or service failure caused by an unready site, unauthorized installation, incompatible service, or Buyer’s contractors. Services beyond those listed in the Order Form require a written change order.</w:t>
       </w:r>
     </w:p>
     <w:p>
@@ -5814,1874 +5814,6 @@
         <w:t>Optional Bloomjoy Plus training, playbooks, portal features, or concierge benefits are governed only by the online subscription terms. Subscription status does not expand or reduce the express machine warranty unless a signed order expressly says so.</w:t>
       </w:r>
     </w:p>
-    <w:p>
-      <w:pPr>
-        <w:spacing w:before="0" w:after="0" w:lineRule="exact" w:line="20"/>
-      </w:pPr>
-      <w:r>
-        <w:rPr>
-          <w:sz w:val="2"/>
-        </w:rPr>
-        <w:br w:type="page"/>
-      </w:r>
-    </w:p>
-    <w:p>
-      <w:pPr>
-        <w:pStyle w:val="Heading1"/>
-      </w:pPr>
-      <w:r>
-        <w:t>EXHIBIT C — SITE READINESS CHECKLIST</w:t>
-      </w:r>
-    </w:p>
-    <w:p>
-      <w:pPr>
-        <w:widowControl/>
-      </w:pPr>
-      <w:r>
-        <w:rPr>
-          <w:i w:val="0"/>
-        </w:rPr>
-        <w:t>Buyer must complete and return this checklist no later than [10] business days before the requested delivery date. A checked item confirms completion, not merely an intention to complete it.</w:t>
-      </w:r>
-    </w:p>
-    <w:tbl>
-      <w:tblPr>
-        <w:tblW w:type="auto" w:w="0"/>
-        <w:jc w:val="center"/>
-        <w:tblLayout w:type="fixed"/>
-        <w:tblLook w:firstColumn="1" w:firstRow="1" w:lastColumn="0" w:lastRow="0" w:noHBand="0" w:noVBand="1" w:val="04A0"/>
-      </w:tblPr>
-      <w:tblGrid>
-        <w:gridCol w:w="804"/>
-        <w:gridCol w:w="6431"/>
-        <w:gridCol w:w="2558"/>
-      </w:tblGrid>
-      <w:tr>
-        <w:trPr>
-          <w:tblHeader w:val="true"/>
-        </w:trPr>
-        <w:tc>
-          <w:tcPr>
-            <w:tcW w:type="dxa" w:w="804"/>
-            <w:shd w:fill="FDEAF1"/>
-            <w:tcBorders>
-              <w:top w:val="single" w:sz="6" w:space="0" w:color="E4E4E4"/>
-              <w:left w:val="single" w:sz="6" w:space="0" w:color="E4E4E4"/>
-              <w:bottom w:val="single" w:sz="6" w:space="0" w:color="E4E4E4"/>
-              <w:right w:val="single" w:sz="6" w:space="0" w:color="E4E4E4"/>
-              <w:insideH w:val="single" w:sz="6" w:space="0" w:color="E4E4E4"/>
-              <w:insideV w:val="single" w:sz="6" w:space="0" w:color="E4E4E4"/>
-            </w:tcBorders>
-            <w:tcMar>
-              <w:top w:w="85" w:type="dxa"/>
-              <w:start w:w="120" w:type="dxa"/>
-              <w:bottom w:w="85" w:type="dxa"/>
-              <w:end w:w="120" w:type="dxa"/>
-            </w:tcMar>
-            <w:vAlign w:val="center"/>
-          </w:tcPr>
-          <w:p>
-            <w:pPr>
-              <w:spacing w:after="0" w:line="240" w:lineRule="auto"/>
-            </w:pPr>
-            <w:r/>
-            <w:r>
-              <w:rPr>
-                <w:rFonts w:ascii="Arial" w:hAnsi="Arial"/>
-                <w:b/>
-                <w:color w:val="202020"/>
-                <w:sz w:val="17"/>
-              </w:rPr>
-              <w:t>Ready</w:t>
-            </w:r>
-          </w:p>
-        </w:tc>
-        <w:tc>
-          <w:tcPr>
-            <w:tcW w:type="dxa" w:w="6431"/>
-            <w:shd w:fill="FDEAF1"/>
-            <w:tcBorders>
-              <w:top w:val="single" w:sz="6" w:space="0" w:color="E4E4E4"/>
-              <w:left w:val="single" w:sz="6" w:space="0" w:color="E4E4E4"/>
-              <w:bottom w:val="single" w:sz="6" w:space="0" w:color="E4E4E4"/>
-              <w:right w:val="single" w:sz="6" w:space="0" w:color="E4E4E4"/>
-              <w:insideH w:val="single" w:sz="6" w:space="0" w:color="E4E4E4"/>
-              <w:insideV w:val="single" w:sz="6" w:space="0" w:color="E4E4E4"/>
-            </w:tcBorders>
-            <w:tcMar>
-              <w:top w:w="85" w:type="dxa"/>
-              <w:start w:w="120" w:type="dxa"/>
-              <w:bottom w:w="85" w:type="dxa"/>
-              <w:end w:w="120" w:type="dxa"/>
-            </w:tcMar>
-            <w:vAlign w:val="center"/>
-          </w:tcPr>
-          <w:p>
-            <w:pPr>
-              <w:spacing w:after="0" w:line="240" w:lineRule="auto"/>
-            </w:pPr>
-            <w:r/>
-            <w:r>
-              <w:rPr>
-                <w:rFonts w:ascii="Arial" w:hAnsi="Arial"/>
-                <w:b/>
-                <w:color w:val="202020"/>
-                <w:sz w:val="17"/>
-              </w:rPr>
-              <w:t>Requirement</w:t>
-            </w:r>
-          </w:p>
-        </w:tc>
-        <w:tc>
-          <w:tcPr>
-            <w:tcW w:type="dxa" w:w="2558"/>
-            <w:shd w:fill="FDEAF1"/>
-            <w:tcBorders>
-              <w:top w:val="single" w:sz="6" w:space="0" w:color="E4E4E4"/>
-              <w:left w:val="single" w:sz="6" w:space="0" w:color="E4E4E4"/>
-              <w:bottom w:val="single" w:sz="6" w:space="0" w:color="E4E4E4"/>
-              <w:right w:val="single" w:sz="6" w:space="0" w:color="E4E4E4"/>
-              <w:insideH w:val="single" w:sz="6" w:space="0" w:color="E4E4E4"/>
-              <w:insideV w:val="single" w:sz="6" w:space="0" w:color="E4E4E4"/>
-            </w:tcBorders>
-            <w:tcMar>
-              <w:top w:w="85" w:type="dxa"/>
-              <w:start w:w="120" w:type="dxa"/>
-              <w:bottom w:w="85" w:type="dxa"/>
-              <w:end w:w="120" w:type="dxa"/>
-            </w:tcMar>
-            <w:vAlign w:val="center"/>
-          </w:tcPr>
-          <w:p>
-            <w:pPr>
-              <w:spacing w:after="0" w:line="240" w:lineRule="auto"/>
-            </w:pPr>
-            <w:r/>
-            <w:r>
-              <w:rPr>
-                <w:rFonts w:ascii="Arial" w:hAnsi="Arial"/>
-                <w:b/>
-                <w:color w:val="202020"/>
-                <w:sz w:val="17"/>
-              </w:rPr>
-              <w:t>Owner / notes</w:t>
-            </w:r>
-          </w:p>
-        </w:tc>
-      </w:tr>
-      <w:tr>
-        <w:trPr>
-          <w:cantSplit/>
-        </w:trPr>
-        <w:tc>
-          <w:tcPr>
-            <w:tcW w:type="dxa" w:w="804"/>
-            <w:tcBorders>
-              <w:top w:val="single" w:sz="6" w:space="0" w:color="E4E4E4"/>
-              <w:left w:val="single" w:sz="6" w:space="0" w:color="E4E4E4"/>
-              <w:bottom w:val="single" w:sz="6" w:space="0" w:color="E4E4E4"/>
-              <w:right w:val="single" w:sz="6" w:space="0" w:color="E4E4E4"/>
-              <w:insideH w:val="single" w:sz="6" w:space="0" w:color="E4E4E4"/>
-              <w:insideV w:val="single" w:sz="6" w:space="0" w:color="E4E4E4"/>
-            </w:tcBorders>
-            <w:tcMar>
-              <w:top w:w="85" w:type="dxa"/>
-              <w:start w:w="120" w:type="dxa"/>
-              <w:bottom w:w="85" w:type="dxa"/>
-              <w:end w:w="120" w:type="dxa"/>
-            </w:tcMar>
-            <w:vAlign w:val="center"/>
-          </w:tcPr>
-          <w:p>
-            <w:pPr>
-              <w:spacing w:after="0" w:line="240" w:lineRule="auto"/>
-            </w:pPr>
-            <w:r/>
-            <w:r>
-              <w:rPr>
-                <w:rFonts w:ascii="Arial" w:hAnsi="Arial"/>
-                <w:b w:val="0"/>
-                <w:color w:val="202020"/>
-                <w:sz w:val="17"/>
-              </w:rPr>
-              <w:t>☐</w:t>
-            </w:r>
-          </w:p>
-        </w:tc>
-        <w:tc>
-          <w:tcPr>
-            <w:tcW w:type="dxa" w:w="6431"/>
-            <w:tcBorders>
-              <w:top w:val="single" w:sz="6" w:space="0" w:color="E4E4E4"/>
-              <w:left w:val="single" w:sz="6" w:space="0" w:color="E4E4E4"/>
-              <w:bottom w:val="single" w:sz="6" w:space="0" w:color="E4E4E4"/>
-              <w:right w:val="single" w:sz="6" w:space="0" w:color="E4E4E4"/>
-              <w:insideH w:val="single" w:sz="6" w:space="0" w:color="E4E4E4"/>
-              <w:insideV w:val="single" w:sz="6" w:space="0" w:color="E4E4E4"/>
-            </w:tcBorders>
-            <w:tcMar>
-              <w:top w:w="85" w:type="dxa"/>
-              <w:start w:w="120" w:type="dxa"/>
-              <w:bottom w:w="85" w:type="dxa"/>
-              <w:end w:w="120" w:type="dxa"/>
-            </w:tcMar>
-            <w:vAlign w:val="center"/>
-          </w:tcPr>
-          <w:p>
-            <w:pPr>
-              <w:spacing w:after="0" w:line="240" w:lineRule="auto"/>
-            </w:pPr>
-            <w:r/>
-            <w:r>
-              <w:rPr>
-                <w:rFonts w:ascii="Arial" w:hAnsi="Arial"/>
-                <w:b w:val="0"/>
-                <w:color w:val="202020"/>
-                <w:sz w:val="17"/>
-              </w:rPr>
-              <w:t>Final placement and venue authorization confirmed</w:t>
-            </w:r>
-          </w:p>
-        </w:tc>
-        <w:tc>
-          <w:tcPr>
-            <w:tcW w:type="dxa" w:w="2558"/>
-            <w:tcBorders>
-              <w:top w:val="single" w:sz="6" w:space="0" w:color="E4E4E4"/>
-              <w:left w:val="single" w:sz="6" w:space="0" w:color="E4E4E4"/>
-              <w:bottom w:val="single" w:sz="6" w:space="0" w:color="E4E4E4"/>
-              <w:right w:val="single" w:sz="6" w:space="0" w:color="E4E4E4"/>
-              <w:insideH w:val="single" w:sz="6" w:space="0" w:color="E4E4E4"/>
-              <w:insideV w:val="single" w:sz="6" w:space="0" w:color="E4E4E4"/>
-            </w:tcBorders>
-            <w:tcMar>
-              <w:top w:w="85" w:type="dxa"/>
-              <w:start w:w="120" w:type="dxa"/>
-              <w:bottom w:w="85" w:type="dxa"/>
-              <w:end w:w="120" w:type="dxa"/>
-            </w:tcMar>
-            <w:vAlign w:val="center"/>
-          </w:tcPr>
-          <w:p>
-            <w:pPr>
-              <w:spacing w:after="0" w:line="240" w:lineRule="auto"/>
-            </w:pPr>
-            <w:r/>
-            <w:r>
-              <w:rPr>
-                <w:rFonts w:ascii="Arial" w:hAnsi="Arial"/>
-                <w:b w:val="0"/>
-                <w:color w:val="202020"/>
-                <w:sz w:val="17"/>
-              </w:rPr>
-              <w:t>[ ]</w:t>
-            </w:r>
-          </w:p>
-        </w:tc>
-      </w:tr>
-      <w:tr>
-        <w:trPr>
-          <w:cantSplit/>
-        </w:trPr>
-        <w:tc>
-          <w:tcPr>
-            <w:tcW w:type="dxa" w:w="804"/>
-            <w:tcBorders>
-              <w:top w:val="single" w:sz="6" w:space="0" w:color="E4E4E4"/>
-              <w:left w:val="single" w:sz="6" w:space="0" w:color="E4E4E4"/>
-              <w:bottom w:val="single" w:sz="6" w:space="0" w:color="E4E4E4"/>
-              <w:right w:val="single" w:sz="6" w:space="0" w:color="E4E4E4"/>
-              <w:insideH w:val="single" w:sz="6" w:space="0" w:color="E4E4E4"/>
-              <w:insideV w:val="single" w:sz="6" w:space="0" w:color="E4E4E4"/>
-            </w:tcBorders>
-            <w:tcMar>
-              <w:top w:w="85" w:type="dxa"/>
-              <w:start w:w="120" w:type="dxa"/>
-              <w:bottom w:w="85" w:type="dxa"/>
-              <w:end w:w="120" w:type="dxa"/>
-            </w:tcMar>
-            <w:vAlign w:val="center"/>
-          </w:tcPr>
-          <w:p>
-            <w:pPr>
-              <w:spacing w:after="0" w:line="240" w:lineRule="auto"/>
-            </w:pPr>
-            <w:r/>
-            <w:r>
-              <w:rPr>
-                <w:rFonts w:ascii="Arial" w:hAnsi="Arial"/>
-                <w:b w:val="0"/>
-                <w:color w:val="202020"/>
-                <w:sz w:val="17"/>
-              </w:rPr>
-              <w:t>☐</w:t>
-            </w:r>
-          </w:p>
-        </w:tc>
-        <w:tc>
-          <w:tcPr>
-            <w:tcW w:type="dxa" w:w="6431"/>
-            <w:tcBorders>
-              <w:top w:val="single" w:sz="6" w:space="0" w:color="E4E4E4"/>
-              <w:left w:val="single" w:sz="6" w:space="0" w:color="E4E4E4"/>
-              <w:bottom w:val="single" w:sz="6" w:space="0" w:color="E4E4E4"/>
-              <w:right w:val="single" w:sz="6" w:space="0" w:color="E4E4E4"/>
-              <w:insideH w:val="single" w:sz="6" w:space="0" w:color="E4E4E4"/>
-              <w:insideV w:val="single" w:sz="6" w:space="0" w:color="E4E4E4"/>
-            </w:tcBorders>
-            <w:tcMar>
-              <w:top w:w="85" w:type="dxa"/>
-              <w:start w:w="120" w:type="dxa"/>
-              <w:bottom w:w="85" w:type="dxa"/>
-              <w:end w:w="120" w:type="dxa"/>
-            </w:tcMar>
-            <w:vAlign w:val="center"/>
-          </w:tcPr>
-          <w:p>
-            <w:pPr>
-              <w:spacing w:after="0" w:line="240" w:lineRule="auto"/>
-            </w:pPr>
-            <w:r/>
-            <w:r>
-              <w:rPr>
-                <w:rFonts w:ascii="Arial" w:hAnsi="Arial"/>
-                <w:b w:val="0"/>
-                <w:color w:val="202020"/>
-                <w:sz w:val="17"/>
-              </w:rPr>
-              <w:t>Required permits, licenses, and food-safety approvals confirmed</w:t>
-            </w:r>
-          </w:p>
-        </w:tc>
-        <w:tc>
-          <w:tcPr>
-            <w:tcW w:type="dxa" w:w="2558"/>
-            <w:tcBorders>
-              <w:top w:val="single" w:sz="6" w:space="0" w:color="E4E4E4"/>
-              <w:left w:val="single" w:sz="6" w:space="0" w:color="E4E4E4"/>
-              <w:bottom w:val="single" w:sz="6" w:space="0" w:color="E4E4E4"/>
-              <w:right w:val="single" w:sz="6" w:space="0" w:color="E4E4E4"/>
-              <w:insideH w:val="single" w:sz="6" w:space="0" w:color="E4E4E4"/>
-              <w:insideV w:val="single" w:sz="6" w:space="0" w:color="E4E4E4"/>
-            </w:tcBorders>
-            <w:tcMar>
-              <w:top w:w="85" w:type="dxa"/>
-              <w:start w:w="120" w:type="dxa"/>
-              <w:bottom w:w="85" w:type="dxa"/>
-              <w:end w:w="120" w:type="dxa"/>
-            </w:tcMar>
-            <w:vAlign w:val="center"/>
-          </w:tcPr>
-          <w:p>
-            <w:pPr>
-              <w:spacing w:after="0" w:line="240" w:lineRule="auto"/>
-            </w:pPr>
-            <w:r/>
-            <w:r>
-              <w:rPr>
-                <w:rFonts w:ascii="Arial" w:hAnsi="Arial"/>
-                <w:b w:val="0"/>
-                <w:color w:val="202020"/>
-                <w:sz w:val="17"/>
-              </w:rPr>
-              <w:t>[ ]</w:t>
-            </w:r>
-          </w:p>
-        </w:tc>
-      </w:tr>
-      <w:tr>
-        <w:trPr>
-          <w:cantSplit/>
-        </w:trPr>
-        <w:tc>
-          <w:tcPr>
-            <w:tcW w:type="dxa" w:w="804"/>
-            <w:tcBorders>
-              <w:top w:val="single" w:sz="6" w:space="0" w:color="E4E4E4"/>
-              <w:left w:val="single" w:sz="6" w:space="0" w:color="E4E4E4"/>
-              <w:bottom w:val="single" w:sz="6" w:space="0" w:color="E4E4E4"/>
-              <w:right w:val="single" w:sz="6" w:space="0" w:color="E4E4E4"/>
-              <w:insideH w:val="single" w:sz="6" w:space="0" w:color="E4E4E4"/>
-              <w:insideV w:val="single" w:sz="6" w:space="0" w:color="E4E4E4"/>
-            </w:tcBorders>
-            <w:tcMar>
-              <w:top w:w="85" w:type="dxa"/>
-              <w:start w:w="120" w:type="dxa"/>
-              <w:bottom w:w="85" w:type="dxa"/>
-              <w:end w:w="120" w:type="dxa"/>
-            </w:tcMar>
-            <w:vAlign w:val="center"/>
-          </w:tcPr>
-          <w:p>
-            <w:pPr>
-              <w:spacing w:after="0" w:line="240" w:lineRule="auto"/>
-            </w:pPr>
-            <w:r/>
-            <w:r>
-              <w:rPr>
-                <w:rFonts w:ascii="Arial" w:hAnsi="Arial"/>
-                <w:b w:val="0"/>
-                <w:color w:val="202020"/>
-                <w:sz w:val="17"/>
-              </w:rPr>
-              <w:t>☐</w:t>
-            </w:r>
-          </w:p>
-        </w:tc>
-        <w:tc>
-          <w:tcPr>
-            <w:tcW w:type="dxa" w:w="6431"/>
-            <w:tcBorders>
-              <w:top w:val="single" w:sz="6" w:space="0" w:color="E4E4E4"/>
-              <w:left w:val="single" w:sz="6" w:space="0" w:color="E4E4E4"/>
-              <w:bottom w:val="single" w:sz="6" w:space="0" w:color="E4E4E4"/>
-              <w:right w:val="single" w:sz="6" w:space="0" w:color="E4E4E4"/>
-              <w:insideH w:val="single" w:sz="6" w:space="0" w:color="E4E4E4"/>
-              <w:insideV w:val="single" w:sz="6" w:space="0" w:color="E4E4E4"/>
-            </w:tcBorders>
-            <w:tcMar>
-              <w:top w:w="85" w:type="dxa"/>
-              <w:start w:w="120" w:type="dxa"/>
-              <w:bottom w:w="85" w:type="dxa"/>
-              <w:end w:w="120" w:type="dxa"/>
-            </w:tcMar>
-            <w:vAlign w:val="center"/>
-          </w:tcPr>
-          <w:p>
-            <w:pPr>
-              <w:spacing w:after="0" w:line="240" w:lineRule="auto"/>
-            </w:pPr>
-            <w:r/>
-            <w:r>
-              <w:rPr>
-                <w:rFonts w:ascii="Arial" w:hAnsi="Arial"/>
-                <w:b w:val="0"/>
-                <w:color w:val="202020"/>
-                <w:sz w:val="17"/>
-              </w:rPr>
-              <w:t>Level floor space, clearances, guest flow, and service access confirmed</w:t>
-            </w:r>
-          </w:p>
-        </w:tc>
-        <w:tc>
-          <w:tcPr>
-            <w:tcW w:type="dxa" w:w="2558"/>
-            <w:tcBorders>
-              <w:top w:val="single" w:sz="6" w:space="0" w:color="E4E4E4"/>
-              <w:left w:val="single" w:sz="6" w:space="0" w:color="E4E4E4"/>
-              <w:bottom w:val="single" w:sz="6" w:space="0" w:color="E4E4E4"/>
-              <w:right w:val="single" w:sz="6" w:space="0" w:color="E4E4E4"/>
-              <w:insideH w:val="single" w:sz="6" w:space="0" w:color="E4E4E4"/>
-              <w:insideV w:val="single" w:sz="6" w:space="0" w:color="E4E4E4"/>
-            </w:tcBorders>
-            <w:tcMar>
-              <w:top w:w="85" w:type="dxa"/>
-              <w:start w:w="120" w:type="dxa"/>
-              <w:bottom w:w="85" w:type="dxa"/>
-              <w:end w:w="120" w:type="dxa"/>
-            </w:tcMar>
-            <w:vAlign w:val="center"/>
-          </w:tcPr>
-          <w:p>
-            <w:pPr>
-              <w:spacing w:after="0" w:line="240" w:lineRule="auto"/>
-            </w:pPr>
-            <w:r/>
-            <w:r>
-              <w:rPr>
-                <w:rFonts w:ascii="Arial" w:hAnsi="Arial"/>
-                <w:b w:val="0"/>
-                <w:color w:val="202020"/>
-                <w:sz w:val="17"/>
-              </w:rPr>
-              <w:t>[ ]</w:t>
-            </w:r>
-          </w:p>
-        </w:tc>
-      </w:tr>
-      <w:tr>
-        <w:trPr>
-          <w:cantSplit/>
-        </w:trPr>
-        <w:tc>
-          <w:tcPr>
-            <w:tcW w:type="dxa" w:w="804"/>
-            <w:tcBorders>
-              <w:top w:val="single" w:sz="6" w:space="0" w:color="E4E4E4"/>
-              <w:left w:val="single" w:sz="6" w:space="0" w:color="E4E4E4"/>
-              <w:bottom w:val="single" w:sz="6" w:space="0" w:color="E4E4E4"/>
-              <w:right w:val="single" w:sz="6" w:space="0" w:color="E4E4E4"/>
-              <w:insideH w:val="single" w:sz="6" w:space="0" w:color="E4E4E4"/>
-              <w:insideV w:val="single" w:sz="6" w:space="0" w:color="E4E4E4"/>
-            </w:tcBorders>
-            <w:tcMar>
-              <w:top w:w="85" w:type="dxa"/>
-              <w:start w:w="120" w:type="dxa"/>
-              <w:bottom w:w="85" w:type="dxa"/>
-              <w:end w:w="120" w:type="dxa"/>
-            </w:tcMar>
-            <w:vAlign w:val="center"/>
-          </w:tcPr>
-          <w:p>
-            <w:pPr>
-              <w:spacing w:after="0" w:line="240" w:lineRule="auto"/>
-            </w:pPr>
-            <w:r/>
-            <w:r>
-              <w:rPr>
-                <w:rFonts w:ascii="Arial" w:hAnsi="Arial"/>
-                <w:b w:val="0"/>
-                <w:color w:val="202020"/>
-                <w:sz w:val="17"/>
-              </w:rPr>
-              <w:t>☐</w:t>
-            </w:r>
-          </w:p>
-        </w:tc>
-        <w:tc>
-          <w:tcPr>
-            <w:tcW w:type="dxa" w:w="6431"/>
-            <w:tcBorders>
-              <w:top w:val="single" w:sz="6" w:space="0" w:color="E4E4E4"/>
-              <w:left w:val="single" w:sz="6" w:space="0" w:color="E4E4E4"/>
-              <w:bottom w:val="single" w:sz="6" w:space="0" w:color="E4E4E4"/>
-              <w:right w:val="single" w:sz="6" w:space="0" w:color="E4E4E4"/>
-              <w:insideH w:val="single" w:sz="6" w:space="0" w:color="E4E4E4"/>
-              <w:insideV w:val="single" w:sz="6" w:space="0" w:color="E4E4E4"/>
-            </w:tcBorders>
-            <w:tcMar>
-              <w:top w:w="85" w:type="dxa"/>
-              <w:start w:w="120" w:type="dxa"/>
-              <w:bottom w:w="85" w:type="dxa"/>
-              <w:end w:w="120" w:type="dxa"/>
-            </w:tcMar>
-            <w:vAlign w:val="center"/>
-          </w:tcPr>
-          <w:p>
-            <w:pPr>
-              <w:spacing w:after="0" w:line="240" w:lineRule="auto"/>
-            </w:pPr>
-            <w:r/>
-            <w:r>
-              <w:rPr>
-                <w:rFonts w:ascii="Arial" w:hAnsi="Arial"/>
-                <w:b w:val="0"/>
-                <w:color w:val="202020"/>
-                <w:sz w:val="17"/>
-              </w:rPr>
-              <w:t>Correct dedicated electrical service and surge protection available</w:t>
-            </w:r>
-          </w:p>
-        </w:tc>
-        <w:tc>
-          <w:tcPr>
-            <w:tcW w:type="dxa" w:w="2558"/>
-            <w:tcBorders>
-              <w:top w:val="single" w:sz="6" w:space="0" w:color="E4E4E4"/>
-              <w:left w:val="single" w:sz="6" w:space="0" w:color="E4E4E4"/>
-              <w:bottom w:val="single" w:sz="6" w:space="0" w:color="E4E4E4"/>
-              <w:right w:val="single" w:sz="6" w:space="0" w:color="E4E4E4"/>
-              <w:insideH w:val="single" w:sz="6" w:space="0" w:color="E4E4E4"/>
-              <w:insideV w:val="single" w:sz="6" w:space="0" w:color="E4E4E4"/>
-            </w:tcBorders>
-            <w:tcMar>
-              <w:top w:w="85" w:type="dxa"/>
-              <w:start w:w="120" w:type="dxa"/>
-              <w:bottom w:w="85" w:type="dxa"/>
-              <w:end w:w="120" w:type="dxa"/>
-            </w:tcMar>
-            <w:vAlign w:val="center"/>
-          </w:tcPr>
-          <w:p>
-            <w:pPr>
-              <w:spacing w:after="0" w:line="240" w:lineRule="auto"/>
-            </w:pPr>
-            <w:r/>
-            <w:r>
-              <w:rPr>
-                <w:rFonts w:ascii="Arial" w:hAnsi="Arial"/>
-                <w:b w:val="0"/>
-                <w:color w:val="202020"/>
-                <w:sz w:val="17"/>
-              </w:rPr>
-              <w:t>[ ]</w:t>
-            </w:r>
-          </w:p>
-        </w:tc>
-      </w:tr>
-      <w:tr>
-        <w:trPr>
-          <w:cantSplit/>
-        </w:trPr>
-        <w:tc>
-          <w:tcPr>
-            <w:tcW w:type="dxa" w:w="804"/>
-            <w:tcBorders>
-              <w:top w:val="single" w:sz="6" w:space="0" w:color="E4E4E4"/>
-              <w:left w:val="single" w:sz="6" w:space="0" w:color="E4E4E4"/>
-              <w:bottom w:val="single" w:sz="6" w:space="0" w:color="E4E4E4"/>
-              <w:right w:val="single" w:sz="6" w:space="0" w:color="E4E4E4"/>
-              <w:insideH w:val="single" w:sz="6" w:space="0" w:color="E4E4E4"/>
-              <w:insideV w:val="single" w:sz="6" w:space="0" w:color="E4E4E4"/>
-            </w:tcBorders>
-            <w:tcMar>
-              <w:top w:w="85" w:type="dxa"/>
-              <w:start w:w="120" w:type="dxa"/>
-              <w:bottom w:w="85" w:type="dxa"/>
-              <w:end w:w="120" w:type="dxa"/>
-            </w:tcMar>
-            <w:vAlign w:val="center"/>
-          </w:tcPr>
-          <w:p>
-            <w:pPr>
-              <w:spacing w:after="0" w:line="240" w:lineRule="auto"/>
-            </w:pPr>
-            <w:r/>
-            <w:r>
-              <w:rPr>
-                <w:rFonts w:ascii="Arial" w:hAnsi="Arial"/>
-                <w:b w:val="0"/>
-                <w:color w:val="202020"/>
-                <w:sz w:val="17"/>
-              </w:rPr>
-              <w:t>☐</w:t>
-            </w:r>
-          </w:p>
-        </w:tc>
-        <w:tc>
-          <w:tcPr>
-            <w:tcW w:type="dxa" w:w="6431"/>
-            <w:tcBorders>
-              <w:top w:val="single" w:sz="6" w:space="0" w:color="E4E4E4"/>
-              <w:left w:val="single" w:sz="6" w:space="0" w:color="E4E4E4"/>
-              <w:bottom w:val="single" w:sz="6" w:space="0" w:color="E4E4E4"/>
-              <w:right w:val="single" w:sz="6" w:space="0" w:color="E4E4E4"/>
-              <w:insideH w:val="single" w:sz="6" w:space="0" w:color="E4E4E4"/>
-              <w:insideV w:val="single" w:sz="6" w:space="0" w:color="E4E4E4"/>
-            </w:tcBorders>
-            <w:tcMar>
-              <w:top w:w="85" w:type="dxa"/>
-              <w:start w:w="120" w:type="dxa"/>
-              <w:bottom w:w="85" w:type="dxa"/>
-              <w:end w:w="120" w:type="dxa"/>
-            </w:tcMar>
-            <w:vAlign w:val="center"/>
-          </w:tcPr>
-          <w:p>
-            <w:pPr>
-              <w:spacing w:after="0" w:line="240" w:lineRule="auto"/>
-            </w:pPr>
-            <w:r/>
-            <w:r>
-              <w:rPr>
-                <w:rFonts w:ascii="Arial" w:hAnsi="Arial"/>
-                <w:b w:val="0"/>
-                <w:color w:val="202020"/>
-                <w:sz w:val="17"/>
-              </w:rPr>
-              <w:t>Stable network / cellular service tested at placement</w:t>
-            </w:r>
-          </w:p>
-        </w:tc>
-        <w:tc>
-          <w:tcPr>
-            <w:tcW w:type="dxa" w:w="2558"/>
-            <w:tcBorders>
-              <w:top w:val="single" w:sz="6" w:space="0" w:color="E4E4E4"/>
-              <w:left w:val="single" w:sz="6" w:space="0" w:color="E4E4E4"/>
-              <w:bottom w:val="single" w:sz="6" w:space="0" w:color="E4E4E4"/>
-              <w:right w:val="single" w:sz="6" w:space="0" w:color="E4E4E4"/>
-              <w:insideH w:val="single" w:sz="6" w:space="0" w:color="E4E4E4"/>
-              <w:insideV w:val="single" w:sz="6" w:space="0" w:color="E4E4E4"/>
-            </w:tcBorders>
-            <w:tcMar>
-              <w:top w:w="85" w:type="dxa"/>
-              <w:start w:w="120" w:type="dxa"/>
-              <w:bottom w:w="85" w:type="dxa"/>
-              <w:end w:w="120" w:type="dxa"/>
-            </w:tcMar>
-            <w:vAlign w:val="center"/>
-          </w:tcPr>
-          <w:p>
-            <w:pPr>
-              <w:spacing w:after="0" w:line="240" w:lineRule="auto"/>
-            </w:pPr>
-            <w:r/>
-            <w:r>
-              <w:rPr>
-                <w:rFonts w:ascii="Arial" w:hAnsi="Arial"/>
-                <w:b w:val="0"/>
-                <w:color w:val="202020"/>
-                <w:sz w:val="17"/>
-              </w:rPr>
-              <w:t>[ ]</w:t>
-            </w:r>
-          </w:p>
-        </w:tc>
-      </w:tr>
-      <w:tr>
-        <w:trPr>
-          <w:cantSplit/>
-        </w:trPr>
-        <w:tc>
-          <w:tcPr>
-            <w:tcW w:type="dxa" w:w="804"/>
-            <w:tcBorders>
-              <w:top w:val="single" w:sz="6" w:space="0" w:color="E4E4E4"/>
-              <w:left w:val="single" w:sz="6" w:space="0" w:color="E4E4E4"/>
-              <w:bottom w:val="single" w:sz="6" w:space="0" w:color="E4E4E4"/>
-              <w:right w:val="single" w:sz="6" w:space="0" w:color="E4E4E4"/>
-              <w:insideH w:val="single" w:sz="6" w:space="0" w:color="E4E4E4"/>
-              <w:insideV w:val="single" w:sz="6" w:space="0" w:color="E4E4E4"/>
-            </w:tcBorders>
-            <w:tcMar>
-              <w:top w:w="85" w:type="dxa"/>
-              <w:start w:w="120" w:type="dxa"/>
-              <w:bottom w:w="85" w:type="dxa"/>
-              <w:end w:w="120" w:type="dxa"/>
-            </w:tcMar>
-            <w:vAlign w:val="center"/>
-          </w:tcPr>
-          <w:p>
-            <w:pPr>
-              <w:spacing w:after="0" w:line="240" w:lineRule="auto"/>
-            </w:pPr>
-            <w:r/>
-            <w:r>
-              <w:rPr>
-                <w:rFonts w:ascii="Arial" w:hAnsi="Arial"/>
-                <w:b w:val="0"/>
-                <w:color w:val="202020"/>
-                <w:sz w:val="17"/>
-              </w:rPr>
-              <w:t>☐</w:t>
-            </w:r>
-          </w:p>
-        </w:tc>
-        <w:tc>
-          <w:tcPr>
-            <w:tcW w:type="dxa" w:w="6431"/>
-            <w:tcBorders>
-              <w:top w:val="single" w:sz="6" w:space="0" w:color="E4E4E4"/>
-              <w:left w:val="single" w:sz="6" w:space="0" w:color="E4E4E4"/>
-              <w:bottom w:val="single" w:sz="6" w:space="0" w:color="E4E4E4"/>
-              <w:right w:val="single" w:sz="6" w:space="0" w:color="E4E4E4"/>
-              <w:insideH w:val="single" w:sz="6" w:space="0" w:color="E4E4E4"/>
-              <w:insideV w:val="single" w:sz="6" w:space="0" w:color="E4E4E4"/>
-            </w:tcBorders>
-            <w:tcMar>
-              <w:top w:w="85" w:type="dxa"/>
-              <w:start w:w="120" w:type="dxa"/>
-              <w:bottom w:w="85" w:type="dxa"/>
-              <w:end w:w="120" w:type="dxa"/>
-            </w:tcMar>
-            <w:vAlign w:val="center"/>
-          </w:tcPr>
-          <w:p>
-            <w:pPr>
-              <w:spacing w:after="0" w:line="240" w:lineRule="auto"/>
-            </w:pPr>
-            <w:r/>
-            <w:r>
-              <w:rPr>
-                <w:rFonts w:ascii="Arial" w:hAnsi="Arial"/>
-                <w:b w:val="0"/>
-                <w:color w:val="202020"/>
-                <w:sz w:val="17"/>
-              </w:rPr>
-              <w:t>Payment account, reader, and transaction settlement plan ready</w:t>
-            </w:r>
-          </w:p>
-        </w:tc>
-        <w:tc>
-          <w:tcPr>
-            <w:tcW w:type="dxa" w:w="2558"/>
-            <w:tcBorders>
-              <w:top w:val="single" w:sz="6" w:space="0" w:color="E4E4E4"/>
-              <w:left w:val="single" w:sz="6" w:space="0" w:color="E4E4E4"/>
-              <w:bottom w:val="single" w:sz="6" w:space="0" w:color="E4E4E4"/>
-              <w:right w:val="single" w:sz="6" w:space="0" w:color="E4E4E4"/>
-              <w:insideH w:val="single" w:sz="6" w:space="0" w:color="E4E4E4"/>
-              <w:insideV w:val="single" w:sz="6" w:space="0" w:color="E4E4E4"/>
-            </w:tcBorders>
-            <w:tcMar>
-              <w:top w:w="85" w:type="dxa"/>
-              <w:start w:w="120" w:type="dxa"/>
-              <w:bottom w:w="85" w:type="dxa"/>
-              <w:end w:w="120" w:type="dxa"/>
-            </w:tcMar>
-            <w:vAlign w:val="center"/>
-          </w:tcPr>
-          <w:p>
-            <w:pPr>
-              <w:spacing w:after="0" w:line="240" w:lineRule="auto"/>
-            </w:pPr>
-            <w:r/>
-            <w:r>
-              <w:rPr>
-                <w:rFonts w:ascii="Arial" w:hAnsi="Arial"/>
-                <w:b w:val="0"/>
-                <w:color w:val="202020"/>
-                <w:sz w:val="17"/>
-              </w:rPr>
-              <w:t>[ ]</w:t>
-            </w:r>
-          </w:p>
-        </w:tc>
-      </w:tr>
-      <w:tr>
-        <w:trPr>
-          <w:cantSplit/>
-        </w:trPr>
-        <w:tc>
-          <w:tcPr>
-            <w:tcW w:type="dxa" w:w="804"/>
-            <w:tcBorders>
-              <w:top w:val="single" w:sz="6" w:space="0" w:color="E4E4E4"/>
-              <w:left w:val="single" w:sz="6" w:space="0" w:color="E4E4E4"/>
-              <w:bottom w:val="single" w:sz="6" w:space="0" w:color="E4E4E4"/>
-              <w:right w:val="single" w:sz="6" w:space="0" w:color="E4E4E4"/>
-              <w:insideH w:val="single" w:sz="6" w:space="0" w:color="E4E4E4"/>
-              <w:insideV w:val="single" w:sz="6" w:space="0" w:color="E4E4E4"/>
-            </w:tcBorders>
-            <w:tcMar>
-              <w:top w:w="85" w:type="dxa"/>
-              <w:start w:w="120" w:type="dxa"/>
-              <w:bottom w:w="85" w:type="dxa"/>
-              <w:end w:w="120" w:type="dxa"/>
-            </w:tcMar>
-            <w:vAlign w:val="center"/>
-          </w:tcPr>
-          <w:p>
-            <w:pPr>
-              <w:spacing w:after="0" w:line="240" w:lineRule="auto"/>
-            </w:pPr>
-            <w:r/>
-            <w:r>
-              <w:rPr>
-                <w:rFonts w:ascii="Arial" w:hAnsi="Arial"/>
-                <w:b w:val="0"/>
-                <w:color w:val="202020"/>
-                <w:sz w:val="17"/>
-              </w:rPr>
-              <w:t>☐</w:t>
-            </w:r>
-          </w:p>
-        </w:tc>
-        <w:tc>
-          <w:tcPr>
-            <w:tcW w:type="dxa" w:w="6431"/>
-            <w:tcBorders>
-              <w:top w:val="single" w:sz="6" w:space="0" w:color="E4E4E4"/>
-              <w:left w:val="single" w:sz="6" w:space="0" w:color="E4E4E4"/>
-              <w:bottom w:val="single" w:sz="6" w:space="0" w:color="E4E4E4"/>
-              <w:right w:val="single" w:sz="6" w:space="0" w:color="E4E4E4"/>
-              <w:insideH w:val="single" w:sz="6" w:space="0" w:color="E4E4E4"/>
-              <w:insideV w:val="single" w:sz="6" w:space="0" w:color="E4E4E4"/>
-            </w:tcBorders>
-            <w:tcMar>
-              <w:top w:w="85" w:type="dxa"/>
-              <w:start w:w="120" w:type="dxa"/>
-              <w:bottom w:w="85" w:type="dxa"/>
-              <w:end w:w="120" w:type="dxa"/>
-            </w:tcMar>
-            <w:vAlign w:val="center"/>
-          </w:tcPr>
-          <w:p>
-            <w:pPr>
-              <w:spacing w:after="0" w:line="240" w:lineRule="auto"/>
-            </w:pPr>
-            <w:r/>
-            <w:r>
-              <w:rPr>
-                <w:rFonts w:ascii="Arial" w:hAnsi="Arial"/>
-                <w:b w:val="0"/>
-                <w:color w:val="202020"/>
-                <w:sz w:val="17"/>
-              </w:rPr>
-              <w:t>Loading path, dock/elevator, doorway dimensions, and unloading labor confirmed</w:t>
-            </w:r>
-          </w:p>
-        </w:tc>
-        <w:tc>
-          <w:tcPr>
-            <w:tcW w:type="dxa" w:w="2558"/>
-            <w:tcBorders>
-              <w:top w:val="single" w:sz="6" w:space="0" w:color="E4E4E4"/>
-              <w:left w:val="single" w:sz="6" w:space="0" w:color="E4E4E4"/>
-              <w:bottom w:val="single" w:sz="6" w:space="0" w:color="E4E4E4"/>
-              <w:right w:val="single" w:sz="6" w:space="0" w:color="E4E4E4"/>
-              <w:insideH w:val="single" w:sz="6" w:space="0" w:color="E4E4E4"/>
-              <w:insideV w:val="single" w:sz="6" w:space="0" w:color="E4E4E4"/>
-            </w:tcBorders>
-            <w:tcMar>
-              <w:top w:w="85" w:type="dxa"/>
-              <w:start w:w="120" w:type="dxa"/>
-              <w:bottom w:w="85" w:type="dxa"/>
-              <w:end w:w="120" w:type="dxa"/>
-            </w:tcMar>
-            <w:vAlign w:val="center"/>
-          </w:tcPr>
-          <w:p>
-            <w:pPr>
-              <w:spacing w:after="0" w:line="240" w:lineRule="auto"/>
-            </w:pPr>
-            <w:r/>
-            <w:r>
-              <w:rPr>
-                <w:rFonts w:ascii="Arial" w:hAnsi="Arial"/>
-                <w:b w:val="0"/>
-                <w:color w:val="202020"/>
-                <w:sz w:val="17"/>
-              </w:rPr>
-              <w:t>[ ]</w:t>
-            </w:r>
-          </w:p>
-        </w:tc>
-      </w:tr>
-      <w:tr>
-        <w:trPr>
-          <w:cantSplit/>
-        </w:trPr>
-        <w:tc>
-          <w:tcPr>
-            <w:tcW w:type="dxa" w:w="804"/>
-            <w:tcBorders>
-              <w:top w:val="single" w:sz="6" w:space="0" w:color="E4E4E4"/>
-              <w:left w:val="single" w:sz="6" w:space="0" w:color="E4E4E4"/>
-              <w:bottom w:val="single" w:sz="6" w:space="0" w:color="E4E4E4"/>
-              <w:right w:val="single" w:sz="6" w:space="0" w:color="E4E4E4"/>
-              <w:insideH w:val="single" w:sz="6" w:space="0" w:color="E4E4E4"/>
-              <w:insideV w:val="single" w:sz="6" w:space="0" w:color="E4E4E4"/>
-            </w:tcBorders>
-            <w:tcMar>
-              <w:top w:w="85" w:type="dxa"/>
-              <w:start w:w="120" w:type="dxa"/>
-              <w:bottom w:w="85" w:type="dxa"/>
-              <w:end w:w="120" w:type="dxa"/>
-            </w:tcMar>
-            <w:vAlign w:val="center"/>
-          </w:tcPr>
-          <w:p>
-            <w:pPr>
-              <w:spacing w:after="0" w:line="240" w:lineRule="auto"/>
-            </w:pPr>
-            <w:r/>
-            <w:r>
-              <w:rPr>
-                <w:rFonts w:ascii="Arial" w:hAnsi="Arial"/>
-                <w:b w:val="0"/>
-                <w:color w:val="202020"/>
-                <w:sz w:val="17"/>
-              </w:rPr>
-              <w:t>☐</w:t>
-            </w:r>
-          </w:p>
-        </w:tc>
-        <w:tc>
-          <w:tcPr>
-            <w:tcW w:type="dxa" w:w="6431"/>
-            <w:tcBorders>
-              <w:top w:val="single" w:sz="6" w:space="0" w:color="E4E4E4"/>
-              <w:left w:val="single" w:sz="6" w:space="0" w:color="E4E4E4"/>
-              <w:bottom w:val="single" w:sz="6" w:space="0" w:color="E4E4E4"/>
-              <w:right w:val="single" w:sz="6" w:space="0" w:color="E4E4E4"/>
-              <w:insideH w:val="single" w:sz="6" w:space="0" w:color="E4E4E4"/>
-              <w:insideV w:val="single" w:sz="6" w:space="0" w:color="E4E4E4"/>
-            </w:tcBorders>
-            <w:tcMar>
-              <w:top w:w="85" w:type="dxa"/>
-              <w:start w:w="120" w:type="dxa"/>
-              <w:bottom w:w="85" w:type="dxa"/>
-              <w:end w:w="120" w:type="dxa"/>
-            </w:tcMar>
-            <w:vAlign w:val="center"/>
-          </w:tcPr>
-          <w:p>
-            <w:pPr>
-              <w:spacing w:after="0" w:line="240" w:lineRule="auto"/>
-            </w:pPr>
-            <w:r/>
-            <w:r>
-              <w:rPr>
-                <w:rFonts w:ascii="Arial" w:hAnsi="Arial"/>
-                <w:b w:val="0"/>
-                <w:color w:val="202020"/>
-                <w:sz w:val="17"/>
-              </w:rPr>
-              <w:t>Cleaning, handwashing, water, waste, pest-control, and sanitation plan ready</w:t>
-            </w:r>
-          </w:p>
-        </w:tc>
-        <w:tc>
-          <w:tcPr>
-            <w:tcW w:type="dxa" w:w="2558"/>
-            <w:tcBorders>
-              <w:top w:val="single" w:sz="6" w:space="0" w:color="E4E4E4"/>
-              <w:left w:val="single" w:sz="6" w:space="0" w:color="E4E4E4"/>
-              <w:bottom w:val="single" w:sz="6" w:space="0" w:color="E4E4E4"/>
-              <w:right w:val="single" w:sz="6" w:space="0" w:color="E4E4E4"/>
-              <w:insideH w:val="single" w:sz="6" w:space="0" w:color="E4E4E4"/>
-              <w:insideV w:val="single" w:sz="6" w:space="0" w:color="E4E4E4"/>
-            </w:tcBorders>
-            <w:tcMar>
-              <w:top w:w="85" w:type="dxa"/>
-              <w:start w:w="120" w:type="dxa"/>
-              <w:bottom w:w="85" w:type="dxa"/>
-              <w:end w:w="120" w:type="dxa"/>
-            </w:tcMar>
-            <w:vAlign w:val="center"/>
-          </w:tcPr>
-          <w:p>
-            <w:pPr>
-              <w:spacing w:after="0" w:line="240" w:lineRule="auto"/>
-            </w:pPr>
-            <w:r/>
-            <w:r>
-              <w:rPr>
-                <w:rFonts w:ascii="Arial" w:hAnsi="Arial"/>
-                <w:b w:val="0"/>
-                <w:color w:val="202020"/>
-                <w:sz w:val="17"/>
-              </w:rPr>
-              <w:t>[ ]</w:t>
-            </w:r>
-          </w:p>
-        </w:tc>
-      </w:tr>
-      <w:tr>
-        <w:trPr>
-          <w:cantSplit/>
-        </w:trPr>
-        <w:tc>
-          <w:tcPr>
-            <w:tcW w:type="dxa" w:w="804"/>
-            <w:tcBorders>
-              <w:top w:val="single" w:sz="6" w:space="0" w:color="E4E4E4"/>
-              <w:left w:val="single" w:sz="6" w:space="0" w:color="E4E4E4"/>
-              <w:bottom w:val="single" w:sz="6" w:space="0" w:color="E4E4E4"/>
-              <w:right w:val="single" w:sz="6" w:space="0" w:color="E4E4E4"/>
-              <w:insideH w:val="single" w:sz="6" w:space="0" w:color="E4E4E4"/>
-              <w:insideV w:val="single" w:sz="6" w:space="0" w:color="E4E4E4"/>
-            </w:tcBorders>
-            <w:tcMar>
-              <w:top w:w="85" w:type="dxa"/>
-              <w:start w:w="120" w:type="dxa"/>
-              <w:bottom w:w="85" w:type="dxa"/>
-              <w:end w:w="120" w:type="dxa"/>
-            </w:tcMar>
-            <w:vAlign w:val="center"/>
-          </w:tcPr>
-          <w:p>
-            <w:pPr>
-              <w:spacing w:after="0" w:line="240" w:lineRule="auto"/>
-            </w:pPr>
-            <w:r/>
-            <w:r>
-              <w:rPr>
-                <w:rFonts w:ascii="Arial" w:hAnsi="Arial"/>
-                <w:b w:val="0"/>
-                <w:color w:val="202020"/>
-                <w:sz w:val="17"/>
-              </w:rPr>
-              <w:t>☐</w:t>
-            </w:r>
-          </w:p>
-        </w:tc>
-        <w:tc>
-          <w:tcPr>
-            <w:tcW w:type="dxa" w:w="6431"/>
-            <w:tcBorders>
-              <w:top w:val="single" w:sz="6" w:space="0" w:color="E4E4E4"/>
-              <w:left w:val="single" w:sz="6" w:space="0" w:color="E4E4E4"/>
-              <w:bottom w:val="single" w:sz="6" w:space="0" w:color="E4E4E4"/>
-              <w:right w:val="single" w:sz="6" w:space="0" w:color="E4E4E4"/>
-              <w:insideH w:val="single" w:sz="6" w:space="0" w:color="E4E4E4"/>
-              <w:insideV w:val="single" w:sz="6" w:space="0" w:color="E4E4E4"/>
-            </w:tcBorders>
-            <w:tcMar>
-              <w:top w:w="85" w:type="dxa"/>
-              <w:start w:w="120" w:type="dxa"/>
-              <w:bottom w:w="85" w:type="dxa"/>
-              <w:end w:w="120" w:type="dxa"/>
-            </w:tcMar>
-            <w:vAlign w:val="center"/>
-          </w:tcPr>
-          <w:p>
-            <w:pPr>
-              <w:spacing w:after="0" w:line="240" w:lineRule="auto"/>
-            </w:pPr>
-            <w:r/>
-            <w:r>
-              <w:rPr>
-                <w:rFonts w:ascii="Arial" w:hAnsi="Arial"/>
-                <w:b w:val="0"/>
-                <w:color w:val="202020"/>
-                <w:sz w:val="17"/>
-              </w:rPr>
-              <w:t>Approved sugar, sticks, tools, and initial stock available</w:t>
-            </w:r>
-          </w:p>
-        </w:tc>
-        <w:tc>
-          <w:tcPr>
-            <w:tcW w:type="dxa" w:w="2558"/>
-            <w:tcBorders>
-              <w:top w:val="single" w:sz="6" w:space="0" w:color="E4E4E4"/>
-              <w:left w:val="single" w:sz="6" w:space="0" w:color="E4E4E4"/>
-              <w:bottom w:val="single" w:sz="6" w:space="0" w:color="E4E4E4"/>
-              <w:right w:val="single" w:sz="6" w:space="0" w:color="E4E4E4"/>
-              <w:insideH w:val="single" w:sz="6" w:space="0" w:color="E4E4E4"/>
-              <w:insideV w:val="single" w:sz="6" w:space="0" w:color="E4E4E4"/>
-            </w:tcBorders>
-            <w:tcMar>
-              <w:top w:w="85" w:type="dxa"/>
-              <w:start w:w="120" w:type="dxa"/>
-              <w:bottom w:w="85" w:type="dxa"/>
-              <w:end w:w="120" w:type="dxa"/>
-            </w:tcMar>
-            <w:vAlign w:val="center"/>
-          </w:tcPr>
-          <w:p>
-            <w:pPr>
-              <w:spacing w:after="0" w:line="240" w:lineRule="auto"/>
-            </w:pPr>
-            <w:r/>
-            <w:r>
-              <w:rPr>
-                <w:rFonts w:ascii="Arial" w:hAnsi="Arial"/>
-                <w:b w:val="0"/>
-                <w:color w:val="202020"/>
-                <w:sz w:val="17"/>
-              </w:rPr>
-              <w:t>[ ]</w:t>
-            </w:r>
-          </w:p>
-        </w:tc>
-      </w:tr>
-      <w:tr>
-        <w:trPr>
-          <w:cantSplit/>
-        </w:trPr>
-        <w:tc>
-          <w:tcPr>
-            <w:tcW w:type="dxa" w:w="804"/>
-            <w:tcBorders>
-              <w:top w:val="single" w:sz="6" w:space="0" w:color="E4E4E4"/>
-              <w:left w:val="single" w:sz="6" w:space="0" w:color="E4E4E4"/>
-              <w:bottom w:val="single" w:sz="6" w:space="0" w:color="E4E4E4"/>
-              <w:right w:val="single" w:sz="6" w:space="0" w:color="E4E4E4"/>
-              <w:insideH w:val="single" w:sz="6" w:space="0" w:color="E4E4E4"/>
-              <w:insideV w:val="single" w:sz="6" w:space="0" w:color="E4E4E4"/>
-            </w:tcBorders>
-            <w:tcMar>
-              <w:top w:w="85" w:type="dxa"/>
-              <w:start w:w="120" w:type="dxa"/>
-              <w:bottom w:w="85" w:type="dxa"/>
-              <w:end w:w="120" w:type="dxa"/>
-            </w:tcMar>
-            <w:vAlign w:val="center"/>
-          </w:tcPr>
-          <w:p>
-            <w:pPr>
-              <w:spacing w:after="0" w:line="240" w:lineRule="auto"/>
-            </w:pPr>
-            <w:r/>
-            <w:r>
-              <w:rPr>
-                <w:rFonts w:ascii="Arial" w:hAnsi="Arial"/>
-                <w:b w:val="0"/>
-                <w:color w:val="202020"/>
-                <w:sz w:val="17"/>
-              </w:rPr>
-              <w:t>☐</w:t>
-            </w:r>
-          </w:p>
-        </w:tc>
-        <w:tc>
-          <w:tcPr>
-            <w:tcW w:type="dxa" w:w="6431"/>
-            <w:tcBorders>
-              <w:top w:val="single" w:sz="6" w:space="0" w:color="E4E4E4"/>
-              <w:left w:val="single" w:sz="6" w:space="0" w:color="E4E4E4"/>
-              <w:bottom w:val="single" w:sz="6" w:space="0" w:color="E4E4E4"/>
-              <w:right w:val="single" w:sz="6" w:space="0" w:color="E4E4E4"/>
-              <w:insideH w:val="single" w:sz="6" w:space="0" w:color="E4E4E4"/>
-              <w:insideV w:val="single" w:sz="6" w:space="0" w:color="E4E4E4"/>
-            </w:tcBorders>
-            <w:tcMar>
-              <w:top w:w="85" w:type="dxa"/>
-              <w:start w:w="120" w:type="dxa"/>
-              <w:bottom w:w="85" w:type="dxa"/>
-              <w:end w:w="120" w:type="dxa"/>
-            </w:tcMar>
-            <w:vAlign w:val="center"/>
-          </w:tcPr>
-          <w:p>
-            <w:pPr>
-              <w:spacing w:after="0" w:line="240" w:lineRule="auto"/>
-            </w:pPr>
-            <w:r/>
-            <w:r>
-              <w:rPr>
-                <w:rFonts w:ascii="Arial" w:hAnsi="Arial"/>
-                <w:b w:val="0"/>
-                <w:color w:val="202020"/>
-                <w:sz w:val="17"/>
-              </w:rPr>
-              <w:t>Authorized operators identified and training scheduled</w:t>
-            </w:r>
-          </w:p>
-        </w:tc>
-        <w:tc>
-          <w:tcPr>
-            <w:tcW w:type="dxa" w:w="2558"/>
-            <w:tcBorders>
-              <w:top w:val="single" w:sz="6" w:space="0" w:color="E4E4E4"/>
-              <w:left w:val="single" w:sz="6" w:space="0" w:color="E4E4E4"/>
-              <w:bottom w:val="single" w:sz="6" w:space="0" w:color="E4E4E4"/>
-              <w:right w:val="single" w:sz="6" w:space="0" w:color="E4E4E4"/>
-              <w:insideH w:val="single" w:sz="6" w:space="0" w:color="E4E4E4"/>
-              <w:insideV w:val="single" w:sz="6" w:space="0" w:color="E4E4E4"/>
-            </w:tcBorders>
-            <w:tcMar>
-              <w:top w:w="85" w:type="dxa"/>
-              <w:start w:w="120" w:type="dxa"/>
-              <w:bottom w:w="85" w:type="dxa"/>
-              <w:end w:w="120" w:type="dxa"/>
-            </w:tcMar>
-            <w:vAlign w:val="center"/>
-          </w:tcPr>
-          <w:p>
-            <w:pPr>
-              <w:spacing w:after="0" w:line="240" w:lineRule="auto"/>
-            </w:pPr>
-            <w:r/>
-            <w:r>
-              <w:rPr>
-                <w:rFonts w:ascii="Arial" w:hAnsi="Arial"/>
-                <w:b w:val="0"/>
-                <w:color w:val="202020"/>
-                <w:sz w:val="17"/>
-              </w:rPr>
-              <w:t>[ ]</w:t>
-            </w:r>
-          </w:p>
-        </w:tc>
-      </w:tr>
-      <w:tr>
-        <w:trPr>
-          <w:cantSplit/>
-        </w:trPr>
-        <w:tc>
-          <w:tcPr>
-            <w:tcW w:type="dxa" w:w="804"/>
-            <w:tcBorders>
-              <w:top w:val="single" w:sz="6" w:space="0" w:color="E4E4E4"/>
-              <w:left w:val="single" w:sz="6" w:space="0" w:color="E4E4E4"/>
-              <w:bottom w:val="single" w:sz="6" w:space="0" w:color="E4E4E4"/>
-              <w:right w:val="single" w:sz="6" w:space="0" w:color="E4E4E4"/>
-              <w:insideH w:val="single" w:sz="6" w:space="0" w:color="E4E4E4"/>
-              <w:insideV w:val="single" w:sz="6" w:space="0" w:color="E4E4E4"/>
-            </w:tcBorders>
-            <w:tcMar>
-              <w:top w:w="85" w:type="dxa"/>
-              <w:start w:w="120" w:type="dxa"/>
-              <w:bottom w:w="85" w:type="dxa"/>
-              <w:end w:w="120" w:type="dxa"/>
-            </w:tcMar>
-            <w:vAlign w:val="center"/>
-          </w:tcPr>
-          <w:p>
-            <w:pPr>
-              <w:spacing w:after="0" w:line="240" w:lineRule="auto"/>
-            </w:pPr>
-            <w:r/>
-            <w:r>
-              <w:rPr>
-                <w:rFonts w:ascii="Arial" w:hAnsi="Arial"/>
-                <w:b w:val="0"/>
-                <w:color w:val="202020"/>
-                <w:sz w:val="17"/>
-              </w:rPr>
-              <w:t>☐</w:t>
-            </w:r>
-          </w:p>
-        </w:tc>
-        <w:tc>
-          <w:tcPr>
-            <w:tcW w:type="dxa" w:w="6431"/>
-            <w:tcBorders>
-              <w:top w:val="single" w:sz="6" w:space="0" w:color="E4E4E4"/>
-              <w:left w:val="single" w:sz="6" w:space="0" w:color="E4E4E4"/>
-              <w:bottom w:val="single" w:sz="6" w:space="0" w:color="E4E4E4"/>
-              <w:right w:val="single" w:sz="6" w:space="0" w:color="E4E4E4"/>
-              <w:insideH w:val="single" w:sz="6" w:space="0" w:color="E4E4E4"/>
-              <w:insideV w:val="single" w:sz="6" w:space="0" w:color="E4E4E4"/>
-            </w:tcBorders>
-            <w:tcMar>
-              <w:top w:w="85" w:type="dxa"/>
-              <w:start w:w="120" w:type="dxa"/>
-              <w:bottom w:w="85" w:type="dxa"/>
-              <w:end w:w="120" w:type="dxa"/>
-            </w:tcMar>
-            <w:vAlign w:val="center"/>
-          </w:tcPr>
-          <w:p>
-            <w:pPr>
-              <w:spacing w:after="0" w:line="240" w:lineRule="auto"/>
-            </w:pPr>
-            <w:r/>
-            <w:r>
-              <w:rPr>
-                <w:rFonts w:ascii="Arial" w:hAnsi="Arial"/>
-                <w:b w:val="0"/>
-                <w:color w:val="202020"/>
-                <w:sz w:val="17"/>
-              </w:rPr>
-              <w:t>Insurance and site-required certificates delivered</w:t>
-            </w:r>
-          </w:p>
-        </w:tc>
-        <w:tc>
-          <w:tcPr>
-            <w:tcW w:type="dxa" w:w="2558"/>
-            <w:tcBorders>
-              <w:top w:val="single" w:sz="6" w:space="0" w:color="E4E4E4"/>
-              <w:left w:val="single" w:sz="6" w:space="0" w:color="E4E4E4"/>
-              <w:bottom w:val="single" w:sz="6" w:space="0" w:color="E4E4E4"/>
-              <w:right w:val="single" w:sz="6" w:space="0" w:color="E4E4E4"/>
-              <w:insideH w:val="single" w:sz="6" w:space="0" w:color="E4E4E4"/>
-              <w:insideV w:val="single" w:sz="6" w:space="0" w:color="E4E4E4"/>
-            </w:tcBorders>
-            <w:tcMar>
-              <w:top w:w="85" w:type="dxa"/>
-              <w:start w:w="120" w:type="dxa"/>
-              <w:bottom w:w="85" w:type="dxa"/>
-              <w:end w:w="120" w:type="dxa"/>
-            </w:tcMar>
-            <w:vAlign w:val="center"/>
-          </w:tcPr>
-          <w:p>
-            <w:pPr>
-              <w:spacing w:after="0" w:line="240" w:lineRule="auto"/>
-            </w:pPr>
-            <w:r/>
-            <w:r>
-              <w:rPr>
-                <w:rFonts w:ascii="Arial" w:hAnsi="Arial"/>
-                <w:b w:val="0"/>
-                <w:color w:val="202020"/>
-                <w:sz w:val="17"/>
-              </w:rPr>
-              <w:t>[ ]</w:t>
-            </w:r>
-          </w:p>
-        </w:tc>
-      </w:tr>
-      <w:tr>
-        <w:trPr>
-          <w:cantSplit/>
-        </w:trPr>
-        <w:tc>
-          <w:tcPr>
-            <w:tcW w:type="dxa" w:w="804"/>
-            <w:tcBorders>
-              <w:top w:val="single" w:sz="6" w:space="0" w:color="E4E4E4"/>
-              <w:left w:val="single" w:sz="6" w:space="0" w:color="E4E4E4"/>
-              <w:bottom w:val="single" w:sz="6" w:space="0" w:color="E4E4E4"/>
-              <w:right w:val="single" w:sz="6" w:space="0" w:color="E4E4E4"/>
-              <w:insideH w:val="single" w:sz="6" w:space="0" w:color="E4E4E4"/>
-              <w:insideV w:val="single" w:sz="6" w:space="0" w:color="E4E4E4"/>
-            </w:tcBorders>
-            <w:tcMar>
-              <w:top w:w="85" w:type="dxa"/>
-              <w:start w:w="120" w:type="dxa"/>
-              <w:bottom w:w="85" w:type="dxa"/>
-              <w:end w:w="120" w:type="dxa"/>
-            </w:tcMar>
-            <w:vAlign w:val="center"/>
-          </w:tcPr>
-          <w:p>
-            <w:pPr>
-              <w:spacing w:after="0" w:line="240" w:lineRule="auto"/>
-            </w:pPr>
-            <w:r/>
-            <w:r>
-              <w:rPr>
-                <w:rFonts w:ascii="Arial" w:hAnsi="Arial"/>
-                <w:b w:val="0"/>
-                <w:color w:val="202020"/>
-                <w:sz w:val="17"/>
-              </w:rPr>
-              <w:t>☐</w:t>
-            </w:r>
-          </w:p>
-        </w:tc>
-        <w:tc>
-          <w:tcPr>
-            <w:tcW w:type="dxa" w:w="6431"/>
-            <w:tcBorders>
-              <w:top w:val="single" w:sz="6" w:space="0" w:color="E4E4E4"/>
-              <w:left w:val="single" w:sz="6" w:space="0" w:color="E4E4E4"/>
-              <w:bottom w:val="single" w:sz="6" w:space="0" w:color="E4E4E4"/>
-              <w:right w:val="single" w:sz="6" w:space="0" w:color="E4E4E4"/>
-              <w:insideH w:val="single" w:sz="6" w:space="0" w:color="E4E4E4"/>
-              <w:insideV w:val="single" w:sz="6" w:space="0" w:color="E4E4E4"/>
-            </w:tcBorders>
-            <w:tcMar>
-              <w:top w:w="85" w:type="dxa"/>
-              <w:start w:w="120" w:type="dxa"/>
-              <w:bottom w:w="85" w:type="dxa"/>
-              <w:end w:w="120" w:type="dxa"/>
-            </w:tcMar>
-            <w:vAlign w:val="center"/>
-          </w:tcPr>
-          <w:p>
-            <w:pPr>
-              <w:spacing w:after="0" w:line="240" w:lineRule="auto"/>
-            </w:pPr>
-            <w:r/>
-            <w:r>
-              <w:rPr>
-                <w:rFonts w:ascii="Arial" w:hAnsi="Arial"/>
-                <w:b w:val="0"/>
-                <w:color w:val="202020"/>
-                <w:sz w:val="17"/>
-              </w:rPr>
-              <w:t>Secure storage and after-hours access plan confirmed</w:t>
-            </w:r>
-          </w:p>
-        </w:tc>
-        <w:tc>
-          <w:tcPr>
-            <w:tcW w:type="dxa" w:w="2558"/>
-            <w:tcBorders>
-              <w:top w:val="single" w:sz="6" w:space="0" w:color="E4E4E4"/>
-              <w:left w:val="single" w:sz="6" w:space="0" w:color="E4E4E4"/>
-              <w:bottom w:val="single" w:sz="6" w:space="0" w:color="E4E4E4"/>
-              <w:right w:val="single" w:sz="6" w:space="0" w:color="E4E4E4"/>
-              <w:insideH w:val="single" w:sz="6" w:space="0" w:color="E4E4E4"/>
-              <w:insideV w:val="single" w:sz="6" w:space="0" w:color="E4E4E4"/>
-            </w:tcBorders>
-            <w:tcMar>
-              <w:top w:w="85" w:type="dxa"/>
-              <w:start w:w="120" w:type="dxa"/>
-              <w:bottom w:w="85" w:type="dxa"/>
-              <w:end w:w="120" w:type="dxa"/>
-            </w:tcMar>
-            <w:vAlign w:val="center"/>
-          </w:tcPr>
-          <w:p>
-            <w:pPr>
-              <w:spacing w:after="0" w:line="240" w:lineRule="auto"/>
-            </w:pPr>
-            <w:r/>
-            <w:r>
-              <w:rPr>
-                <w:rFonts w:ascii="Arial" w:hAnsi="Arial"/>
-                <w:b w:val="0"/>
-                <w:color w:val="202020"/>
-                <w:sz w:val="17"/>
-              </w:rPr>
-              <w:t>[ ]</w:t>
-            </w:r>
-          </w:p>
-        </w:tc>
-      </w:tr>
-    </w:tbl>
-    <w:tbl>
-      <w:tblPr>
-        <w:tblW w:type="auto" w:w="0"/>
-        <w:jc w:val="center"/>
-        <w:tblLayout w:type="fixed"/>
-        <w:tblLook w:firstColumn="1" w:firstRow="1" w:lastColumn="0" w:lastRow="0" w:noHBand="0" w:noVBand="1" w:val="04A0"/>
-      </w:tblPr>
-      <w:tblGrid>
-        <w:gridCol w:w="2880"/>
-        <w:gridCol w:w="6912"/>
-      </w:tblGrid>
-      <w:tr>
-        <w:trPr>
-          <w:cantSplit/>
-        </w:trPr>
-        <w:tc>
-          <w:tcPr>
-            <w:tcW w:type="dxa" w:w="2880"/>
-            <w:shd w:fill="F6F6F6"/>
-            <w:vAlign w:val="center"/>
-            <w:tcBorders>
-              <w:top w:val="single" w:sz="6" w:space="0" w:color="E4E4E4"/>
-              <w:left w:val="single" w:sz="6" w:space="0" w:color="E4E4E4"/>
-              <w:bottom w:val="single" w:sz="6" w:space="0" w:color="E4E4E4"/>
-              <w:right w:val="single" w:sz="6" w:space="0" w:color="E4E4E4"/>
-              <w:insideH w:val="single" w:sz="6" w:space="0" w:color="E4E4E4"/>
-              <w:insideV w:val="single" w:sz="6" w:space="0" w:color="E4E4E4"/>
-            </w:tcBorders>
-            <w:tcMar>
-              <w:top w:w="85" w:type="dxa"/>
-              <w:start w:w="120" w:type="dxa"/>
-              <w:bottom w:w="85" w:type="dxa"/>
-              <w:end w:w="120" w:type="dxa"/>
-            </w:tcMar>
-          </w:tcPr>
-          <w:p>
-            <w:pPr>
-              <w:spacing w:after="0" w:line="240" w:lineRule="auto"/>
-            </w:pPr>
-            <w:r/>
-            <w:r>
-              <w:rPr>
-                <w:rFonts w:ascii="Arial" w:hAnsi="Arial"/>
-                <w:b/>
-                <w:color w:val="202020"/>
-                <w:sz w:val="18"/>
-              </w:rPr>
-              <w:t>Known exceptions</w:t>
-            </w:r>
-          </w:p>
-        </w:tc>
-        <w:tc>
-          <w:tcPr>
-            <w:tcW w:type="dxa" w:w="6912"/>
-            <w:vAlign w:val="center"/>
-            <w:tcBorders>
-              <w:top w:val="single" w:sz="6" w:space="0" w:color="E4E4E4"/>
-              <w:left w:val="single" w:sz="6" w:space="0" w:color="E4E4E4"/>
-              <w:bottom w:val="single" w:sz="6" w:space="0" w:color="E4E4E4"/>
-              <w:right w:val="single" w:sz="6" w:space="0" w:color="E4E4E4"/>
-              <w:insideH w:val="single" w:sz="6" w:space="0" w:color="E4E4E4"/>
-              <w:insideV w:val="single" w:sz="6" w:space="0" w:color="E4E4E4"/>
-            </w:tcBorders>
-            <w:tcMar>
-              <w:top w:w="85" w:type="dxa"/>
-              <w:start w:w="120" w:type="dxa"/>
-              <w:bottom w:w="85" w:type="dxa"/>
-              <w:end w:w="120" w:type="dxa"/>
-            </w:tcMar>
-          </w:tcPr>
-          <w:p>
-            <w:pPr>
-              <w:spacing w:after="0" w:line="240" w:lineRule="auto"/>
-            </w:pPr>
-            <w:r/>
-            <w:r>
-              <w:rPr>
-                <w:rFonts w:ascii="Arial" w:hAnsi="Arial"/>
-                <w:b w:val="0"/>
-                <w:color w:val="202020"/>
-                <w:sz w:val="18"/>
-              </w:rPr>
-              <w:t>[Insert or “None”]</w:t>
-            </w:r>
-          </w:p>
-        </w:tc>
-      </w:tr>
-      <w:tr>
-        <w:trPr>
-          <w:cantSplit/>
-        </w:trPr>
-        <w:tc>
-          <w:tcPr>
-            <w:tcW w:type="dxa" w:w="2880"/>
-            <w:shd w:fill="F6F6F6"/>
-            <w:vAlign w:val="center"/>
-            <w:tcBorders>
-              <w:top w:val="single" w:sz="6" w:space="0" w:color="E4E4E4"/>
-              <w:left w:val="single" w:sz="6" w:space="0" w:color="E4E4E4"/>
-              <w:bottom w:val="single" w:sz="6" w:space="0" w:color="E4E4E4"/>
-              <w:right w:val="single" w:sz="6" w:space="0" w:color="E4E4E4"/>
-              <w:insideH w:val="single" w:sz="6" w:space="0" w:color="E4E4E4"/>
-              <w:insideV w:val="single" w:sz="6" w:space="0" w:color="E4E4E4"/>
-            </w:tcBorders>
-            <w:tcMar>
-              <w:top w:w="85" w:type="dxa"/>
-              <w:start w:w="120" w:type="dxa"/>
-              <w:bottom w:w="85" w:type="dxa"/>
-              <w:end w:w="120" w:type="dxa"/>
-            </w:tcMar>
-          </w:tcPr>
-          <w:p>
-            <w:pPr>
-              <w:spacing w:after="0" w:line="240" w:lineRule="auto"/>
-            </w:pPr>
-            <w:r/>
-            <w:r>
-              <w:rPr>
-                <w:rFonts w:ascii="Arial" w:hAnsi="Arial"/>
-                <w:b/>
-                <w:color w:val="202020"/>
-                <w:sz w:val="18"/>
-              </w:rPr>
-              <w:t>Buyer readiness contact</w:t>
-            </w:r>
-          </w:p>
-        </w:tc>
-        <w:tc>
-          <w:tcPr>
-            <w:tcW w:type="dxa" w:w="6912"/>
-            <w:vAlign w:val="center"/>
-            <w:tcBorders>
-              <w:top w:val="single" w:sz="6" w:space="0" w:color="E4E4E4"/>
-              <w:left w:val="single" w:sz="6" w:space="0" w:color="E4E4E4"/>
-              <w:bottom w:val="single" w:sz="6" w:space="0" w:color="E4E4E4"/>
-              <w:right w:val="single" w:sz="6" w:space="0" w:color="E4E4E4"/>
-              <w:insideH w:val="single" w:sz="6" w:space="0" w:color="E4E4E4"/>
-              <w:insideV w:val="single" w:sz="6" w:space="0" w:color="E4E4E4"/>
-            </w:tcBorders>
-            <w:tcMar>
-              <w:top w:w="85" w:type="dxa"/>
-              <w:start w:w="120" w:type="dxa"/>
-              <w:bottom w:w="85" w:type="dxa"/>
-              <w:end w:w="120" w:type="dxa"/>
-            </w:tcMar>
-          </w:tcPr>
-          <w:p>
-            <w:pPr>
-              <w:spacing w:after="0" w:line="240" w:lineRule="auto"/>
-            </w:pPr>
-            <w:r/>
-            <w:r>
-              <w:rPr>
-                <w:rFonts w:ascii="Arial" w:hAnsi="Arial"/>
-                <w:b w:val="0"/>
-                <w:color w:val="202020"/>
-                <w:sz w:val="18"/>
-              </w:rPr>
-              <w:t>[Name | email | phone]</w:t>
-            </w:r>
-          </w:p>
-        </w:tc>
-      </w:tr>
-      <w:tr>
-        <w:trPr>
-          <w:cantSplit/>
-        </w:trPr>
-        <w:tc>
-          <w:tcPr>
-            <w:tcW w:type="dxa" w:w="2880"/>
-            <w:shd w:fill="F6F6F6"/>
-            <w:vAlign w:val="center"/>
-            <w:tcBorders>
-              <w:top w:val="single" w:sz="6" w:space="0" w:color="E4E4E4"/>
-              <w:left w:val="single" w:sz="6" w:space="0" w:color="E4E4E4"/>
-              <w:bottom w:val="single" w:sz="6" w:space="0" w:color="E4E4E4"/>
-              <w:right w:val="single" w:sz="6" w:space="0" w:color="E4E4E4"/>
-              <w:insideH w:val="single" w:sz="6" w:space="0" w:color="E4E4E4"/>
-              <w:insideV w:val="single" w:sz="6" w:space="0" w:color="E4E4E4"/>
-            </w:tcBorders>
-            <w:tcMar>
-              <w:top w:w="85" w:type="dxa"/>
-              <w:start w:w="120" w:type="dxa"/>
-              <w:bottom w:w="85" w:type="dxa"/>
-              <w:end w:w="120" w:type="dxa"/>
-            </w:tcMar>
-          </w:tcPr>
-          <w:p>
-            <w:pPr>
-              <w:spacing w:after="0" w:line="240" w:lineRule="auto"/>
-            </w:pPr>
-            <w:r/>
-            <w:r>
-              <w:rPr>
-                <w:rFonts w:ascii="Arial" w:hAnsi="Arial"/>
-                <w:b/>
-                <w:color w:val="202020"/>
-                <w:sz w:val="18"/>
-              </w:rPr>
-              <w:t>Buyer certification</w:t>
-            </w:r>
-          </w:p>
-        </w:tc>
-        <w:tc>
-          <w:tcPr>
-            <w:tcW w:type="dxa" w:w="6912"/>
-            <w:vAlign w:val="center"/>
-            <w:tcBorders>
-              <w:top w:val="single" w:sz="6" w:space="0" w:color="E4E4E4"/>
-              <w:left w:val="single" w:sz="6" w:space="0" w:color="E4E4E4"/>
-              <w:bottom w:val="single" w:sz="6" w:space="0" w:color="E4E4E4"/>
-              <w:right w:val="single" w:sz="6" w:space="0" w:color="E4E4E4"/>
-              <w:insideH w:val="single" w:sz="6" w:space="0" w:color="E4E4E4"/>
-              <w:insideV w:val="single" w:sz="6" w:space="0" w:color="E4E4E4"/>
-            </w:tcBorders>
-            <w:tcMar>
-              <w:top w:w="85" w:type="dxa"/>
-              <w:start w:w="120" w:type="dxa"/>
-              <w:bottom w:w="85" w:type="dxa"/>
-              <w:end w:w="120" w:type="dxa"/>
-            </w:tcMar>
-          </w:tcPr>
-          <w:p>
-            <w:pPr>
-              <w:spacing w:after="0" w:line="240" w:lineRule="auto"/>
-            </w:pPr>
-            <w:r/>
-            <w:r>
-              <w:rPr>
-                <w:rFonts w:ascii="Arial" w:hAnsi="Arial"/>
-                <w:b w:val="0"/>
-                <w:color w:val="202020"/>
-                <w:sz w:val="18"/>
-              </w:rPr>
-              <w:t>I certify that the information above is accurate and will promptly report any change before delivery.</w:t>
-            </w:r>
-          </w:p>
-        </w:tc>
-      </w:tr>
-      <w:tr>
-        <w:trPr>
-          <w:cantSplit/>
-        </w:trPr>
-        <w:tc>
-          <w:tcPr>
-            <w:tcW w:type="dxa" w:w="2880"/>
-            <w:shd w:fill="F6F6F6"/>
-            <w:vAlign w:val="center"/>
-            <w:tcBorders>
-              <w:top w:val="single" w:sz="6" w:space="0" w:color="E4E4E4"/>
-              <w:left w:val="single" w:sz="6" w:space="0" w:color="E4E4E4"/>
-              <w:bottom w:val="single" w:sz="6" w:space="0" w:color="E4E4E4"/>
-              <w:right w:val="single" w:sz="6" w:space="0" w:color="E4E4E4"/>
-              <w:insideH w:val="single" w:sz="6" w:space="0" w:color="E4E4E4"/>
-              <w:insideV w:val="single" w:sz="6" w:space="0" w:color="E4E4E4"/>
-            </w:tcBorders>
-            <w:tcMar>
-              <w:top w:w="85" w:type="dxa"/>
-              <w:start w:w="120" w:type="dxa"/>
-              <w:bottom w:w="85" w:type="dxa"/>
-              <w:end w:w="120" w:type="dxa"/>
-            </w:tcMar>
-          </w:tcPr>
-          <w:p>
-            <w:pPr>
-              <w:spacing w:after="0" w:line="240" w:lineRule="auto"/>
-            </w:pPr>
-            <w:r/>
-            <w:r>
-              <w:rPr>
-                <w:rFonts w:ascii="Arial" w:hAnsi="Arial"/>
-                <w:b/>
-                <w:color w:val="202020"/>
-                <w:sz w:val="18"/>
-              </w:rPr>
-              <w:t>Name / title</w:t>
-            </w:r>
-          </w:p>
-        </w:tc>
-        <w:tc>
-          <w:tcPr>
-            <w:tcW w:type="dxa" w:w="6912"/>
-            <w:vAlign w:val="center"/>
-            <w:tcBorders>
-              <w:top w:val="single" w:sz="6" w:space="0" w:color="E4E4E4"/>
-              <w:left w:val="single" w:sz="6" w:space="0" w:color="E4E4E4"/>
-              <w:bottom w:val="single" w:sz="6" w:space="0" w:color="E4E4E4"/>
-              <w:right w:val="single" w:sz="6" w:space="0" w:color="E4E4E4"/>
-              <w:insideH w:val="single" w:sz="6" w:space="0" w:color="E4E4E4"/>
-              <w:insideV w:val="single" w:sz="6" w:space="0" w:color="E4E4E4"/>
-            </w:tcBorders>
-            <w:tcMar>
-              <w:top w:w="85" w:type="dxa"/>
-              <w:start w:w="120" w:type="dxa"/>
-              <w:bottom w:w="85" w:type="dxa"/>
-              <w:end w:w="120" w:type="dxa"/>
-            </w:tcMar>
-          </w:tcPr>
-          <w:p>
-            <w:pPr>
-              <w:spacing w:after="0" w:line="240" w:lineRule="auto"/>
-            </w:pPr>
-            <w:r/>
-            <w:r>
-              <w:rPr>
-                <w:rFonts w:ascii="Arial" w:hAnsi="Arial"/>
-                <w:b w:val="0"/>
-                <w:color w:val="202020"/>
-                <w:sz w:val="18"/>
-              </w:rPr>
-              <w:t>[Insert]</w:t>
-            </w:r>
-          </w:p>
-        </w:tc>
-      </w:tr>
-      <w:tr>
-        <w:trPr>
-          <w:cantSplit/>
-        </w:trPr>
-        <w:tc>
-          <w:tcPr>
-            <w:tcW w:type="dxa" w:w="2880"/>
-            <w:shd w:fill="F6F6F6"/>
-            <w:vAlign w:val="center"/>
-            <w:tcBorders>
-              <w:top w:val="single" w:sz="6" w:space="0" w:color="E4E4E4"/>
-              <w:left w:val="single" w:sz="6" w:space="0" w:color="E4E4E4"/>
-              <w:bottom w:val="single" w:sz="6" w:space="0" w:color="E4E4E4"/>
-              <w:right w:val="single" w:sz="6" w:space="0" w:color="E4E4E4"/>
-              <w:insideH w:val="single" w:sz="6" w:space="0" w:color="E4E4E4"/>
-              <w:insideV w:val="single" w:sz="6" w:space="0" w:color="E4E4E4"/>
-            </w:tcBorders>
-            <w:tcMar>
-              <w:top w:w="85" w:type="dxa"/>
-              <w:start w:w="120" w:type="dxa"/>
-              <w:bottom w:w="85" w:type="dxa"/>
-              <w:end w:w="120" w:type="dxa"/>
-            </w:tcMar>
-          </w:tcPr>
-          <w:p>
-            <w:pPr>
-              <w:spacing w:after="0" w:line="240" w:lineRule="auto"/>
-            </w:pPr>
-            <w:r/>
-            <w:r>
-              <w:rPr>
-                <w:rFonts w:ascii="Arial" w:hAnsi="Arial"/>
-                <w:b/>
-                <w:color w:val="202020"/>
-                <w:sz w:val="18"/>
-              </w:rPr>
-              <w:t>Signature / date</w:t>
-            </w:r>
-          </w:p>
-        </w:tc>
-        <w:tc>
-          <w:tcPr>
-            <w:tcW w:type="dxa" w:w="6912"/>
-            <w:vAlign w:val="center"/>
-            <w:tcBorders>
-              <w:top w:val="single" w:sz="6" w:space="0" w:color="E4E4E4"/>
-              <w:left w:val="single" w:sz="6" w:space="0" w:color="E4E4E4"/>
-              <w:bottom w:val="single" w:sz="6" w:space="0" w:color="E4E4E4"/>
-              <w:right w:val="single" w:sz="6" w:space="0" w:color="E4E4E4"/>
-              <w:insideH w:val="single" w:sz="6" w:space="0" w:color="E4E4E4"/>
-              <w:insideV w:val="single" w:sz="6" w:space="0" w:color="E4E4E4"/>
-            </w:tcBorders>
-            <w:tcMar>
-              <w:top w:w="85" w:type="dxa"/>
-              <w:start w:w="120" w:type="dxa"/>
-              <w:bottom w:w="85" w:type="dxa"/>
-              <w:end w:w="120" w:type="dxa"/>
-            </w:tcMar>
-          </w:tcPr>
-          <w:p>
-            <w:pPr>
-              <w:spacing w:after="0" w:line="240" w:lineRule="auto"/>
-            </w:pPr>
-            <w:r/>
-            <w:r>
-              <w:rPr>
-                <w:rFonts w:ascii="Arial" w:hAnsi="Arial"/>
-                <w:b w:val="0"/>
-                <w:color w:val="202020"/>
-                <w:sz w:val="18"/>
-              </w:rPr>
-              <w:t>__________________________________   __________________</w:t>
-            </w:r>
-          </w:p>
-        </w:tc>
-      </w:tr>
-    </w:tbl>
     <w:sectPr>
       <w:footerReference w:type="default" r:id="rId9"/>
       <w:pgSz w:w="12240" w:h="15840"/>

</xml_diff>

<commit_message>
Simplify commercial sale fields and apply confirmed payment and warranty terms
</commit_message>
<xml_diff>
--- a/Docs/Commercial Sales Templates/Commercial Machine Sale Agreement.docx
+++ b/Docs/Commercial Sales Templates/Commercial Machine Sale Agreement.docx
@@ -137,7 +137,7 @@
           <w:color w:val="666666"/>
           <w:sz w:val="19"/>
         </w:rPr>
-        <w:t>Reusable order form, sale terms, and operating exhibits</w:t>
+        <w:t>Your machine order, delivery details, and sale terms</w:t>
       </w:r>
     </w:p>
     <w:p>
@@ -161,7 +161,7 @@
           <w:i w:val="0"/>
           <w:color w:val="F672A2"/>
         </w:rPr>
-        <w:t>Complete every applicable unfilled field before signature. Delete any option that does not apply.</w:t>
+        <w:t>Bloomjoy completes the order details before sending this agreement. Buyer confirms their information and signs. Use “None” for extras that are not included.</w:t>
       </w:r>
     </w:p>
     <w:p>
@@ -219,7 +219,7 @@
                 <w:color w:val="202020"/>
                 <w:sz w:val="18"/>
               </w:rPr>
-              <w:t>Agreement / Quote No.</w:t>
+              <w:t>Quote or order number</w:t>
             </w:r>
           </w:p>
         </w:tc>
@@ -254,7 +254,7 @@
                 <w:color w:val="202020"/>
                 <w:sz w:val="18"/>
               </w:rPr>
-              <w:t>[Insert]</w:t>
+              <w:t>[Number from the Bloomjoy quote or order]</w:t>
             </w:r>
           </w:p>
         </w:tc>
@@ -295,7 +295,7 @@
                 <w:color w:val="202020"/>
                 <w:sz w:val="18"/>
               </w:rPr>
-              <w:t>Effective Date</w:t>
+              <w:t>Agreement date</w:t>
             </w:r>
           </w:p>
         </w:tc>
@@ -330,7 +330,7 @@
                 <w:color w:val="202020"/>
                 <w:sz w:val="18"/>
               </w:rPr>
-              <w:t>[Month Day, Year]</w:t>
+              <w:t>[Month Day, Year; this is the Effective Date]</w:t>
             </w:r>
           </w:p>
         </w:tc>
@@ -447,7 +447,7 @@
                 <w:color w:val="202020"/>
                 <w:sz w:val="18"/>
               </w:rPr>
-              <w:t>Bloomjoy notice address</w:t>
+              <w:t>Bloomjoy mailing address</w:t>
             </w:r>
           </w:p>
         </w:tc>
@@ -523,7 +523,7 @@
                 <w:color w:val="202020"/>
                 <w:sz w:val="18"/>
               </w:rPr>
-              <w:t>Bloomjoy notice email</w:t>
+              <w:t>Bloomjoy legal email</w:t>
             </w:r>
           </w:p>
         </w:tc>
@@ -599,7 +599,7 @@
                 <w:color w:val="202020"/>
                 <w:sz w:val="18"/>
               </w:rPr>
-              <w:t>Buyer legal name</w:t>
+              <w:t>Buyer full legal name</w:t>
             </w:r>
           </w:p>
         </w:tc>
@@ -634,7 +634,7 @@
                 <w:color w:val="202020"/>
                 <w:sz w:val="18"/>
               </w:rPr>
-              <w:t>[Insert exact legal name and entity type]</w:t>
+              <w:t>[Company's registered name, or individual's full name]</w:t>
             </w:r>
           </w:p>
         </w:tc>
@@ -675,7 +675,7 @@
                 <w:color w:val="202020"/>
                 <w:sz w:val="18"/>
               </w:rPr>
-              <w:t>Buyer notice address</w:t>
+              <w:t>Buyer mailing address</w:t>
             </w:r>
           </w:p>
         </w:tc>
@@ -710,7 +710,7 @@
                 <w:color w:val="202020"/>
                 <w:sz w:val="18"/>
               </w:rPr>
-              <w:t>[Insert street address, city, state, ZIP]</w:t>
+              <w:t>[Street address, city, state, ZIP for formal notices]</w:t>
             </w:r>
           </w:p>
         </w:tc>
@@ -751,7 +751,7 @@
                 <w:color w:val="202020"/>
                 <w:sz w:val="18"/>
               </w:rPr>
-              <w:t>Buyer notice email</w:t>
+              <w:t>Buyer email for notices</w:t>
             </w:r>
           </w:p>
         </w:tc>
@@ -786,7 +786,7 @@
                 <w:color w:val="202020"/>
                 <w:sz w:val="18"/>
               </w:rPr>
-              <w:t>[Insert]</w:t>
+              <w:t>[Email address for notices about this agreement]</w:t>
             </w:r>
           </w:p>
         </w:tc>
@@ -827,7 +827,7 @@
                 <w:color w:val="202020"/>
                 <w:sz w:val="18"/>
               </w:rPr>
-              <w:t>Buyer billing contact</w:t>
+              <w:t>Billing contact name email and phone</w:t>
             </w:r>
           </w:p>
         </w:tc>
@@ -862,83 +862,7 @@
                 <w:color w:val="202020"/>
                 <w:sz w:val="18"/>
               </w:rPr>
-              <w:t>[Name | email | phone]</w:t>
-            </w:r>
-          </w:p>
-        </w:tc>
-      </w:tr>
-      <w:tr>
-        <w:trPr>
-          <w:cantSplit/>
-        </w:trPr>
-        <w:tc>
-          <w:tcPr>
-            <w:tcW w:type="dxa" w:w="2880"/>
-            <w:shd w:fill="F6F6F6"/>
-            <w:vAlign w:val="center"/>
-            <w:tcBorders>
-              <w:top w:val="single" w:sz="6" w:space="0" w:color="E4E4E4"/>
-              <w:left w:val="single" w:sz="6" w:space="0" w:color="E4E4E4"/>
-              <w:bottom w:val="single" w:sz="6" w:space="0" w:color="E4E4E4"/>
-              <w:right w:val="single" w:sz="6" w:space="0" w:color="E4E4E4"/>
-              <w:insideH w:val="single" w:sz="6" w:space="0" w:color="E4E4E4"/>
-              <w:insideV w:val="single" w:sz="6" w:space="0" w:color="E4E4E4"/>
-            </w:tcBorders>
-            <w:tcMar>
-              <w:top w:w="85" w:type="dxa"/>
-              <w:start w:w="120" w:type="dxa"/>
-              <w:bottom w:w="85" w:type="dxa"/>
-              <w:end w:w="120" w:type="dxa"/>
-            </w:tcMar>
-          </w:tcPr>
-          <w:p>
-            <w:pPr>
-              <w:spacing w:after="0" w:line="240" w:lineRule="auto"/>
-            </w:pPr>
-            <w:r/>
-            <w:r>
-              <w:rPr>
-                <w:rFonts w:ascii="Arial" w:hAnsi="Arial"/>
-                <w:b/>
-                <w:color w:val="202020"/>
-                <w:sz w:val="18"/>
-              </w:rPr>
-              <w:t>Buyer delivery contact</w:t>
-            </w:r>
-          </w:p>
-        </w:tc>
-        <w:tc>
-          <w:tcPr>
-            <w:tcW w:type="dxa" w:w="6912"/>
-            <w:vAlign w:val="center"/>
-            <w:tcBorders>
-              <w:top w:val="single" w:sz="6" w:space="0" w:color="E4E4E4"/>
-              <w:left w:val="single" w:sz="6" w:space="0" w:color="E4E4E4"/>
-              <w:bottom w:val="single" w:sz="6" w:space="0" w:color="E4E4E4"/>
-              <w:right w:val="single" w:sz="6" w:space="0" w:color="E4E4E4"/>
-              <w:insideH w:val="single" w:sz="6" w:space="0" w:color="E4E4E4"/>
-              <w:insideV w:val="single" w:sz="6" w:space="0" w:color="E4E4E4"/>
-            </w:tcBorders>
-            <w:tcMar>
-              <w:top w:w="85" w:type="dxa"/>
-              <w:start w:w="120" w:type="dxa"/>
-              <w:bottom w:w="85" w:type="dxa"/>
-              <w:end w:w="120" w:type="dxa"/>
-            </w:tcMar>
-          </w:tcPr>
-          <w:p>
-            <w:pPr>
-              <w:spacing w:after="0" w:line="240" w:lineRule="auto"/>
-            </w:pPr>
-            <w:r/>
-            <w:r>
-              <w:rPr>
-                <w:rFonts w:ascii="Arial" w:hAnsi="Arial"/>
-                <w:b w:val="0"/>
-                <w:color w:val="202020"/>
-                <w:sz w:val="18"/>
-              </w:rPr>
-              <w:t>[Name | email | phone]</w:t>
+              <w:t>[Person who receives invoices; write Same as buyer if applicable]</w:t>
             </w:r>
           </w:p>
         </w:tc>
@@ -1038,7 +962,7 @@
                 <w:color w:val="202020"/>
                 <w:sz w:val="17"/>
               </w:rPr>
-              <w:t>Description / configuration</w:t>
+              <w:t>What is included</w:t>
             </w:r>
           </w:p>
         </w:tc>
@@ -1110,7 +1034,7 @@
                 <w:color w:val="202020"/>
                 <w:sz w:val="17"/>
               </w:rPr>
-              <w:t>Unit price</w:t>
+              <w:t>Price each</w:t>
             </w:r>
           </w:p>
         </w:tc>
@@ -1146,7 +1070,7 @@
                 <w:color w:val="202020"/>
                 <w:sz w:val="17"/>
               </w:rPr>
-              <w:t>Extended price</w:t>
+              <w:t>Line total</w:t>
             </w:r>
           </w:p>
         </w:tc>
@@ -1221,7 +1145,7 @@
                 <w:color w:val="202020"/>
                 <w:sz w:val="17"/>
               </w:rPr>
-              <w:t>[Model, finish, pattern package, payment reader, connectivity]</w:t>
+              <w:t>[Machine model and selected options; full details in Exhibit A]</w:t>
             </w:r>
           </w:p>
         </w:tc>
@@ -1256,7 +1180,7 @@
                 <w:color w:val="202020"/>
                 <w:sz w:val="17"/>
               </w:rPr>
-              <w:t>[ ]</w:t>
+              <w:t>[Number]</w:t>
             </w:r>
           </w:p>
         </w:tc>
@@ -1291,7 +1215,7 @@
                 <w:color w:val="202020"/>
                 <w:sz w:val="17"/>
               </w:rPr>
-              <w:t>$[ ]</w:t>
+              <w:t>$[Amount]</w:t>
             </w:r>
           </w:p>
         </w:tc>
@@ -1326,7 +1250,7 @@
                 <w:color w:val="202020"/>
                 <w:sz w:val="17"/>
               </w:rPr>
-              <w:t>$[ ]</w:t>
+              <w:t>$[Amount]</w:t>
             </w:r>
           </w:p>
         </w:tc>
@@ -1366,7 +1290,7 @@
                 <w:color w:val="202020"/>
                 <w:sz w:val="17"/>
               </w:rPr>
-              <w:t>Custom wrap</w:t>
+              <w:t>Custom machine wrap</w:t>
             </w:r>
           </w:p>
         </w:tc>
@@ -1401,7 +1325,7 @@
                 <w:color w:val="202020"/>
                 <w:sz w:val="17"/>
               </w:rPr>
-              <w:t>☐ Not included   ☐ Included; artwork requirements attached</w:t>
+              <w:t>☐ Not included   ☐ Included; approved design attached</w:t>
             </w:r>
           </w:p>
         </w:tc>
@@ -1436,7 +1360,7 @@
                 <w:color w:val="202020"/>
                 <w:sz w:val="17"/>
               </w:rPr>
-              <w:t>[ ]</w:t>
+              <w:t>[Number]</w:t>
             </w:r>
           </w:p>
         </w:tc>
@@ -1471,7 +1395,7 @@
                 <w:color w:val="202020"/>
                 <w:sz w:val="17"/>
               </w:rPr>
-              <w:t>$[ ]</w:t>
+              <w:t>$[Amount]</w:t>
             </w:r>
           </w:p>
         </w:tc>
@@ -1506,7 +1430,7 @@
                 <w:color w:val="202020"/>
                 <w:sz w:val="17"/>
               </w:rPr>
-              <w:t>$[ ]</w:t>
+              <w:t>$[Amount]</w:t>
             </w:r>
           </w:p>
         </w:tc>
@@ -1546,7 +1470,7 @@
                 <w:color w:val="202020"/>
                 <w:sz w:val="17"/>
               </w:rPr>
-              <w:t>Opening supplies</w:t>
+              <w:t>Starter supplies</w:t>
             </w:r>
           </w:p>
         </w:tc>
@@ -1581,7 +1505,7 @@
                 <w:color w:val="202020"/>
                 <w:sz w:val="17"/>
               </w:rPr>
-              <w:t>[Sugar, sticks, tools, spare parts, other]</w:t>
+              <w:t>[List included sugar, sticks, tools, or spare parts; or None]</w:t>
             </w:r>
           </w:p>
         </w:tc>
@@ -1616,7 +1540,7 @@
                 <w:color w:val="202020"/>
                 <w:sz w:val="17"/>
               </w:rPr>
-              <w:t>[ ]</w:t>
+              <w:t>[Number]</w:t>
             </w:r>
           </w:p>
         </w:tc>
@@ -1651,7 +1575,7 @@
                 <w:color w:val="202020"/>
                 <w:sz w:val="17"/>
               </w:rPr>
-              <w:t>$[ ]</w:t>
+              <w:t>$[Amount]</w:t>
             </w:r>
           </w:p>
         </w:tc>
@@ -1686,7 +1610,7 @@
                 <w:color w:val="202020"/>
                 <w:sz w:val="17"/>
               </w:rPr>
-              <w:t>$[ ]</w:t>
+              <w:t>$[Amount]</w:t>
             </w:r>
           </w:p>
         </w:tc>
@@ -1726,7 +1650,7 @@
                 <w:color w:val="202020"/>
                 <w:sz w:val="17"/>
               </w:rPr>
-              <w:t>Freight / delivery</w:t>
+              <w:t>Shipping and delivery</w:t>
             </w:r>
           </w:p>
         </w:tc>
@@ -1761,7 +1685,7 @@
                 <w:color w:val="202020"/>
                 <w:sz w:val="17"/>
               </w:rPr>
-              <w:t>[Method, accessorial charges, insurance]</w:t>
+              <w:t>[Describe included delivery service and any extra charges]</w:t>
             </w:r>
           </w:p>
         </w:tc>
@@ -1866,7 +1790,7 @@
                 <w:color w:val="202020"/>
                 <w:sz w:val="17"/>
               </w:rPr>
-              <w:t>$[ ]</w:t>
+              <w:t>$[Amount]</w:t>
             </w:r>
           </w:p>
         </w:tc>
@@ -1906,7 +1830,7 @@
                 <w:color w:val="202020"/>
                 <w:sz w:val="17"/>
               </w:rPr>
-              <w:t>Sales or use tax</w:t>
+              <w:t>Sales tax</w:t>
             </w:r>
           </w:p>
         </w:tc>
@@ -1941,7 +1865,7 @@
                 <w:color w:val="202020"/>
                 <w:sz w:val="17"/>
               </w:rPr>
-              <w:t>[Estimated; final tax may adjust invoice]</w:t>
+              <w:t>Estimated; final invoice may adjust tax</w:t>
             </w:r>
           </w:p>
         </w:tc>
@@ -2046,7 +1970,7 @@
                 <w:color w:val="202020"/>
                 <w:sz w:val="17"/>
               </w:rPr>
-              <w:t>$[ ]</w:t>
+              <w:t>$[Amount]</w:t>
             </w:r>
           </w:p>
         </w:tc>
@@ -2229,6 +2153,17 @@
         </w:tc>
       </w:tr>
     </w:tbl>
+    <w:p>
+      <w:pPr>
+        <w:widowControl/>
+      </w:pPr>
+      <w:r>
+        <w:rPr>
+          <w:i w:val="0"/>
+        </w:rPr>
+        <w:t>Line total = quantity × price each. Enter $0 for included items with no separate charge. Add the item line totals plus shipping and tax to calculate the Total Purchase Price.</w:t>
+      </w:r>
+    </w:p>
     <w:p>
       <w:pPr>
         <w:pStyle w:val="Heading2"/>
@@ -2508,7 +2443,7 @@
                 <w:color w:val="202020"/>
                 <w:sz w:val="18"/>
               </w:rPr>
-              <w:t>Delivery balance</w:t>
+              <w:t>Remaining payment</w:t>
             </w:r>
           </w:p>
         </w:tc>
@@ -2578,7 +2513,7 @@
                 <w:color w:val="202020"/>
                 <w:sz w:val="18"/>
               </w:rPr>
-              <w:t>Within [3] business days after Confirmed Delivery</w:t>
+              <w:t>Within 5 calendar days after Confirmed Delivery</w:t>
             </w:r>
           </w:p>
         </w:tc>
@@ -2631,7 +2566,7 @@
                 <w:color w:val="202020"/>
                 <w:sz w:val="18"/>
               </w:rPr>
-              <w:t>Payment / invoice instructions</w:t>
+              <w:t>How to pay</w:t>
             </w:r>
           </w:p>
         </w:tc>
@@ -2666,7 +2601,7 @@
                 <w:color w:val="202020"/>
                 <w:sz w:val="18"/>
               </w:rPr>
-              <w:t>[Insert payment method and invoice instructions]</w:t>
+              <w:t>[Payment link, invoice instructions, or other agreed payment method]</w:t>
             </w:r>
           </w:p>
         </w:tc>
@@ -2680,7 +2615,7 @@
         <w:rPr>
           <w:i w:val="0"/>
         </w:rPr>
-        <w:t>Deposit treatment — select one: ☐ Refundable until Bloomjoy commits the order to production, less documented nonrecoverable costs. ☐ Nonrefundable upon receipt. ☐ Other: [Describe other treatment].</w:t>
+        <w:t>Deposit refund policy — Bloomjoy selects one before signing: ☐ Refundable until Bloomjoy commits the order to production, less documented costs that cannot be recovered. ☐ Not refundable once received. ☐ Other: [Describe the agreed refund policy].</w:t>
       </w:r>
     </w:p>
     <w:p>
@@ -2688,7 +2623,7 @@
         <w:pStyle w:val="Heading2"/>
       </w:pPr>
       <w:r>
-        <w:t>3. Delivery and Commissioning</w:t>
+        <w:t>3. Delivery Details</w:t>
       </w:r>
     </w:p>
     <w:tbl>
@@ -2738,7 +2673,7 @@
                 <w:color w:val="202020"/>
                 <w:sz w:val="18"/>
               </w:rPr>
-              <w:t>Delivery point</w:t>
+              <w:t>Delivery address</w:t>
             </w:r>
           </w:p>
         </w:tc>
@@ -2773,7 +2708,7 @@
                 <w:color w:val="202020"/>
                 <w:sz w:val="18"/>
               </w:rPr>
-              <w:t>[Full address, suite/loading instructions]</w:t>
+              <w:t>[Street address, unit or suite, city, state, ZIP; this is the Delivery Point]</w:t>
             </w:r>
           </w:p>
         </w:tc>
@@ -2814,7 +2749,7 @@
                 <w:color w:val="202020"/>
                 <w:sz w:val="18"/>
               </w:rPr>
-              <w:t>Requested delivery window</w:t>
+              <w:t>Delivery address type</w:t>
             </w:r>
           </w:p>
         </w:tc>
@@ -2849,7 +2784,7 @@
                 <w:color w:val="202020"/>
                 <w:sz w:val="18"/>
               </w:rPr>
-              <w:t>[Insert; estimate only unless expressly guaranteed]</w:t>
+              <w:t>☐ Commercial / business   ☐ Residential / home</w:t>
             </w:r>
           </w:p>
         </w:tc>
@@ -2890,7 +2825,7 @@
                 <w:color w:val="202020"/>
                 <w:sz w:val="18"/>
               </w:rPr>
-              <w:t>Delivery method / Incoterm</w:t>
+              <w:t>Receiving contact name and phone</w:t>
             </w:r>
           </w:p>
         </w:tc>
@@ -2925,7 +2860,7 @@
                 <w:color w:val="202020"/>
                 <w:sz w:val="18"/>
               </w:rPr>
-              <w:t>[Carrier / white-glove / customer pickup / other]</w:t>
+              <w:t>[Person the driver should call about delivery]</w:t>
             </w:r>
           </w:p>
         </w:tc>
@@ -2966,7 +2901,7 @@
                 <w:color w:val="202020"/>
                 <w:sz w:val="18"/>
               </w:rPr>
-              <w:t>Included installation support</w:t>
+              <w:t>Delivery instructions (optional)</w:t>
             </w:r>
           </w:p>
         </w:tc>
@@ -3001,235 +2936,7 @@
                 <w:color w:val="202020"/>
                 <w:sz w:val="18"/>
               </w:rPr>
-              <w:t>[Remote setup; on-site services, if any]</w:t>
-            </w:r>
-          </w:p>
-        </w:tc>
-      </w:tr>
-      <w:tr>
-        <w:trPr>
-          <w:cantSplit/>
-        </w:trPr>
-        <w:tc>
-          <w:tcPr>
-            <w:tcW w:type="dxa" w:w="2880"/>
-            <w:shd w:fill="F6F6F6"/>
-            <w:vAlign w:val="center"/>
-            <w:tcBorders>
-              <w:top w:val="single" w:sz="6" w:space="0" w:color="E4E4E4"/>
-              <w:left w:val="single" w:sz="6" w:space="0" w:color="E4E4E4"/>
-              <w:bottom w:val="single" w:sz="6" w:space="0" w:color="E4E4E4"/>
-              <w:right w:val="single" w:sz="6" w:space="0" w:color="E4E4E4"/>
-              <w:insideH w:val="single" w:sz="6" w:space="0" w:color="E4E4E4"/>
-              <w:insideV w:val="single" w:sz="6" w:space="0" w:color="E4E4E4"/>
-            </w:tcBorders>
-            <w:tcMar>
-              <w:top w:w="85" w:type="dxa"/>
-              <w:start w:w="120" w:type="dxa"/>
-              <w:bottom w:w="85" w:type="dxa"/>
-              <w:end w:w="120" w:type="dxa"/>
-            </w:tcMar>
-          </w:tcPr>
-          <w:p>
-            <w:pPr>
-              <w:spacing w:after="0" w:line="240" w:lineRule="auto"/>
-            </w:pPr>
-            <w:r/>
-            <w:r>
-              <w:rPr>
-                <w:rFonts w:ascii="Arial" w:hAnsi="Arial"/>
-                <w:b/>
-                <w:color w:val="202020"/>
-                <w:sz w:val="18"/>
-              </w:rPr>
-              <w:t>Included training</w:t>
-            </w:r>
-          </w:p>
-        </w:tc>
-        <w:tc>
-          <w:tcPr>
-            <w:tcW w:type="dxa" w:w="6912"/>
-            <w:vAlign w:val="center"/>
-            <w:tcBorders>
-              <w:top w:val="single" w:sz="6" w:space="0" w:color="E4E4E4"/>
-              <w:left w:val="single" w:sz="6" w:space="0" w:color="E4E4E4"/>
-              <w:bottom w:val="single" w:sz="6" w:space="0" w:color="E4E4E4"/>
-              <w:right w:val="single" w:sz="6" w:space="0" w:color="E4E4E4"/>
-              <w:insideH w:val="single" w:sz="6" w:space="0" w:color="E4E4E4"/>
-              <w:insideV w:val="single" w:sz="6" w:space="0" w:color="E4E4E4"/>
-            </w:tcBorders>
-            <w:tcMar>
-              <w:top w:w="85" w:type="dxa"/>
-              <w:start w:w="120" w:type="dxa"/>
-              <w:bottom w:w="85" w:type="dxa"/>
-              <w:end w:w="120" w:type="dxa"/>
-            </w:tcMar>
-          </w:tcPr>
-          <w:p>
-            <w:pPr>
-              <w:spacing w:after="0" w:line="240" w:lineRule="auto"/>
-            </w:pPr>
-            <w:r/>
-            <w:r>
-              <w:rPr>
-                <w:rFonts w:ascii="Arial" w:hAnsi="Arial"/>
-                <w:b w:val="0"/>
-                <w:color w:val="202020"/>
-                <w:sz w:val="18"/>
-              </w:rPr>
-              <w:t>[Participants, format, duration]</w:t>
-            </w:r>
-          </w:p>
-        </w:tc>
-      </w:tr>
-      <w:tr>
-        <w:trPr>
-          <w:cantSplit/>
-        </w:trPr>
-        <w:tc>
-          <w:tcPr>
-            <w:tcW w:type="dxa" w:w="2880"/>
-            <w:shd w:fill="F6F6F6"/>
-            <w:vAlign w:val="center"/>
-            <w:tcBorders>
-              <w:top w:val="single" w:sz="6" w:space="0" w:color="E4E4E4"/>
-              <w:left w:val="single" w:sz="6" w:space="0" w:color="E4E4E4"/>
-              <w:bottom w:val="single" w:sz="6" w:space="0" w:color="E4E4E4"/>
-              <w:right w:val="single" w:sz="6" w:space="0" w:color="E4E4E4"/>
-              <w:insideH w:val="single" w:sz="6" w:space="0" w:color="E4E4E4"/>
-              <w:insideV w:val="single" w:sz="6" w:space="0" w:color="E4E4E4"/>
-            </w:tcBorders>
-            <w:tcMar>
-              <w:top w:w="85" w:type="dxa"/>
-              <w:start w:w="120" w:type="dxa"/>
-              <w:bottom w:w="85" w:type="dxa"/>
-              <w:end w:w="120" w:type="dxa"/>
-            </w:tcMar>
-          </w:tcPr>
-          <w:p>
-            <w:pPr>
-              <w:spacing w:after="0" w:line="240" w:lineRule="auto"/>
-            </w:pPr>
-            <w:r/>
-            <w:r>
-              <w:rPr>
-                <w:rFonts w:ascii="Arial" w:hAnsi="Arial"/>
-                <w:b/>
-                <w:color w:val="202020"/>
-                <w:sz w:val="18"/>
-              </w:rPr>
-              <w:t>Acceptance review period</w:t>
-            </w:r>
-          </w:p>
-        </w:tc>
-        <w:tc>
-          <w:tcPr>
-            <w:tcW w:type="dxa" w:w="6912"/>
-            <w:vAlign w:val="center"/>
-            <w:tcBorders>
-              <w:top w:val="single" w:sz="6" w:space="0" w:color="E4E4E4"/>
-              <w:left w:val="single" w:sz="6" w:space="0" w:color="E4E4E4"/>
-              <w:bottom w:val="single" w:sz="6" w:space="0" w:color="E4E4E4"/>
-              <w:right w:val="single" w:sz="6" w:space="0" w:color="E4E4E4"/>
-              <w:insideH w:val="single" w:sz="6" w:space="0" w:color="E4E4E4"/>
-              <w:insideV w:val="single" w:sz="6" w:space="0" w:color="E4E4E4"/>
-            </w:tcBorders>
-            <w:tcMar>
-              <w:top w:w="85" w:type="dxa"/>
-              <w:start w:w="120" w:type="dxa"/>
-              <w:bottom w:w="85" w:type="dxa"/>
-              <w:end w:w="120" w:type="dxa"/>
-            </w:tcMar>
-          </w:tcPr>
-          <w:p>
-            <w:pPr>
-              <w:spacing w:after="0" w:line="240" w:lineRule="auto"/>
-            </w:pPr>
-            <w:r/>
-            <w:r>
-              <w:rPr>
-                <w:rFonts w:ascii="Arial" w:hAnsi="Arial"/>
-                <w:b w:val="0"/>
-                <w:color w:val="202020"/>
-                <w:sz w:val="18"/>
-              </w:rPr>
-              <w:t>[5] business days after Confirmed Delivery</w:t>
-            </w:r>
-          </w:p>
-        </w:tc>
-      </w:tr>
-      <w:tr>
-        <w:trPr>
-          <w:cantSplit/>
-        </w:trPr>
-        <w:tc>
-          <w:tcPr>
-            <w:tcW w:type="dxa" w:w="2880"/>
-            <w:shd w:fill="F6F6F6"/>
-            <w:vAlign w:val="center"/>
-            <w:tcBorders>
-              <w:top w:val="single" w:sz="6" w:space="0" w:color="E4E4E4"/>
-              <w:left w:val="single" w:sz="6" w:space="0" w:color="E4E4E4"/>
-              <w:bottom w:val="single" w:sz="6" w:space="0" w:color="E4E4E4"/>
-              <w:right w:val="single" w:sz="6" w:space="0" w:color="E4E4E4"/>
-              <w:insideH w:val="single" w:sz="6" w:space="0" w:color="E4E4E4"/>
-              <w:insideV w:val="single" w:sz="6" w:space="0" w:color="E4E4E4"/>
-            </w:tcBorders>
-            <w:tcMar>
-              <w:top w:w="85" w:type="dxa"/>
-              <w:start w:w="120" w:type="dxa"/>
-              <w:bottom w:w="85" w:type="dxa"/>
-              <w:end w:w="120" w:type="dxa"/>
-            </w:tcMar>
-          </w:tcPr>
-          <w:p>
-            <w:pPr>
-              <w:spacing w:after="0" w:line="240" w:lineRule="auto"/>
-            </w:pPr>
-            <w:r/>
-            <w:r>
-              <w:rPr>
-                <w:rFonts w:ascii="Arial" w:hAnsi="Arial"/>
-                <w:b/>
-                <w:color w:val="202020"/>
-                <w:sz w:val="18"/>
-              </w:rPr>
-              <w:t>Balance timing override</w:t>
-            </w:r>
-          </w:p>
-        </w:tc>
-        <w:tc>
-          <w:tcPr>
-            <w:tcW w:type="dxa" w:w="6912"/>
-            <w:vAlign w:val="center"/>
-            <w:tcBorders>
-              <w:top w:val="single" w:sz="6" w:space="0" w:color="E4E4E4"/>
-              <w:left w:val="single" w:sz="6" w:space="0" w:color="E4E4E4"/>
-              <w:bottom w:val="single" w:sz="6" w:space="0" w:color="E4E4E4"/>
-              <w:right w:val="single" w:sz="6" w:space="0" w:color="E4E4E4"/>
-              <w:insideH w:val="single" w:sz="6" w:space="0" w:color="E4E4E4"/>
-              <w:insideV w:val="single" w:sz="6" w:space="0" w:color="E4E4E4"/>
-            </w:tcBorders>
-            <w:tcMar>
-              <w:top w:w="85" w:type="dxa"/>
-              <w:start w:w="120" w:type="dxa"/>
-              <w:bottom w:w="85" w:type="dxa"/>
-              <w:end w:w="120" w:type="dxa"/>
-            </w:tcMar>
-          </w:tcPr>
-          <w:p>
-            <w:pPr>
-              <w:spacing w:after="0" w:line="240" w:lineRule="auto"/>
-            </w:pPr>
-            <w:r/>
-            <w:r>
-              <w:rPr>
-                <w:rFonts w:ascii="Arial" w:hAnsi="Arial"/>
-                <w:b w:val="0"/>
-                <w:color w:val="202020"/>
-                <w:sz w:val="18"/>
-              </w:rPr>
-              <w:t>[Leave blank unless different from Section 2]</w:t>
+              <w:t>[Loading access, stairs, restricted hours, or other instructions; or None]</w:t>
             </w:r>
           </w:p>
         </w:tc>
@@ -3240,7 +2947,7 @@
         <w:pStyle w:val="Heading2"/>
       </w:pPr>
       <w:r>
-        <w:t>4. Warranty, Support, and Optional Services</w:t>
+        <w:t>4. Warranty and Support</w:t>
       </w:r>
     </w:p>
     <w:tbl>
@@ -3290,7 +2997,7 @@
                 <w:color w:val="202020"/>
                 <w:sz w:val="18"/>
               </w:rPr>
-              <w:t>Limited warranty term</w:t>
+              <w:t>Warranty coverage period</w:t>
             </w:r>
           </w:p>
         </w:tc>
@@ -3325,7 +3032,83 @@
                 <w:color w:val="202020"/>
                 <w:sz w:val="18"/>
               </w:rPr>
-              <w:t>[Insert manufacturer-backed term and start date rule]</w:t>
+              <w:t>One year from the Agreement date, not the delivery date. Coverage is described in Exhibit B.</w:t>
+            </w:r>
+          </w:p>
+        </w:tc>
+      </w:tr>
+      <w:tr>
+        <w:trPr>
+          <w:cantSplit/>
+        </w:trPr>
+        <w:tc>
+          <w:tcPr>
+            <w:tcW w:type="dxa" w:w="2880"/>
+            <w:shd w:fill="F6F6F6"/>
+            <w:vAlign w:val="center"/>
+            <w:tcBorders>
+              <w:top w:val="single" w:sz="6" w:space="0" w:color="E4E4E4"/>
+              <w:left w:val="single" w:sz="6" w:space="0" w:color="E4E4E4"/>
+              <w:bottom w:val="single" w:sz="6" w:space="0" w:color="E4E4E4"/>
+              <w:right w:val="single" w:sz="6" w:space="0" w:color="E4E4E4"/>
+              <w:insideH w:val="single" w:sz="6" w:space="0" w:color="E4E4E4"/>
+              <w:insideV w:val="single" w:sz="6" w:space="0" w:color="E4E4E4"/>
+            </w:tcBorders>
+            <w:tcMar>
+              <w:top w:w="85" w:type="dxa"/>
+              <w:start w:w="120" w:type="dxa"/>
+              <w:bottom w:w="85" w:type="dxa"/>
+              <w:end w:w="120" w:type="dxa"/>
+            </w:tcMar>
+          </w:tcPr>
+          <w:p>
+            <w:pPr>
+              <w:spacing w:after="0" w:line="240" w:lineRule="auto"/>
+            </w:pPr>
+            <w:r/>
+            <w:r>
+              <w:rPr>
+                <w:rFonts w:ascii="Arial" w:hAnsi="Arial"/>
+                <w:b/>
+                <w:color w:val="202020"/>
+                <w:sz w:val="18"/>
+              </w:rPr>
+              <w:t>Inspection period</w:t>
+            </w:r>
+          </w:p>
+        </w:tc>
+        <w:tc>
+          <w:tcPr>
+            <w:tcW w:type="dxa" w:w="6912"/>
+            <w:vAlign w:val="center"/>
+            <w:tcBorders>
+              <w:top w:val="single" w:sz="6" w:space="0" w:color="E4E4E4"/>
+              <w:left w:val="single" w:sz="6" w:space="0" w:color="E4E4E4"/>
+              <w:bottom w:val="single" w:sz="6" w:space="0" w:color="E4E4E4"/>
+              <w:right w:val="single" w:sz="6" w:space="0" w:color="E4E4E4"/>
+              <w:insideH w:val="single" w:sz="6" w:space="0" w:color="E4E4E4"/>
+              <w:insideV w:val="single" w:sz="6" w:space="0" w:color="E4E4E4"/>
+            </w:tcBorders>
+            <w:tcMar>
+              <w:top w:w="85" w:type="dxa"/>
+              <w:start w:w="120" w:type="dxa"/>
+              <w:bottom w:w="85" w:type="dxa"/>
+              <w:end w:w="120" w:type="dxa"/>
+            </w:tcMar>
+          </w:tcPr>
+          <w:p>
+            <w:pPr>
+              <w:spacing w:after="0" w:line="240" w:lineRule="auto"/>
+            </w:pPr>
+            <w:r/>
+            <w:r>
+              <w:rPr>
+                <w:rFonts w:ascii="Arial" w:hAnsi="Arial"/>
+                <w:b w:val="0"/>
+                <w:color w:val="202020"/>
+                <w:sz w:val="18"/>
+              </w:rPr>
+              <w:t>7 business days after Confirmed Delivery to report a material equipment problem. This does not waive later claims for hidden defects or problems covered by the warranty.</w:t>
             </w:r>
           </w:p>
         </w:tc>
@@ -3401,7 +3184,7 @@
                 <w:color w:val="202020"/>
                 <w:sz w:val="18"/>
               </w:rPr>
-              <w:t>24/7 first-line remote technical support via WeChat, subject to manufacturer availability and policies</w:t>
+              <w:t>Remote technical help via WeChat, available 24/7 subject to manufacturer availability and policies</w:t>
             </w:r>
           </w:p>
         </w:tc>
@@ -3442,7 +3225,7 @@
                 <w:color w:val="202020"/>
                 <w:sz w:val="18"/>
               </w:rPr>
-              <w:t>Bloomjoy included support</w:t>
+              <w:t>Bloomjoy support</w:t>
             </w:r>
           </w:p>
         </w:tc>
@@ -3477,7 +3260,7 @@
                 <w:color w:val="202020"/>
                 <w:sz w:val="18"/>
               </w:rPr>
-              <w:t>Onboarding and reasonable escalation coordination during U.S. business hours, as described in Exhibit B</w:t>
+              <w:t>Help getting started and coordinating further support during U.S. business hours, as described in Exhibit B</w:t>
             </w:r>
           </w:p>
         </w:tc>
@@ -3594,7 +3377,7 @@
                 <w:color w:val="202020"/>
                 <w:sz w:val="18"/>
               </w:rPr>
-              <w:t>Additional paid services</w:t>
+              <w:t>Other included services</w:t>
             </w:r>
           </w:p>
         </w:tc>
@@ -3629,7 +3412,7 @@
                 <w:color w:val="202020"/>
                 <w:sz w:val="18"/>
               </w:rPr>
-              <w:t>[On-site labor, travel, extended coverage, storage, other—or “None”]</w:t>
+              <w:t>[List any included on-site setup, training, labor, travel, or shipping for warranty claims; or None]</w:t>
             </w:r>
           </w:p>
         </w:tc>
@@ -3807,7 +3590,7 @@
                 <w:color w:val="202020"/>
                 <w:sz w:val="18"/>
               </w:rPr>
-              <w:t>BUYER: [Legal name]</w:t>
+              <w:t>BUYER</w:t>
             </w:r>
           </w:p>
         </w:tc>
@@ -3839,7 +3622,7 @@
                 <w:color w:val="202020"/>
                 <w:sz w:val="18"/>
               </w:rPr>
-              <w:t>By: __________________________________</w:t>
+              <w:t>Signature: ____________________________</w:t>
             </w:r>
           </w:p>
         </w:tc>
@@ -3866,7 +3649,7 @@
                 <w:color w:val="202020"/>
                 <w:sz w:val="18"/>
               </w:rPr>
-              <w:t>By: __________________________________</w:t>
+              <w:t>Signature: ____________________________</w:t>
             </w:r>
           </w:p>
         </w:tc>
@@ -3898,7 +3681,7 @@
                 <w:color w:val="202020"/>
                 <w:sz w:val="18"/>
               </w:rPr>
-              <w:t>Name: ________________________________</w:t>
+              <w:t>Printed name: __________________________</w:t>
             </w:r>
           </w:p>
         </w:tc>
@@ -3925,7 +3708,7 @@
                 <w:color w:val="202020"/>
                 <w:sz w:val="18"/>
               </w:rPr>
-              <w:t>Name: ________________________________</w:t>
+              <w:t>Printed name: __________________________</w:t>
             </w:r>
           </w:p>
         </w:tc>
@@ -3957,7 +3740,7 @@
                 <w:color w:val="202020"/>
                 <w:sz w:val="18"/>
               </w:rPr>
-              <w:t>Title: _________________________________</w:t>
+              <w:t>Job title: _____________________________</w:t>
             </w:r>
           </w:p>
         </w:tc>
@@ -3984,7 +3767,7 @@
                 <w:color w:val="202020"/>
                 <w:sz w:val="18"/>
               </w:rPr>
-              <w:t>Title: _________________________________</w:t>
+              <w:t>Job title: _____________________________</w:t>
             </w:r>
           </w:p>
         </w:tc>
@@ -4095,7 +3878,7 @@
         <w:t xml:space="preserve">2. Price, Taxes, and Payment.  </w:t>
       </w:r>
       <w:r>
-        <w:t>Buyer will pay the Total Purchase Price on the schedule in the Order Form. The initial payment is a deposit applied to the purchase price; its refundability is governed by the selected deposit treatment. Buyer is responsible for sales, use, excise, and similar transaction taxes, excluding taxes on Bloomjoy’s net income. Approved change orders, carrier adjustments, storage, redelivery, and buyer-caused accessorial charges may be added to the final invoice. Overdue amounts accrue interest at the lesser of 1.0% per month or the maximum lawful rate, plus reasonable collection costs. Buyer may not set off unrelated claims against an amount due.</w:t>
+        <w:t>Buyer will pay the Total Purchase Price on the schedule in the Order Form. The initial payment is a deposit applied to the purchase price; its refundability is governed by the selected deposit refund policy. Buyer is responsible for sales, use, excise, and similar transaction taxes, excluding taxes on Bloomjoy’s net income. Approved change orders, carrier adjustments, storage, redelivery, and buyer-caused accessorial charges may be added to the final invoice. Overdue amounts accrue interest at the lesser of 1.0% per month or the maximum lawful rate, plus reasonable collection costs. Buyer may not set off unrelated claims against an amount due.</w:t>
       </w:r>
     </w:p>
     <w:p>
@@ -4110,7 +3893,7 @@
         <w:t xml:space="preserve">3. Order Changes and Cancellation.  </w:t>
       </w:r>
       <w:r>
-        <w:t>Changes require written approval and may affect price and schedule. If Buyer cancels after Bloomjoy or its supplier commits the order, Buyer is responsible for documented nonrecoverable production, customization, freight, storage, and cancellation costs, subject to the deposit treatment in the Order Form. Bloomjoy will return any remaining refundable balance after those amounts are determined.</w:t>
+        <w:t>Changes require written approval and may affect price and schedule. If Buyer cancels after Bloomjoy or its supplier commits the order, Buyer is responsible for documented nonrecoverable production, customization, freight, storage, and cancellation costs, subject to the deposit refund policy in the Order Form. Bloomjoy will return any remaining refundable balance after those amounts are determined.</w:t>
       </w:r>
     </w:p>
     <w:p>
@@ -4140,7 +3923,7 @@
         <w:t xml:space="preserve">5. Risk of Loss; Title; Security Interest.  </w:t>
       </w:r>
       <w:r>
-        <w:t>Risk of loss passes to Buyer at Confirmed Delivery, except to the extent a carrier claim is controlled by Bloomjoy under the selected delivery method. Title passes only after Bloomjoy receives all amounts due for the Equipment. Until then, Buyer grants Bloomjoy a purchase-money security interest in the Equipment and its proceeds, will keep the Equipment identifiable and free of other liens, and authorizes Bloomjoy to file financing statements reasonably necessary to perfect that interest. Buyer may operate the Equipment in the ordinary course but may not sell, pledge, or relocate it outside the United States without Bloomjoy’s written consent before full payment.</w:t>
+        <w:t>Risk of loss passes to Buyer at Confirmed Delivery, except to the extent a carrier claim is controlled by Bloomjoy under the agreed shipping and delivery service. Title passes only after Bloomjoy receives all amounts due for the Equipment. Until then, Buyer grants Bloomjoy a purchase-money security interest in the Equipment and its proceeds, will keep the Equipment identifiable and free of other liens, and authorizes Bloomjoy to file financing statements reasonably necessary to perfect that interest. Buyer may operate the Equipment in the ordinary course but may not sell, pledge, or relocate it outside the United States without Bloomjoy’s written consent before full payment.</w:t>
       </w:r>
     </w:p>
     <w:p>
@@ -4155,7 +3938,7 @@
         <w:t xml:space="preserve">6. Inspection and Acceptance.  </w:t>
       </w:r>
       <w:r>
-        <w:t>Buyer will inspect promptly. Visible damage, missing items, and material delivery discrepancies must be listed on the Delivery and Commissioning Certificate. Buyer has the Acceptance Review Period to report a material nonconformity in reasonable detail with photographs, video, logs, or other available evidence. Bloomjoy may inspect and, at its option, repair, replace, complete, or credit the affected item. Acceptance does not waive latent defects or an express warranty claim. A minor punch-list item does not permit rejection of the Equipment or withholding of the entire delivery balance.</w:t>
+        <w:t>Buyer will inspect promptly. Visible damage, missing items, and material delivery discrepancies must be listed on the Delivery and Commissioning Certificate. Buyer has 7 business days after Confirmed Delivery (the Acceptance Review Period) to report a material nonconformity in reasonable detail with photographs, video, logs, or other available evidence. Bloomjoy may inspect and, at its option, repair, replace, complete, or credit the affected item. Acceptance does not waive latent defects or an express warranty claim. A minor punch-list item does not permit rejection of the Equipment or withholding of the entire delivery balance.</w:t>
       </w:r>
     </w:p>
     <w:p>
@@ -4406,7 +4189,18 @@
         <w:pStyle w:val="Heading1"/>
       </w:pPr>
       <w:r>
-        <w:t>EXHIBIT A — EQUIPMENT AND DELIVERY SPECIFICATIONS</w:t>
+        <w:t>EXHIBIT A — MACHINE DETAILS</w:t>
+      </w:r>
+    </w:p>
+    <w:p>
+      <w:pPr>
+        <w:widowControl/>
+      </w:pPr>
+      <w:r>
+        <w:rPr>
+          <w:i w:val="0"/>
+        </w:rPr>
+        <w:t>Bloomjoy completes these details from the final order and manufacturer information. Attach the specification sheet rather than asking Buyer to supply technical measurements. Record serial numbers when assigned, no later than delivery.</w:t>
       </w:r>
     </w:p>
     <w:tbl>
@@ -4420,234 +4214,6 @@
         <w:gridCol w:w="2880"/>
         <w:gridCol w:w="6912"/>
       </w:tblGrid>
-      <w:tr>
-        <w:trPr>
-          <w:cantSplit/>
-        </w:trPr>
-        <w:tc>
-          <w:tcPr>
-            <w:tcW w:type="dxa" w:w="2880"/>
-            <w:shd w:fill="F6F6F6"/>
-            <w:vAlign w:val="center"/>
-            <w:tcBorders>
-              <w:top w:val="single" w:sz="6" w:space="0" w:color="E4E4E4"/>
-              <w:left w:val="single" w:sz="6" w:space="0" w:color="E4E4E4"/>
-              <w:bottom w:val="single" w:sz="6" w:space="0" w:color="E4E4E4"/>
-              <w:right w:val="single" w:sz="6" w:space="0" w:color="E4E4E4"/>
-              <w:insideH w:val="single" w:sz="6" w:space="0" w:color="E4E4E4"/>
-              <w:insideV w:val="single" w:sz="6" w:space="0" w:color="E4E4E4"/>
-            </w:tcBorders>
-            <w:tcMar>
-              <w:top w:w="85" w:type="dxa"/>
-              <w:start w:w="120" w:type="dxa"/>
-              <w:bottom w:w="85" w:type="dxa"/>
-              <w:end w:w="120" w:type="dxa"/>
-            </w:tcMar>
-          </w:tcPr>
-          <w:p>
-            <w:pPr>
-              <w:spacing w:after="0" w:line="240" w:lineRule="auto"/>
-            </w:pPr>
-            <w:r/>
-            <w:r>
-              <w:rPr>
-                <w:rFonts w:ascii="Arial" w:hAnsi="Arial"/>
-                <w:b/>
-                <w:color w:val="202020"/>
-                <w:sz w:val="18"/>
-              </w:rPr>
-              <w:t>Agreement / Quote No.</w:t>
-            </w:r>
-          </w:p>
-        </w:tc>
-        <w:tc>
-          <w:tcPr>
-            <w:tcW w:type="dxa" w:w="6912"/>
-            <w:vAlign w:val="center"/>
-            <w:tcBorders>
-              <w:top w:val="single" w:sz="6" w:space="0" w:color="E4E4E4"/>
-              <w:left w:val="single" w:sz="6" w:space="0" w:color="E4E4E4"/>
-              <w:bottom w:val="single" w:sz="6" w:space="0" w:color="E4E4E4"/>
-              <w:right w:val="single" w:sz="6" w:space="0" w:color="E4E4E4"/>
-              <w:insideH w:val="single" w:sz="6" w:space="0" w:color="E4E4E4"/>
-              <w:insideV w:val="single" w:sz="6" w:space="0" w:color="E4E4E4"/>
-            </w:tcBorders>
-            <w:tcMar>
-              <w:top w:w="85" w:type="dxa"/>
-              <w:start w:w="120" w:type="dxa"/>
-              <w:bottom w:w="85" w:type="dxa"/>
-              <w:end w:w="120" w:type="dxa"/>
-            </w:tcMar>
-          </w:tcPr>
-          <w:p>
-            <w:pPr>
-              <w:spacing w:after="0" w:line="240" w:lineRule="auto"/>
-            </w:pPr>
-            <w:r/>
-            <w:r>
-              <w:rPr>
-                <w:rFonts w:ascii="Arial" w:hAnsi="Arial"/>
-                <w:b w:val="0"/>
-                <w:color w:val="202020"/>
-                <w:sz w:val="18"/>
-              </w:rPr>
-              <w:t>[Insert]</w:t>
-            </w:r>
-          </w:p>
-        </w:tc>
-      </w:tr>
-      <w:tr>
-        <w:trPr>
-          <w:cantSplit/>
-        </w:trPr>
-        <w:tc>
-          <w:tcPr>
-            <w:tcW w:type="dxa" w:w="2880"/>
-            <w:shd w:fill="F6F6F6"/>
-            <w:vAlign w:val="center"/>
-            <w:tcBorders>
-              <w:top w:val="single" w:sz="6" w:space="0" w:color="E4E4E4"/>
-              <w:left w:val="single" w:sz="6" w:space="0" w:color="E4E4E4"/>
-              <w:bottom w:val="single" w:sz="6" w:space="0" w:color="E4E4E4"/>
-              <w:right w:val="single" w:sz="6" w:space="0" w:color="E4E4E4"/>
-              <w:insideH w:val="single" w:sz="6" w:space="0" w:color="E4E4E4"/>
-              <w:insideV w:val="single" w:sz="6" w:space="0" w:color="E4E4E4"/>
-            </w:tcBorders>
-            <w:tcMar>
-              <w:top w:w="85" w:type="dxa"/>
-              <w:start w:w="120" w:type="dxa"/>
-              <w:bottom w:w="85" w:type="dxa"/>
-              <w:end w:w="120" w:type="dxa"/>
-            </w:tcMar>
-          </w:tcPr>
-          <w:p>
-            <w:pPr>
-              <w:spacing w:after="0" w:line="240" w:lineRule="auto"/>
-            </w:pPr>
-            <w:r/>
-            <w:r>
-              <w:rPr>
-                <w:rFonts w:ascii="Arial" w:hAnsi="Arial"/>
-                <w:b/>
-                <w:color w:val="202020"/>
-                <w:sz w:val="18"/>
-              </w:rPr>
-              <w:t>Machine model</w:t>
-            </w:r>
-          </w:p>
-        </w:tc>
-        <w:tc>
-          <w:tcPr>
-            <w:tcW w:type="dxa" w:w="6912"/>
-            <w:vAlign w:val="center"/>
-            <w:tcBorders>
-              <w:top w:val="single" w:sz="6" w:space="0" w:color="E4E4E4"/>
-              <w:left w:val="single" w:sz="6" w:space="0" w:color="E4E4E4"/>
-              <w:bottom w:val="single" w:sz="6" w:space="0" w:color="E4E4E4"/>
-              <w:right w:val="single" w:sz="6" w:space="0" w:color="E4E4E4"/>
-              <w:insideH w:val="single" w:sz="6" w:space="0" w:color="E4E4E4"/>
-              <w:insideV w:val="single" w:sz="6" w:space="0" w:color="E4E4E4"/>
-            </w:tcBorders>
-            <w:tcMar>
-              <w:top w:w="85" w:type="dxa"/>
-              <w:start w:w="120" w:type="dxa"/>
-              <w:bottom w:w="85" w:type="dxa"/>
-              <w:end w:w="120" w:type="dxa"/>
-            </w:tcMar>
-          </w:tcPr>
-          <w:p>
-            <w:pPr>
-              <w:spacing w:after="0" w:line="240" w:lineRule="auto"/>
-            </w:pPr>
-            <w:r/>
-            <w:r>
-              <w:rPr>
-                <w:rFonts w:ascii="Arial" w:hAnsi="Arial"/>
-                <w:b w:val="0"/>
-                <w:color w:val="202020"/>
-                <w:sz w:val="18"/>
-              </w:rPr>
-              <w:t>[Insert]</w:t>
-            </w:r>
-          </w:p>
-        </w:tc>
-      </w:tr>
-      <w:tr>
-        <w:trPr>
-          <w:cantSplit/>
-        </w:trPr>
-        <w:tc>
-          <w:tcPr>
-            <w:tcW w:type="dxa" w:w="2880"/>
-            <w:shd w:fill="F6F6F6"/>
-            <w:vAlign w:val="center"/>
-            <w:tcBorders>
-              <w:top w:val="single" w:sz="6" w:space="0" w:color="E4E4E4"/>
-              <w:left w:val="single" w:sz="6" w:space="0" w:color="E4E4E4"/>
-              <w:bottom w:val="single" w:sz="6" w:space="0" w:color="E4E4E4"/>
-              <w:right w:val="single" w:sz="6" w:space="0" w:color="E4E4E4"/>
-              <w:insideH w:val="single" w:sz="6" w:space="0" w:color="E4E4E4"/>
-              <w:insideV w:val="single" w:sz="6" w:space="0" w:color="E4E4E4"/>
-            </w:tcBorders>
-            <w:tcMar>
-              <w:top w:w="85" w:type="dxa"/>
-              <w:start w:w="120" w:type="dxa"/>
-              <w:bottom w:w="85" w:type="dxa"/>
-              <w:end w:w="120" w:type="dxa"/>
-            </w:tcMar>
-          </w:tcPr>
-          <w:p>
-            <w:pPr>
-              <w:spacing w:after="0" w:line="240" w:lineRule="auto"/>
-            </w:pPr>
-            <w:r/>
-            <w:r>
-              <w:rPr>
-                <w:rFonts w:ascii="Arial" w:hAnsi="Arial"/>
-                <w:b/>
-                <w:color w:val="202020"/>
-                <w:sz w:val="18"/>
-              </w:rPr>
-              <w:t>Quantity</w:t>
-            </w:r>
-          </w:p>
-        </w:tc>
-        <w:tc>
-          <w:tcPr>
-            <w:tcW w:type="dxa" w:w="6912"/>
-            <w:vAlign w:val="center"/>
-            <w:tcBorders>
-              <w:top w:val="single" w:sz="6" w:space="0" w:color="E4E4E4"/>
-              <w:left w:val="single" w:sz="6" w:space="0" w:color="E4E4E4"/>
-              <w:bottom w:val="single" w:sz="6" w:space="0" w:color="E4E4E4"/>
-              <w:right w:val="single" w:sz="6" w:space="0" w:color="E4E4E4"/>
-              <w:insideH w:val="single" w:sz="6" w:space="0" w:color="E4E4E4"/>
-              <w:insideV w:val="single" w:sz="6" w:space="0" w:color="E4E4E4"/>
-            </w:tcBorders>
-            <w:tcMar>
-              <w:top w:w="85" w:type="dxa"/>
-              <w:start w:w="120" w:type="dxa"/>
-              <w:bottom w:w="85" w:type="dxa"/>
-              <w:end w:w="120" w:type="dxa"/>
-            </w:tcMar>
-          </w:tcPr>
-          <w:p>
-            <w:pPr>
-              <w:spacing w:after="0" w:line="240" w:lineRule="auto"/>
-            </w:pPr>
-            <w:r/>
-            <w:r>
-              <w:rPr>
-                <w:rFonts w:ascii="Arial" w:hAnsi="Arial"/>
-                <w:b w:val="0"/>
-                <w:color w:val="202020"/>
-                <w:sz w:val="18"/>
-              </w:rPr>
-              <w:t>[Insert]</w:t>
-            </w:r>
-          </w:p>
-        </w:tc>
-      </w:tr>
       <w:tr>
         <w:trPr>
           <w:cantSplit/>
@@ -4760,7 +4326,7 @@
                 <w:color w:val="202020"/>
                 <w:sz w:val="18"/>
               </w:rPr>
-              <w:t>Cabinet finish / wrap</w:t>
+              <w:t>Machine color and design</w:t>
             </w:r>
           </w:p>
         </w:tc>
@@ -4795,7 +4361,7 @@
                 <w:color w:val="202020"/>
                 <w:sz w:val="18"/>
               </w:rPr>
-              <w:t>[Insert]</w:t>
+              <w:t>[Selected color, wrap, and cotton-candy designs included]</w:t>
             </w:r>
           </w:p>
         </w:tc>
@@ -4836,7 +4402,7 @@
                 <w:color w:val="202020"/>
                 <w:sz w:val="18"/>
               </w:rPr>
-              <w:t>Payment reader / processor</w:t>
+              <w:t>Card reader and payment account</w:t>
             </w:r>
           </w:p>
         </w:tc>
@@ -4871,7 +4437,7 @@
                 <w:color w:val="202020"/>
                 <w:sz w:val="18"/>
               </w:rPr>
-              <w:t>[Insert; merchant account owner]</w:t>
+              <w:t>[Reader model, payment provider, and who owns the payment account]</w:t>
             </w:r>
           </w:p>
         </w:tc>
@@ -4912,7 +4478,7 @@
                 <w:color w:val="202020"/>
                 <w:sz w:val="18"/>
               </w:rPr>
-              <w:t>Connectivity</w:t>
+              <w:t>Internet connection</w:t>
             </w:r>
           </w:p>
         </w:tc>
@@ -4947,7 +4513,7 @@
                 <w:color w:val="202020"/>
                 <w:sz w:val="18"/>
               </w:rPr>
-              <w:t>[Wi-Fi / cellular / Ethernet; owner of service]</w:t>
+              <w:t>[Wi-Fi, cellular, or Ethernet; who supplies and pays for service]</w:t>
             </w:r>
           </w:p>
         </w:tc>
@@ -4988,7 +4554,7 @@
                 <w:color w:val="202020"/>
                 <w:sz w:val="18"/>
               </w:rPr>
-              <w:t>Electrical requirements</w:t>
+              <w:t>Power and machine size</w:t>
             </w:r>
           </w:p>
         </w:tc>
@@ -5023,83 +4589,7 @@
                 <w:color w:val="202020"/>
                 <w:sz w:val="18"/>
               </w:rPr>
-              <w:t>[Voltage, amperage, outlet, dedicated circuit]</w:t>
-            </w:r>
-          </w:p>
-        </w:tc>
-      </w:tr>
-      <w:tr>
-        <w:trPr>
-          <w:cantSplit/>
-        </w:trPr>
-        <w:tc>
-          <w:tcPr>
-            <w:tcW w:type="dxa" w:w="2880"/>
-            <w:shd w:fill="F6F6F6"/>
-            <w:vAlign w:val="center"/>
-            <w:tcBorders>
-              <w:top w:val="single" w:sz="6" w:space="0" w:color="E4E4E4"/>
-              <w:left w:val="single" w:sz="6" w:space="0" w:color="E4E4E4"/>
-              <w:bottom w:val="single" w:sz="6" w:space="0" w:color="E4E4E4"/>
-              <w:right w:val="single" w:sz="6" w:space="0" w:color="E4E4E4"/>
-              <w:insideH w:val="single" w:sz="6" w:space="0" w:color="E4E4E4"/>
-              <w:insideV w:val="single" w:sz="6" w:space="0" w:color="E4E4E4"/>
-            </w:tcBorders>
-            <w:tcMar>
-              <w:top w:w="85" w:type="dxa"/>
-              <w:start w:w="120" w:type="dxa"/>
-              <w:bottom w:w="85" w:type="dxa"/>
-              <w:end w:w="120" w:type="dxa"/>
-            </w:tcMar>
-          </w:tcPr>
-          <w:p>
-            <w:pPr>
-              <w:spacing w:after="0" w:line="240" w:lineRule="auto"/>
-            </w:pPr>
-            <w:r/>
-            <w:r>
-              <w:rPr>
-                <w:rFonts w:ascii="Arial" w:hAnsi="Arial"/>
-                <w:b/>
-                <w:color w:val="202020"/>
-                <w:sz w:val="18"/>
-              </w:rPr>
-              <w:t>Dimensions / weight</w:t>
-            </w:r>
-          </w:p>
-        </w:tc>
-        <w:tc>
-          <w:tcPr>
-            <w:tcW w:type="dxa" w:w="6912"/>
-            <w:vAlign w:val="center"/>
-            <w:tcBorders>
-              <w:top w:val="single" w:sz="6" w:space="0" w:color="E4E4E4"/>
-              <w:left w:val="single" w:sz="6" w:space="0" w:color="E4E4E4"/>
-              <w:bottom w:val="single" w:sz="6" w:space="0" w:color="E4E4E4"/>
-              <w:right w:val="single" w:sz="6" w:space="0" w:color="E4E4E4"/>
-              <w:insideH w:val="single" w:sz="6" w:space="0" w:color="E4E4E4"/>
-              <w:insideV w:val="single" w:sz="6" w:space="0" w:color="E4E4E4"/>
-            </w:tcBorders>
-            <w:tcMar>
-              <w:top w:w="85" w:type="dxa"/>
-              <w:start w:w="120" w:type="dxa"/>
-              <w:bottom w:w="85" w:type="dxa"/>
-              <w:end w:w="120" w:type="dxa"/>
-            </w:tcMar>
-          </w:tcPr>
-          <w:p>
-            <w:pPr>
-              <w:spacing w:after="0" w:line="240" w:lineRule="auto"/>
-            </w:pPr>
-            <w:r/>
-            <w:r>
-              <w:rPr>
-                <w:rFonts w:ascii="Arial" w:hAnsi="Arial"/>
-                <w:b w:val="0"/>
-                <w:color w:val="202020"/>
-                <w:sz w:val="18"/>
-              </w:rPr>
-              <w:t>[Insert confirmed specifications]</w:t>
+              <w:t>[Name or date of attached manufacturer specification sheet]</w:t>
             </w:r>
           </w:p>
         </w:tc>
@@ -5175,7 +4665,7 @@
                 <w:color w:val="202020"/>
                 <w:sz w:val="18"/>
               </w:rPr>
-              <w:t>[Insert]</w:t>
+              <w:t>[List accessories; do not repeat starter supplies from page 1]</w:t>
             </w:r>
           </w:p>
         </w:tc>
@@ -5216,7 +4706,7 @@
                 <w:color w:val="202020"/>
                 <w:sz w:val="18"/>
               </w:rPr>
-              <w:t>Included opening supplies</w:t>
+              <w:t>Manuals and account access</w:t>
             </w:r>
           </w:p>
         </w:tc>
@@ -5251,7 +4741,7 @@
                 <w:color w:val="202020"/>
                 <w:sz w:val="18"/>
               </w:rPr>
-              <w:t>[Insert]</w:t>
+              <w:t>[Manuals, login access, and manufacturer support contact provided]</w:t>
             </w:r>
           </w:p>
         </w:tc>
@@ -5292,7 +4782,7 @@
                 <w:color w:val="202020"/>
                 <w:sz w:val="18"/>
               </w:rPr>
-              <w:t>Documentation / credentials</w:t>
+              <w:t>Who unloads the machine</w:t>
             </w:r>
           </w:p>
         </w:tc>
@@ -5327,7 +4817,7 @@
                 <w:color w:val="202020"/>
                 <w:sz w:val="18"/>
               </w:rPr>
-              <w:t>[Manuals, admin access, support channel]</w:t>
+              <w:t>[Buyer, carrier, or Bloomjoy; match the quoted delivery service]</w:t>
             </w:r>
           </w:p>
         </w:tc>
@@ -5368,7 +4858,7 @@
                 <w:color w:val="202020"/>
                 <w:sz w:val="18"/>
               </w:rPr>
-              <w:t>Packaging / freight</w:t>
+              <w:t>Who sets up the machine</w:t>
             </w:r>
           </w:p>
         </w:tc>
@@ -5403,7 +4893,7 @@
                 <w:color w:val="202020"/>
                 <w:sz w:val="18"/>
               </w:rPr>
-              <w:t>[Insert]</w:t>
+              <w:t>[Person or company responsible; any included help is listed on page 2]</w:t>
             </w:r>
           </w:p>
         </w:tc>
@@ -5444,7 +4934,7 @@
                 <w:color w:val="202020"/>
                 <w:sz w:val="18"/>
               </w:rPr>
-              <w:t>Unloading responsibility</w:t>
+              <w:t>Startup test</w:t>
             </w:r>
           </w:p>
         </w:tc>
@@ -5479,159 +4969,7 @@
                 <w:color w:val="202020"/>
                 <w:sz w:val="18"/>
               </w:rPr>
-              <w:t>[Bloomjoy / Buyer / carrier]</w:t>
-            </w:r>
-          </w:p>
-        </w:tc>
-      </w:tr>
-      <w:tr>
-        <w:trPr>
-          <w:cantSplit/>
-        </w:trPr>
-        <w:tc>
-          <w:tcPr>
-            <w:tcW w:type="dxa" w:w="2880"/>
-            <w:shd w:fill="F6F6F6"/>
-            <w:vAlign w:val="center"/>
-            <w:tcBorders>
-              <w:top w:val="single" w:sz="6" w:space="0" w:color="E4E4E4"/>
-              <w:left w:val="single" w:sz="6" w:space="0" w:color="E4E4E4"/>
-              <w:bottom w:val="single" w:sz="6" w:space="0" w:color="E4E4E4"/>
-              <w:right w:val="single" w:sz="6" w:space="0" w:color="E4E4E4"/>
-              <w:insideH w:val="single" w:sz="6" w:space="0" w:color="E4E4E4"/>
-              <w:insideV w:val="single" w:sz="6" w:space="0" w:color="E4E4E4"/>
-            </w:tcBorders>
-            <w:tcMar>
-              <w:top w:w="85" w:type="dxa"/>
-              <w:start w:w="120" w:type="dxa"/>
-              <w:bottom w:w="85" w:type="dxa"/>
-              <w:end w:w="120" w:type="dxa"/>
-            </w:tcMar>
-          </w:tcPr>
-          <w:p>
-            <w:pPr>
-              <w:spacing w:after="0" w:line="240" w:lineRule="auto"/>
-            </w:pPr>
-            <w:r/>
-            <w:r>
-              <w:rPr>
-                <w:rFonts w:ascii="Arial" w:hAnsi="Arial"/>
-                <w:b/>
-                <w:color w:val="202020"/>
-                <w:sz w:val="18"/>
-              </w:rPr>
-              <w:t>Installation responsibility</w:t>
-            </w:r>
-          </w:p>
-        </w:tc>
-        <w:tc>
-          <w:tcPr>
-            <w:tcW w:type="dxa" w:w="6912"/>
-            <w:vAlign w:val="center"/>
-            <w:tcBorders>
-              <w:top w:val="single" w:sz="6" w:space="0" w:color="E4E4E4"/>
-              <w:left w:val="single" w:sz="6" w:space="0" w:color="E4E4E4"/>
-              <w:bottom w:val="single" w:sz="6" w:space="0" w:color="E4E4E4"/>
-              <w:right w:val="single" w:sz="6" w:space="0" w:color="E4E4E4"/>
-              <w:insideH w:val="single" w:sz="6" w:space="0" w:color="E4E4E4"/>
-              <w:insideV w:val="single" w:sz="6" w:space="0" w:color="E4E4E4"/>
-            </w:tcBorders>
-            <w:tcMar>
-              <w:top w:w="85" w:type="dxa"/>
-              <w:start w:w="120" w:type="dxa"/>
-              <w:bottom w:w="85" w:type="dxa"/>
-              <w:end w:w="120" w:type="dxa"/>
-            </w:tcMar>
-          </w:tcPr>
-          <w:p>
-            <w:pPr>
-              <w:spacing w:after="0" w:line="240" w:lineRule="auto"/>
-            </w:pPr>
-            <w:r/>
-            <w:r>
-              <w:rPr>
-                <w:rFonts w:ascii="Arial" w:hAnsi="Arial"/>
-                <w:b w:val="0"/>
-                <w:color w:val="202020"/>
-                <w:sz w:val="18"/>
-              </w:rPr>
-              <w:t>[Insert]</w:t>
-            </w:r>
-          </w:p>
-        </w:tc>
-      </w:tr>
-      <w:tr>
-        <w:trPr>
-          <w:cantSplit/>
-        </w:trPr>
-        <w:tc>
-          <w:tcPr>
-            <w:tcW w:type="dxa" w:w="2880"/>
-            <w:shd w:fill="F6F6F6"/>
-            <w:vAlign w:val="center"/>
-            <w:tcBorders>
-              <w:top w:val="single" w:sz="6" w:space="0" w:color="E4E4E4"/>
-              <w:left w:val="single" w:sz="6" w:space="0" w:color="E4E4E4"/>
-              <w:bottom w:val="single" w:sz="6" w:space="0" w:color="E4E4E4"/>
-              <w:right w:val="single" w:sz="6" w:space="0" w:color="E4E4E4"/>
-              <w:insideH w:val="single" w:sz="6" w:space="0" w:color="E4E4E4"/>
-              <w:insideV w:val="single" w:sz="6" w:space="0" w:color="E4E4E4"/>
-            </w:tcBorders>
-            <w:tcMar>
-              <w:top w:w="85" w:type="dxa"/>
-              <w:start w:w="120" w:type="dxa"/>
-              <w:bottom w:w="85" w:type="dxa"/>
-              <w:end w:w="120" w:type="dxa"/>
-            </w:tcMar>
-          </w:tcPr>
-          <w:p>
-            <w:pPr>
-              <w:spacing w:after="0" w:line="240" w:lineRule="auto"/>
-            </w:pPr>
-            <w:r/>
-            <w:r>
-              <w:rPr>
-                <w:rFonts w:ascii="Arial" w:hAnsi="Arial"/>
-                <w:b/>
-                <w:color w:val="202020"/>
-                <w:sz w:val="18"/>
-              </w:rPr>
-              <w:t>Commissioning test</w:t>
-            </w:r>
-          </w:p>
-        </w:tc>
-        <w:tc>
-          <w:tcPr>
-            <w:tcW w:type="dxa" w:w="6912"/>
-            <w:vAlign w:val="center"/>
-            <w:tcBorders>
-              <w:top w:val="single" w:sz="6" w:space="0" w:color="E4E4E4"/>
-              <w:left w:val="single" w:sz="6" w:space="0" w:color="E4E4E4"/>
-              <w:bottom w:val="single" w:sz="6" w:space="0" w:color="E4E4E4"/>
-              <w:right w:val="single" w:sz="6" w:space="0" w:color="E4E4E4"/>
-              <w:insideH w:val="single" w:sz="6" w:space="0" w:color="E4E4E4"/>
-              <w:insideV w:val="single" w:sz="6" w:space="0" w:color="E4E4E4"/>
-            </w:tcBorders>
-            <w:tcMar>
-              <w:top w:w="85" w:type="dxa"/>
-              <w:start w:w="120" w:type="dxa"/>
-              <w:bottom w:w="85" w:type="dxa"/>
-              <w:end w:w="120" w:type="dxa"/>
-            </w:tcMar>
-          </w:tcPr>
-          <w:p>
-            <w:pPr>
-              <w:spacing w:after="0" w:line="240" w:lineRule="auto"/>
-            </w:pPr>
-            <w:r/>
-            <w:r>
-              <w:rPr>
-                <w:rFonts w:ascii="Arial" w:hAnsi="Arial"/>
-                <w:b w:val="0"/>
-                <w:color w:val="202020"/>
-                <w:sz w:val="18"/>
-              </w:rPr>
-              <w:t>[Insert required test and responsible person]</w:t>
+              <w:t>[Test to confirm the machine works, and who performs it]</w:t>
             </w:r>
           </w:p>
         </w:tc>
@@ -5678,7 +5016,7 @@
         <w:ind w:left="360" w:hanging="216"/>
       </w:pPr>
       <w:r>
-        <w:t>☐ Freight quote and delivery instructions</w:t>
+        <w:t>☐ Shipping quote and delivery instructions</w:t>
       </w:r>
     </w:p>
     <w:p>
@@ -5721,7 +5059,7 @@
         <w:t xml:space="preserve">1. Warranty Term.  </w:t>
       </w:r>
       <w:r>
-        <w:t>The limited warranty begins on [Confirmed Delivery / successful commissioning] and continues for the period stated in the Order Form. Any “up to” public warranty statement is not a substitute for the completed Order Form.</w:t>
+        <w:t>The limited warranty begins on the Agreement date (the Effective Date) and lasts one year. It does not begin again at delivery or setup. Any “up to” public warranty statement is not a substitute for this stated warranty period.</w:t>
       </w:r>
     </w:p>
     <w:p>
@@ -5766,7 +5104,7 @@
         <w:t xml:space="preserve">4. Claim Process.  </w:t>
       </w:r>
       <w:r>
-        <w:t>Buyer will stop use if continued operation may worsen damage or create a safety risk; contact the designated manufacturer support channel; provide the serial number, photographs or video, logs, and requested diagnostic information; and reasonably cooperate with remote troubleshooting. Buyer must notify Bloomjoy at [support email address] if escalation or parts coordination is needed.</w:t>
+        <w:t>Buyer will stop use if continued operation may worsen damage or create a safety risk; contact the designated manufacturer support channel; provide the serial number, photographs or video, logs, and requested diagnostic information; and reasonably cooperate with remote troubleshooting. Buyer must notify Bloomjoy using its contact details in the Order Form if escalation or parts coordination is needed.</w:t>
       </w:r>
     </w:p>
     <w:p>
@@ -5781,7 +5119,7 @@
         <w:t xml:space="preserve">5. Labor, Travel, and Shipping.  </w:t>
       </w:r>
       <w:r>
-        <w:t>Included labor, freight, duties, travel, and on-site services are limited to: [Describe included services or None]. Any amount not expressly included requires Buyer approval before charge, except reasonable emergency measures requested by Buyer.</w:t>
+        <w:t>Included labor, freight, duties, travel, and on-site services are limited to the Other included services listed in the Order Form. Any amount not expressly included requires Buyer approval before charge, except reasonable emergency measures requested by Buyer.</w:t>
       </w:r>
     </w:p>
     <w:p>

</xml_diff>